<commit_message>
update docx. file about project
</commit_message>
<xml_diff>
--- a/Курсовая работаБурнаеваИСv2.docx
+++ b/Курсовая работаБурнаеваИСv2.docx
@@ -4512,245 +4512,211 @@
         </w:rPr>
       </w:pPr>
       <w:r>
-        <w:rPr>
-          <w:rFonts w:hint="default"/>
-          <w:lang w:val="en-US"/>
-        </w:rPr>
-        <w:t>В качестве системы управления базами данных используется SQL. Этот выбор основан на практических потребностях ресторанного бизнеса:</w:t>
-      </w:r>
-    </w:p>
-    <w:p>
-      <w:pPr>
-        <w:keepNext w:val="0"/>
-        <w:keepLines w:val="0"/>
-        <w:pageBreakBefore w:val="0"/>
-        <w:widowControl/>
-        <w:kinsoku/>
-        <w:wordWrap/>
-        <w:overflowPunct/>
-        <w:topLinePunct w:val="0"/>
-        <w:autoSpaceDE/>
-        <w:autoSpaceDN/>
-        <w:bidi w:val="0"/>
-        <w:adjustRightInd/>
-        <w:snapToGrid/>
-        <w:ind w:firstLine="709"/>
-        <w:jc w:val="both"/>
-        <w:textAlignment w:val="auto"/>
-        <w:rPr>
-          <w:rFonts w:hint="default"/>
-          <w:lang w:val="en-US"/>
-        </w:rPr>
-      </w:pPr>
-    </w:p>
-    <w:p>
-      <w:pPr>
-        <w:keepNext w:val="0"/>
-        <w:keepLines w:val="0"/>
-        <w:pageBreakBefore w:val="0"/>
-        <w:widowControl/>
-        <w:kinsoku/>
-        <w:wordWrap/>
-        <w:overflowPunct/>
-        <w:topLinePunct w:val="0"/>
-        <w:autoSpaceDE/>
-        <w:autoSpaceDN/>
-        <w:bidi w:val="0"/>
-        <w:adjustRightInd/>
-        <w:snapToGrid/>
-        <w:ind w:firstLine="709"/>
-        <w:jc w:val="both"/>
-        <w:textAlignment w:val="auto"/>
-        <w:rPr>
-          <w:rFonts w:hint="default"/>
-          <w:lang w:val="en-US"/>
-        </w:rPr>
-      </w:pPr>
-      <w:r>
-        <w:rPr>
-          <w:rFonts w:hint="default"/>
-          <w:lang w:val="en-US"/>
-        </w:rPr>
-        <w:t>Автономная работа без перебоев: Ресторан не всегда может полагаться на стабильное интернет-соединение. SQLite обеспечивает локальное хранение всей информации о сотрудниках, графиках и прогнозах непосредственно на устройстве. Приложение остаётся полностью работоспособным даже при отсутствии сети, что особенно важно в подвальных помещениях или при технических сбоях провайдера.</w:t>
-      </w:r>
-    </w:p>
-    <w:p>
-      <w:pPr>
-        <w:keepNext w:val="0"/>
-        <w:keepLines w:val="0"/>
-        <w:pageBreakBefore w:val="0"/>
-        <w:widowControl/>
-        <w:kinsoku/>
-        <w:wordWrap/>
-        <w:overflowPunct/>
-        <w:topLinePunct w:val="0"/>
-        <w:autoSpaceDE/>
-        <w:autoSpaceDN/>
-        <w:bidi w:val="0"/>
-        <w:adjustRightInd/>
-        <w:snapToGrid/>
-        <w:ind w:firstLine="709"/>
-        <w:jc w:val="both"/>
-        <w:textAlignment w:val="auto"/>
-        <w:rPr>
-          <w:rFonts w:hint="default"/>
-          <w:lang w:val="en-US"/>
-        </w:rPr>
-      </w:pPr>
-    </w:p>
-    <w:p>
-      <w:pPr>
-        <w:keepNext w:val="0"/>
-        <w:keepLines w:val="0"/>
-        <w:pageBreakBefore w:val="0"/>
-        <w:widowControl/>
-        <w:kinsoku/>
-        <w:wordWrap/>
-        <w:overflowPunct/>
-        <w:topLinePunct w:val="0"/>
-        <w:autoSpaceDE/>
-        <w:autoSpaceDN/>
-        <w:bidi w:val="0"/>
-        <w:adjustRightInd/>
-        <w:snapToGrid/>
-        <w:ind w:firstLine="709"/>
-        <w:jc w:val="both"/>
-        <w:textAlignment w:val="auto"/>
-        <w:rPr>
-          <w:rFonts w:hint="default"/>
-          <w:lang w:val="en-US"/>
-        </w:rPr>
-      </w:pPr>
-      <w:r>
-        <w:rPr>
-          <w:rFonts w:hint="default"/>
-          <w:lang w:val="en-US"/>
-        </w:rPr>
-        <w:t>Гибкость и прозрачность запросов: Использование SQL-запросов даёт полный контроль над данными. Разработчик может точно настраивать выборки для формирования отчётов для бухгалтера, расчёта фонда оплаты труда или анализа эффективности работы каждой смены. Это обеспечивает максимальную производительность при работе с большими массивами данных.</w:t>
-      </w:r>
-    </w:p>
-    <w:p>
-      <w:pPr>
-        <w:keepNext w:val="0"/>
-        <w:keepLines w:val="0"/>
-        <w:pageBreakBefore w:val="0"/>
-        <w:widowControl/>
-        <w:kinsoku/>
-        <w:wordWrap/>
-        <w:overflowPunct/>
-        <w:topLinePunct w:val="0"/>
-        <w:autoSpaceDE/>
-        <w:autoSpaceDN/>
-        <w:bidi w:val="0"/>
-        <w:adjustRightInd/>
-        <w:snapToGrid/>
-        <w:ind w:firstLine="709"/>
-        <w:jc w:val="both"/>
-        <w:textAlignment w:val="auto"/>
-        <w:rPr>
-          <w:rFonts w:hint="default"/>
-          <w:lang w:val="en-US"/>
-        </w:rPr>
-      </w:pPr>
-    </w:p>
-    <w:p>
-      <w:pPr>
-        <w:keepNext w:val="0"/>
-        <w:keepLines w:val="0"/>
-        <w:pageBreakBefore w:val="0"/>
-        <w:widowControl/>
-        <w:kinsoku/>
-        <w:wordWrap/>
-        <w:overflowPunct/>
-        <w:topLinePunct w:val="0"/>
-        <w:autoSpaceDE/>
-        <w:autoSpaceDN/>
-        <w:bidi w:val="0"/>
-        <w:adjustRightInd/>
-        <w:snapToGrid/>
-        <w:ind w:firstLine="709"/>
-        <w:jc w:val="both"/>
-        <w:textAlignment w:val="auto"/>
-        <w:rPr>
-          <w:rFonts w:hint="default"/>
-          <w:lang w:val="en-US"/>
-        </w:rPr>
-      </w:pPr>
-      <w:r>
-        <w:rPr>
-          <w:rFonts w:hint="default"/>
-          <w:lang w:val="en-US"/>
-        </w:rPr>
-        <w:t>Простота и надёжность хранения: База данных SQLite представляет собой обычный файл, что упрощает процессы резервного копирования и переноса данных. Для небольшого ресторана или кафе это означает минимум затрат на администрирование и обслуживание.</w:t>
-      </w:r>
-    </w:p>
-    <w:p>
-      <w:pPr>
-        <w:keepNext w:val="0"/>
-        <w:keepLines w:val="0"/>
-        <w:pageBreakBefore w:val="0"/>
-        <w:widowControl/>
-        <w:kinsoku/>
-        <w:wordWrap/>
-        <w:overflowPunct/>
-        <w:topLinePunct w:val="0"/>
-        <w:autoSpaceDE/>
-        <w:autoSpaceDN/>
-        <w:bidi w:val="0"/>
-        <w:adjustRightInd/>
-        <w:snapToGrid/>
-        <w:ind w:firstLine="709"/>
-        <w:jc w:val="both"/>
-        <w:textAlignment w:val="auto"/>
-        <w:rPr>
-          <w:rFonts w:hint="default"/>
-          <w:lang w:val="en-US"/>
-        </w:rPr>
-      </w:pPr>
-    </w:p>
-    <w:p>
-      <w:pPr>
-        <w:keepNext w:val="0"/>
-        <w:keepLines w:val="0"/>
-        <w:pageBreakBefore w:val="0"/>
-        <w:widowControl/>
-        <w:kinsoku/>
-        <w:wordWrap/>
-        <w:overflowPunct/>
-        <w:topLinePunct w:val="0"/>
-        <w:autoSpaceDE/>
-        <w:autoSpaceDN/>
-        <w:bidi w:val="0"/>
-        <w:adjustRightInd/>
-        <w:snapToGrid/>
-        <w:ind w:firstLine="709"/>
-        <w:jc w:val="both"/>
-        <w:textAlignment w:val="auto"/>
-        <w:rPr>
-          <w:rFonts w:hint="default"/>
-          <w:lang w:val="en-US"/>
-        </w:rPr>
-      </w:pPr>
-      <w:r>
-        <w:rPr>
-          <w:rFonts w:hint="default"/>
-          <w:lang w:val="en-US"/>
-        </w:rPr>
-        <w:t xml:space="preserve">Таким образом, сочетание производительного и надёжного C# с гибкой и автономной системой хранения на SQL позволяет создать приложение </w:t>
-      </w:r>
-      <w:r>
-        <w:rPr>
-          <w:rFonts w:hint="default"/>
-          <w:lang w:val="ru-RU"/>
-        </w:rPr>
-        <w:t>ГастроСофт</w:t>
-      </w:r>
-      <w:r>
-        <w:rPr>
-          <w:rFonts w:hint="default"/>
-          <w:lang w:val="en-US"/>
-        </w:rPr>
-        <w:t>, которое полностью отвечает потребностям ресторанного бизнеса: оно быстро работает, не зависит от перебоев интернета и обеспечивает точный контроль над ключевыми бизнес-процессами.</w:t>
+        <w:t>В качестве системы управления базами данных для проекта ГастроСофт выбрана MySQL 8 с сохранением совместимости с MariaDB. Такое решение соответствует реальным проектным артефактам: физическая модель базы данных создана в MySQL Workbench, а итоговая схема оформлена в SQL-скрипте gastrosoft_mysql.sql.</w:t>
+      </w:r>
+    </w:p>
+    <w:p>
+      <w:pPr>
+        <w:keepNext w:val="0"/>
+        <w:keepLines w:val="0"/>
+        <w:pageBreakBefore w:val="0"/>
+        <w:widowControl/>
+        <w:kinsoku/>
+        <w:wordWrap/>
+        <w:overflowPunct/>
+        <w:topLinePunct w:val="0"/>
+        <w:autoSpaceDE/>
+        <w:autoSpaceDN/>
+        <w:bidi w:val="0"/>
+        <w:adjustRightInd/>
+        <w:snapToGrid/>
+        <w:ind w:firstLine="709"/>
+        <w:jc w:val="both"/>
+        <w:textAlignment w:val="auto"/>
+        <w:rPr>
+          <w:rFonts w:hint="default"/>
+          <w:lang w:val="en-US"/>
+        </w:rPr>
+      </w:pPr>
+    </w:p>
+    <w:p>
+      <w:pPr>
+        <w:keepNext w:val="0"/>
+        <w:keepLines w:val="0"/>
+        <w:pageBreakBefore w:val="0"/>
+        <w:widowControl/>
+        <w:kinsoku/>
+        <w:wordWrap/>
+        <w:overflowPunct/>
+        <w:topLinePunct w:val="0"/>
+        <w:autoSpaceDE/>
+        <w:autoSpaceDN/>
+        <w:bidi w:val="0"/>
+        <w:adjustRightInd/>
+        <w:snapToGrid/>
+        <w:ind w:firstLine="709"/>
+        <w:jc w:val="both"/>
+        <w:textAlignment w:val="auto"/>
+        <w:rPr>
+          <w:rFonts w:hint="default"/>
+          <w:lang w:val="en-US"/>
+        </w:rPr>
+      </w:pPr>
+      <w:r>
+        <w:t>Реляционная природа предметной области: Структура системы включает большое количество устойчивых взаимосвязей между сотрудниками, ролями, сменами, бронированиями, заказами, блюдами, ингредиентами и складскими операциями. MySQL хорошо подходит для хранения таких данных в виде связанных таблиц и обеспечивает удобную обработку сложных выборок.</w:t>
+      </w:r>
+    </w:p>
+    <w:p>
+      <w:pPr>
+        <w:keepNext w:val="0"/>
+        <w:keepLines w:val="0"/>
+        <w:pageBreakBefore w:val="0"/>
+        <w:widowControl/>
+        <w:kinsoku/>
+        <w:wordWrap/>
+        <w:overflowPunct/>
+        <w:topLinePunct w:val="0"/>
+        <w:autoSpaceDE/>
+        <w:autoSpaceDN/>
+        <w:bidi w:val="0"/>
+        <w:adjustRightInd/>
+        <w:snapToGrid/>
+        <w:ind w:firstLine="709"/>
+        <w:jc w:val="both"/>
+        <w:textAlignment w:val="auto"/>
+        <w:rPr>
+          <w:rFonts w:hint="default"/>
+          <w:lang w:val="en-US"/>
+        </w:rPr>
+      </w:pPr>
+    </w:p>
+    <w:p>
+      <w:pPr>
+        <w:keepNext w:val="0"/>
+        <w:keepLines w:val="0"/>
+        <w:pageBreakBefore w:val="0"/>
+        <w:widowControl/>
+        <w:kinsoku/>
+        <w:wordWrap/>
+        <w:overflowPunct/>
+        <w:topLinePunct w:val="0"/>
+        <w:autoSpaceDE/>
+        <w:autoSpaceDN/>
+        <w:bidi w:val="0"/>
+        <w:adjustRightInd/>
+        <w:snapToGrid/>
+        <w:ind w:firstLine="709"/>
+        <w:jc w:val="both"/>
+        <w:textAlignment w:val="auto"/>
+        <w:rPr>
+          <w:rFonts w:hint="default"/>
+          <w:lang w:val="en-US"/>
+        </w:rPr>
+      </w:pPr>
+      <w:r>
+        <w:t>Поддержка целостности и надежности: В SQL-скрипте проекта активно используются первичные и внешние ключи, уникальные ограничения, индексы и механизм InnoDB. Это позволяет гарантировать непротиворечивость данных, например корректную связь между заказом и его позициями, сменой и назначенными сотрудниками, блюдом и его рецептурой.</w:t>
+      </w:r>
+    </w:p>
+    <w:p>
+      <w:pPr>
+        <w:keepNext w:val="0"/>
+        <w:keepLines w:val="0"/>
+        <w:pageBreakBefore w:val="0"/>
+        <w:widowControl/>
+        <w:kinsoku/>
+        <w:wordWrap/>
+        <w:overflowPunct/>
+        <w:topLinePunct w:val="0"/>
+        <w:autoSpaceDE/>
+        <w:autoSpaceDN/>
+        <w:bidi w:val="0"/>
+        <w:adjustRightInd/>
+        <w:snapToGrid/>
+        <w:ind w:firstLine="709"/>
+        <w:jc w:val="both"/>
+        <w:textAlignment w:val="auto"/>
+        <w:rPr>
+          <w:rFonts w:hint="default"/>
+          <w:lang w:val="en-US"/>
+        </w:rPr>
+      </w:pPr>
+    </w:p>
+    <w:p>
+      <w:pPr>
+        <w:keepNext w:val="0"/>
+        <w:keepLines w:val="0"/>
+        <w:pageBreakBefore w:val="0"/>
+        <w:widowControl/>
+        <w:kinsoku/>
+        <w:wordWrap/>
+        <w:overflowPunct/>
+        <w:topLinePunct w:val="0"/>
+        <w:autoSpaceDE/>
+        <w:autoSpaceDN/>
+        <w:bidi w:val="0"/>
+        <w:adjustRightInd/>
+        <w:snapToGrid/>
+        <w:ind w:firstLine="709"/>
+        <w:jc w:val="both"/>
+        <w:textAlignment w:val="auto"/>
+        <w:rPr>
+          <w:rFonts w:hint="default"/>
+          <w:lang w:val="en-US"/>
+        </w:rPr>
+      </w:pPr>
+      <w:r>
+        <w:t>Удобство проектирования и сопровождения: Для базы данных проекта подготовлена отдельная модель в MySQL Workbench и полный SQL-скрипт развертывания. Дополнительным преимуществом является совместимость схемы с MariaDB, что делает решение более гибким при переносе и эксплуатации в различных программных средах.</w:t>
+      </w:r>
+    </w:p>
+    <w:p>
+      <w:pPr>
+        <w:keepNext w:val="0"/>
+        <w:keepLines w:val="0"/>
+        <w:pageBreakBefore w:val="0"/>
+        <w:widowControl/>
+        <w:kinsoku/>
+        <w:wordWrap/>
+        <w:overflowPunct/>
+        <w:topLinePunct w:val="0"/>
+        <w:autoSpaceDE/>
+        <w:autoSpaceDN/>
+        <w:bidi w:val="0"/>
+        <w:adjustRightInd/>
+        <w:snapToGrid/>
+        <w:ind w:firstLine="709"/>
+        <w:jc w:val="both"/>
+        <w:textAlignment w:val="auto"/>
+        <w:rPr>
+          <w:rFonts w:hint="default"/>
+          <w:lang w:val="en-US"/>
+        </w:rPr>
+      </w:pPr>
+    </w:p>
+    <w:p>
+      <w:pPr>
+        <w:keepNext w:val="0"/>
+        <w:keepLines w:val="0"/>
+        <w:pageBreakBefore w:val="0"/>
+        <w:widowControl/>
+        <w:kinsoku/>
+        <w:wordWrap/>
+        <w:overflowPunct/>
+        <w:topLinePunct w:val="0"/>
+        <w:autoSpaceDE/>
+        <w:autoSpaceDN/>
+        <w:bidi w:val="0"/>
+        <w:adjustRightInd/>
+        <w:snapToGrid/>
+        <w:ind w:firstLine="709"/>
+        <w:jc w:val="both"/>
+        <w:textAlignment w:val="auto"/>
+        <w:rPr>
+          <w:rFonts w:hint="default"/>
+          <w:lang w:val="en-US"/>
+        </w:rPr>
+      </w:pPr>
+      <w:r>
+        <w:t>Таким образом, использование MySQL 8 как основной СУБД позволяет обеспечить для системы ГастроСофт надежное хранение данных, поддержку связей между объектами, удобство администрирования и возможность дальнейшего расширения функционала без перестройки всей структуры базы данных.</w:t>
       </w:r>
     </w:p>
     <w:p>
@@ -6494,8 +6460,1358 @@
       <w:r>
         <w:t>Макет главного экрана системы.</w:t>
       </w:r>
+    </w:p>
+    <w:p>
+      <w:pPr>
+        <w:pStyle w:val="2"/>
+        <w:pageBreakBefore/>
+        <w:numPr>
+          <w:ilvl w:val="0"/>
+          <w:numId w:val="1"/>
+        </w:numPr>
+        <w:bidi w:val="0"/>
+        <w:jc w:val="center"/>
+        <w:rPr>
+          <w:rFonts w:hint="default"/>
+          <w:lang w:val="ru-RU"/>
+        </w:rPr>
+      </w:pPr>
+      <w:r>
+        <w:rPr>
+          <w:rFonts w:hint="default"/>
+          <w:lang w:val="ru-RU"/>
+        </w:rPr>
+        <w:t>ПРОЕКТНАЯ ЧАСТЬ</w:t>
+      </w:r>
+    </w:p>
+    <w:p>
+      <w:pPr>
+        <w:pStyle w:val="3"/>
+        <w:bidi w:val="0"/>
+        <w:jc w:val="center"/>
+        <w:rPr>
+          <w:rFonts w:hint="default"/>
+          <w:sz w:val="28"/>
+          <w:szCs w:val="28"/>
+          <w:lang w:val="ru-RU"/>
+        </w:rPr>
+      </w:pPr>
+      <w:r>
+        <w:rPr>
+          <w:rFonts w:hint="default"/>
+          <w:sz w:val="28"/>
+          <w:szCs w:val="28"/>
+          <w:lang w:val="ru-RU"/>
+        </w:rPr>
+        <w:t>2.1 Обоснование начала проектирования с концептуальной модели</w:t>
+      </w:r>
+    </w:p>
+    <w:p>
+      <w:pPr>
+        <w:keepNext w:val="0"/>
+        <w:keepLines w:val="0"/>
+        <w:pageBreakBefore w:val="0"/>
+        <w:widowControl/>
+        <w:kinsoku/>
+        <w:wordWrap/>
+        <w:overflowPunct/>
+        <w:topLinePunct w:val="0"/>
+        <w:autoSpaceDE/>
+        <w:autoSpaceDN/>
+        <w:bidi w:val="0"/>
+        <w:adjustRightInd/>
+        <w:snapToGrid/>
+        <w:ind w:firstLine="709"/>
+        <w:jc w:val="both"/>
+        <w:textAlignment w:val="auto"/>
+        <w:rPr>
+          <w:rFonts w:hint="default"/>
+          <w:lang w:val="en-US"/>
+        </w:rPr>
+      </w:pPr>
+    </w:p>
+    <w:p>
+      <w:pPr>
+        <w:keepNext w:val="0"/>
+        <w:keepLines w:val="0"/>
+        <w:pageBreakBefore w:val="0"/>
+        <w:widowControl/>
+        <w:kinsoku/>
+        <w:wordWrap/>
+        <w:overflowPunct/>
+        <w:topLinePunct w:val="0"/>
+        <w:autoSpaceDE/>
+        <w:autoSpaceDN/>
+        <w:bidi w:val="0"/>
+        <w:adjustRightInd/>
+        <w:snapToGrid/>
+        <w:ind w:firstLine="709"/>
+        <w:jc w:val="both"/>
+        <w:textAlignment w:val="auto"/>
+        <w:rPr>
+          <w:rFonts w:hint="default"/>
+          <w:lang w:val="en-US"/>
+        </w:rPr>
+      </w:pPr>
+      <w:r>
+        <w:rPr>
+          <w:rFonts w:hint="default"/>
+          <w:lang w:val="en-US"/>
+        </w:rPr>
+        <w:t>Проектирование базы данных для системы ГастроСофт целесообразно начинать именно с концептуальной модели, поскольку на данном этапе необходимо сначала описать саму предметную область, а не технические особенности ее реализации. Концептуальная модель позволяет выделить ключевые сущности будущей системы, определить их атрибуты и установить связи между ними без привязки к конкретной системе управления базами данных.</w:t>
+      </w:r>
+    </w:p>
+    <w:p>
+      <w:pPr>
+        <w:keepNext w:val="0"/>
+        <w:keepLines w:val="0"/>
+        <w:pageBreakBefore w:val="0"/>
+        <w:widowControl/>
+        <w:kinsoku/>
+        <w:wordWrap/>
+        <w:overflowPunct/>
+        <w:topLinePunct w:val="0"/>
+        <w:autoSpaceDE/>
+        <w:autoSpaceDN/>
+        <w:bidi w:val="0"/>
+        <w:adjustRightInd/>
+        <w:snapToGrid/>
+        <w:ind w:firstLine="709"/>
+        <w:jc w:val="both"/>
+        <w:textAlignment w:val="auto"/>
+        <w:rPr>
+          <w:rFonts w:hint="default"/>
+          <w:lang w:val="en-US"/>
+        </w:rPr>
+      </w:pPr>
+    </w:p>
+    <w:p>
+      <w:pPr>
+        <w:keepNext w:val="0"/>
+        <w:keepLines w:val="0"/>
+        <w:pageBreakBefore w:val="0"/>
+        <w:widowControl/>
+        <w:kinsoku/>
+        <w:wordWrap/>
+        <w:overflowPunct/>
+        <w:topLinePunct w:val="0"/>
+        <w:autoSpaceDE/>
+        <w:autoSpaceDN/>
+        <w:bidi w:val="0"/>
+        <w:adjustRightInd/>
+        <w:snapToGrid/>
+        <w:ind w:firstLine="709"/>
+        <w:jc w:val="both"/>
+        <w:textAlignment w:val="auto"/>
+        <w:rPr>
+          <w:rFonts w:hint="default"/>
+          <w:lang w:val="en-US"/>
+        </w:rPr>
+      </w:pPr>
+      <w:r>
+        <w:rPr>
+          <w:rFonts w:hint="default"/>
+          <w:lang w:val="en-US"/>
+        </w:rPr>
+        <w:t>Для рассматриваемого проекта такой подход особенно важен, так как информационная система охватывает сразу несколько взаимосвязанных процессов: управление сотрудниками, формирование смен, учет навыков персонала, бронирование столиков, оформление заказов, работу с меню, рецептурами и складскими операциями. Если сразу переходить к таблицам, существует риск дублирования сущностей, пропуска важных связей и появления логических ошибок в структуре базы данных.</w:t>
+      </w:r>
+    </w:p>
+    <w:p>
+      <w:pPr>
+        <w:keepNext w:val="0"/>
+        <w:keepLines w:val="0"/>
+        <w:pageBreakBefore w:val="0"/>
+        <w:widowControl/>
+        <w:kinsoku/>
+        <w:wordWrap/>
+        <w:overflowPunct/>
+        <w:topLinePunct w:val="0"/>
+        <w:autoSpaceDE/>
+        <w:autoSpaceDN/>
+        <w:bidi w:val="0"/>
+        <w:adjustRightInd/>
+        <w:snapToGrid/>
+        <w:ind w:firstLine="709"/>
+        <w:jc w:val="both"/>
+        <w:textAlignment w:val="auto"/>
+        <w:rPr>
+          <w:rFonts w:hint="default"/>
+          <w:lang w:val="en-US"/>
+        </w:rPr>
+      </w:pPr>
+    </w:p>
+    <w:p>
+      <w:pPr>
+        <w:keepNext w:val="0"/>
+        <w:keepLines w:val="0"/>
+        <w:pageBreakBefore w:val="0"/>
+        <w:widowControl/>
+        <w:kinsoku/>
+        <w:wordWrap/>
+        <w:overflowPunct/>
+        <w:topLinePunct w:val="0"/>
+        <w:autoSpaceDE/>
+        <w:autoSpaceDN/>
+        <w:bidi w:val="0"/>
+        <w:adjustRightInd/>
+        <w:snapToGrid/>
+        <w:ind w:firstLine="709"/>
+        <w:jc w:val="both"/>
+        <w:textAlignment w:val="auto"/>
+        <w:rPr>
+          <w:rFonts w:hint="default"/>
+          <w:lang w:val="en-US"/>
+        </w:rPr>
+      </w:pPr>
+      <w:r>
+        <w:rPr>
+          <w:rFonts w:hint="default"/>
+          <w:lang w:val="en-US"/>
+        </w:rPr>
+        <w:t>Именно поэтому на начальном этапе была построена концептуальная схема в нотации Чена, отраженная в файле gastrosoft_conceptmodelChen.png. Она позволила зафиксировать, какие объекты реально существуют в системе, например сотрудник, роль сотрудника, смена, гость, бронирование, заказ, блюдо, ингредиент и складская операция, а затем уже преобразовать эти сущности в реляционную структуру. Такой порядок проектирования обеспечивает логичность, полноту и непротиворечивость последующей разработки базы данных.</w:t>
+      </w:r>
+    </w:p>
+    <w:p>
+      <w:pPr>
+        <w:keepNext w:val="0"/>
+        <w:keepLines w:val="0"/>
+        <w:pageBreakBefore w:val="0"/>
+        <w:widowControl/>
+        <w:kinsoku/>
+        <w:wordWrap/>
+        <w:overflowPunct/>
+        <w:topLinePunct w:val="0"/>
+        <w:autoSpaceDE/>
+        <w:autoSpaceDN/>
+        <w:bidi w:val="0"/>
+        <w:adjustRightInd/>
+        <w:snapToGrid/>
+        <w:ind w:firstLine="709"/>
+        <w:jc w:val="both"/>
+        <w:textAlignment w:val="auto"/>
+        <w:rPr>
+          <w:rFonts w:hint="default"/>
+          <w:lang w:val="en-US"/>
+        </w:rPr>
+      </w:pPr>
+    </w:p>
+    <w:p>
+      <w:pPr>
+        <w:rPr>
+          <w:rFonts w:hint="default"/>
+          <w:sz w:val="28"/>
+          <w:szCs w:val="28"/>
+          <w:lang w:val="ru-RU"/>
+        </w:rPr>
+      </w:pPr>
+      <w:r>
+        <w:rPr>
+          <w:rFonts w:hint="default"/>
+          <w:sz w:val="28"/>
+          <w:szCs w:val="28"/>
+          <w:lang w:val="ru-RU"/>
+        </w:rPr>
+        <w:br w:type="page"/>
+      </w:r>
+    </w:p>
+    <w:p>
+      <w:pPr>
+        <w:pStyle w:val="3"/>
+        <w:bidi w:val="0"/>
+        <w:jc w:val="center"/>
+        <w:rPr>
+          <w:rFonts w:hint="default"/>
+          <w:sz w:val="28"/>
+          <w:szCs w:val="28"/>
+          <w:lang w:val="ru-RU"/>
+        </w:rPr>
+      </w:pPr>
+      <w:r>
+        <w:rPr>
+          <w:rFonts w:hint="default"/>
+          <w:sz w:val="28"/>
+          <w:szCs w:val="28"/>
+          <w:lang w:val="ru-RU"/>
+        </w:rPr>
+        <w:t>2.2 Выбор модели данных</w:t>
+      </w:r>
+    </w:p>
+    <w:p>
+      <w:pPr>
+        <w:keepNext w:val="0"/>
+        <w:keepLines w:val="0"/>
+        <w:pageBreakBefore w:val="0"/>
+        <w:widowControl/>
+        <w:kinsoku/>
+        <w:wordWrap/>
+        <w:overflowPunct/>
+        <w:topLinePunct w:val="0"/>
+        <w:autoSpaceDE/>
+        <w:autoSpaceDN/>
+        <w:bidi w:val="0"/>
+        <w:adjustRightInd/>
+        <w:snapToGrid/>
+        <w:ind w:firstLine="709"/>
+        <w:jc w:val="both"/>
+        <w:textAlignment w:val="auto"/>
+        <w:rPr>
+          <w:rFonts w:hint="default"/>
+          <w:lang w:val="en-US"/>
+        </w:rPr>
+      </w:pPr>
+    </w:p>
+    <w:p>
+      <w:pPr>
+        <w:keepNext w:val="0"/>
+        <w:keepLines w:val="0"/>
+        <w:pageBreakBefore w:val="0"/>
+        <w:widowControl/>
+        <w:kinsoku/>
+        <w:wordWrap/>
+        <w:overflowPunct/>
+        <w:topLinePunct w:val="0"/>
+        <w:autoSpaceDE/>
+        <w:autoSpaceDN/>
+        <w:bidi w:val="0"/>
+        <w:adjustRightInd/>
+        <w:snapToGrid/>
+        <w:ind w:firstLine="709"/>
+        <w:jc w:val="both"/>
+        <w:textAlignment w:val="auto"/>
+        <w:rPr>
+          <w:rFonts w:hint="default"/>
+          <w:lang w:val="en-US"/>
+        </w:rPr>
+      </w:pPr>
+      <w:r>
+        <w:rPr>
+          <w:rFonts w:hint="default"/>
+          <w:lang w:val="en-US"/>
+        </w:rPr>
+        <w:t>На основании проектных файлов можно сделать вывод, что для системы ГастроСофт выбрана реляционная модель данных. Это подтверждается содержимым SQL-скрипта gastrosoft_mysql.sql, где данные представлены в виде набора взаимосвязанных таблиц, а также файлом gastrosoftfromworkbench.mwb, содержащим физическую модель базы данных, созданную в среде MySQL Workbench.</w:t>
+      </w:r>
+    </w:p>
+    <w:p>
+      <w:pPr>
+        <w:keepNext w:val="0"/>
+        <w:keepLines w:val="0"/>
+        <w:pageBreakBefore w:val="0"/>
+        <w:widowControl/>
+        <w:kinsoku/>
+        <w:wordWrap/>
+        <w:overflowPunct/>
+        <w:topLinePunct w:val="0"/>
+        <w:autoSpaceDE/>
+        <w:autoSpaceDN/>
+        <w:bidi w:val="0"/>
+        <w:adjustRightInd/>
+        <w:snapToGrid/>
+        <w:ind w:firstLine="709"/>
+        <w:jc w:val="both"/>
+        <w:textAlignment w:val="auto"/>
+        <w:rPr>
+          <w:rFonts w:hint="default"/>
+          <w:lang w:val="en-US"/>
+        </w:rPr>
+      </w:pPr>
+    </w:p>
+    <w:p>
+      <w:pPr>
+        <w:keepNext w:val="0"/>
+        <w:keepLines w:val="0"/>
+        <w:pageBreakBefore w:val="0"/>
+        <w:widowControl/>
+        <w:kinsoku/>
+        <w:wordWrap/>
+        <w:overflowPunct/>
+        <w:topLinePunct w:val="0"/>
+        <w:autoSpaceDE/>
+        <w:autoSpaceDN/>
+        <w:bidi w:val="0"/>
+        <w:adjustRightInd/>
+        <w:snapToGrid/>
+        <w:ind w:firstLine="709"/>
+        <w:jc w:val="both"/>
+        <w:textAlignment w:val="auto"/>
+        <w:rPr>
+          <w:rFonts w:hint="default"/>
+          <w:lang w:val="en-US"/>
+        </w:rPr>
+      </w:pPr>
+      <w:r>
+        <w:rPr>
+          <w:rFonts w:hint="default"/>
+          <w:lang w:val="en-US"/>
+        </w:rPr>
+        <w:t>Выбор реляционной модели обусловлен особенностями самой предметной области. Для ресторанной информационной системы большинство объектов имеют четкую структуру и естественным образом описываются отношениями между сущностями. Так, одному сотруднику соответствует одна роль, одна смена может содержать несколько назначений, один заказ включает несколько позиций, а одно блюдо может состоять из нескольких ингредиентов. Подобные зависимости удобно представлять именно в виде таблиц и связей между ними.</w:t>
+      </w:r>
+    </w:p>
+    <w:p>
+      <w:pPr>
+        <w:keepNext w:val="0"/>
+        <w:keepLines w:val="0"/>
+        <w:pageBreakBefore w:val="0"/>
+        <w:widowControl/>
+        <w:kinsoku/>
+        <w:wordWrap/>
+        <w:overflowPunct/>
+        <w:topLinePunct w:val="0"/>
+        <w:autoSpaceDE/>
+        <w:autoSpaceDN/>
+        <w:bidi w:val="0"/>
+        <w:adjustRightInd/>
+        <w:snapToGrid/>
+        <w:ind w:firstLine="709"/>
+        <w:jc w:val="both"/>
+        <w:textAlignment w:val="auto"/>
+        <w:rPr>
+          <w:rFonts w:hint="default"/>
+          <w:lang w:val="en-US"/>
+        </w:rPr>
+      </w:pPr>
+    </w:p>
+    <w:p>
+      <w:pPr>
+        <w:keepNext w:val="0"/>
+        <w:keepLines w:val="0"/>
+        <w:pageBreakBefore w:val="0"/>
+        <w:widowControl/>
+        <w:kinsoku/>
+        <w:wordWrap/>
+        <w:overflowPunct/>
+        <w:topLinePunct w:val="0"/>
+        <w:autoSpaceDE/>
+        <w:autoSpaceDN/>
+        <w:bidi w:val="0"/>
+        <w:adjustRightInd/>
+        <w:snapToGrid/>
+        <w:ind w:firstLine="709"/>
+        <w:jc w:val="both"/>
+        <w:textAlignment w:val="auto"/>
+        <w:rPr>
+          <w:rFonts w:hint="default"/>
+          <w:lang w:val="en-US"/>
+        </w:rPr>
+      </w:pPr>
+      <w:r>
+        <w:rPr>
+          <w:rFonts w:hint="default"/>
+          <w:lang w:val="en-US"/>
+        </w:rPr>
+        <w:t>Дополнительным аргументом в пользу реляционной модели является нормализация структуры данных. В SQL-файле проекта прямо указано, что схема разрабатывалась с ориентацией на третью нормальную форму. Это означает, что данные распределены по таблицам таким образом, чтобы уменьшить избыточность, избежать аномалий обновления и обеспечить удобство дальнейшей обработки. Связи типа многие-ко-многим в проекте вынесены в отдельные таблицы, например employee_skill, employee_shift_preference, dish_modifier_group, recipe_item, staffing_requirement и order_item_modifier.</w:t>
+      </w:r>
+    </w:p>
+    <w:p>
+      <w:pPr>
+        <w:keepNext w:val="0"/>
+        <w:keepLines w:val="0"/>
+        <w:pageBreakBefore w:val="0"/>
+        <w:widowControl/>
+        <w:kinsoku/>
+        <w:wordWrap/>
+        <w:overflowPunct/>
+        <w:topLinePunct w:val="0"/>
+        <w:autoSpaceDE/>
+        <w:autoSpaceDN/>
+        <w:bidi w:val="0"/>
+        <w:adjustRightInd/>
+        <w:snapToGrid/>
+        <w:ind w:firstLine="709"/>
+        <w:jc w:val="both"/>
+        <w:textAlignment w:val="auto"/>
+        <w:rPr>
+          <w:rFonts w:hint="default"/>
+          <w:lang w:val="en-US"/>
+        </w:rPr>
+      </w:pPr>
+    </w:p>
+    <w:p>
+      <w:pPr>
+        <w:rPr>
+          <w:rFonts w:hint="default"/>
+          <w:sz w:val="28"/>
+          <w:szCs w:val="28"/>
+          <w:lang w:val="ru-RU"/>
+        </w:rPr>
+      </w:pPr>
+      <w:r>
+        <w:rPr>
+          <w:rFonts w:hint="default"/>
+          <w:sz w:val="28"/>
+          <w:szCs w:val="28"/>
+          <w:lang w:val="ru-RU"/>
+        </w:rPr>
+        <w:br w:type="page"/>
+      </w:r>
+    </w:p>
+    <w:p>
+      <w:pPr>
+        <w:pStyle w:val="3"/>
+        <w:bidi w:val="0"/>
+        <w:jc w:val="center"/>
+        <w:rPr>
+          <w:rFonts w:hint="default"/>
+          <w:sz w:val="28"/>
+          <w:szCs w:val="28"/>
+          <w:lang w:val="ru-RU"/>
+        </w:rPr>
+      </w:pPr>
+      <w:r>
+        <w:rPr>
+          <w:rFonts w:hint="default"/>
+          <w:sz w:val="28"/>
+          <w:szCs w:val="28"/>
+          <w:lang w:val="ru-RU"/>
+        </w:rPr>
+        <w:t>2.3 Обоснование выбора СУБД</w:t>
+      </w:r>
+    </w:p>
+    <w:p>
+      <w:pPr>
+        <w:keepNext w:val="0"/>
+        <w:keepLines w:val="0"/>
+        <w:pageBreakBefore w:val="0"/>
+        <w:widowControl/>
+        <w:kinsoku/>
+        <w:wordWrap/>
+        <w:overflowPunct/>
+        <w:topLinePunct w:val="0"/>
+        <w:autoSpaceDE/>
+        <w:autoSpaceDN/>
+        <w:bidi w:val="0"/>
+        <w:adjustRightInd/>
+        <w:snapToGrid/>
+        <w:ind w:firstLine="709"/>
+        <w:jc w:val="both"/>
+        <w:textAlignment w:val="auto"/>
+        <w:rPr>
+          <w:rFonts w:hint="default"/>
+          <w:lang w:val="en-US"/>
+        </w:rPr>
+      </w:pPr>
+    </w:p>
+    <w:p>
+      <w:pPr>
+        <w:keepNext w:val="0"/>
+        <w:keepLines w:val="0"/>
+        <w:pageBreakBefore w:val="0"/>
+        <w:widowControl/>
+        <w:kinsoku/>
+        <w:wordWrap/>
+        <w:overflowPunct/>
+        <w:topLinePunct w:val="0"/>
+        <w:autoSpaceDE/>
+        <w:autoSpaceDN/>
+        <w:bidi w:val="0"/>
+        <w:adjustRightInd/>
+        <w:snapToGrid/>
+        <w:ind w:firstLine="709"/>
+        <w:jc w:val="both"/>
+        <w:textAlignment w:val="auto"/>
+        <w:rPr>
+          <w:rFonts w:hint="default"/>
+          <w:lang w:val="en-US"/>
+        </w:rPr>
+      </w:pPr>
+      <w:r>
+        <w:rPr>
+          <w:rFonts w:hint="default"/>
+          <w:lang w:val="en-US"/>
+        </w:rPr>
+        <w:t>В качестве конкретной системы управления базами данных в проекте использована MySQL 8, при этом структура остается совместимой с MariaDB. Это подтверждается заголовком SQL-скрипта, где схема обозначена как MySQL 8+ / MariaDB-compatible, а также самим фактом использования файла модели формата MWB, создаваемого в MySQL Workbench.</w:t>
+      </w:r>
+    </w:p>
+    <w:p>
+      <w:pPr>
+        <w:keepNext w:val="0"/>
+        <w:keepLines w:val="0"/>
+        <w:pageBreakBefore w:val="0"/>
+        <w:widowControl/>
+        <w:kinsoku/>
+        <w:wordWrap/>
+        <w:overflowPunct/>
+        <w:topLinePunct w:val="0"/>
+        <w:autoSpaceDE/>
+        <w:autoSpaceDN/>
+        <w:bidi w:val="0"/>
+        <w:adjustRightInd/>
+        <w:snapToGrid/>
+        <w:ind w:firstLine="709"/>
+        <w:jc w:val="both"/>
+        <w:textAlignment w:val="auto"/>
+        <w:rPr>
+          <w:rFonts w:hint="default"/>
+          <w:lang w:val="en-US"/>
+        </w:rPr>
+      </w:pPr>
+    </w:p>
+    <w:p>
+      <w:pPr>
+        <w:keepNext w:val="0"/>
+        <w:keepLines w:val="0"/>
+        <w:pageBreakBefore w:val="0"/>
+        <w:widowControl/>
+        <w:kinsoku/>
+        <w:wordWrap/>
+        <w:overflowPunct/>
+        <w:topLinePunct w:val="0"/>
+        <w:autoSpaceDE/>
+        <w:autoSpaceDN/>
+        <w:bidi w:val="0"/>
+        <w:adjustRightInd/>
+        <w:snapToGrid/>
+        <w:ind w:firstLine="709"/>
+        <w:jc w:val="both"/>
+        <w:textAlignment w:val="auto"/>
+        <w:rPr>
+          <w:rFonts w:hint="default"/>
+          <w:lang w:val="en-US"/>
+        </w:rPr>
+      </w:pPr>
+      <w:r>
+        <w:rPr>
+          <w:rFonts w:hint="default"/>
+          <w:lang w:val="en-US"/>
+        </w:rPr>
+        <w:t>Выбор MySQL является обоснованным по нескольким причинам. Во-первых, данная СУБД хорошо подходит для реляционных приложений с большим количеством связанных сущностей и поддерживает все необходимые механизмы: первичные и внешние ключи, индексы, ограничения уникальности, представления и транзакционную обработку данных. Во-вторых, в проекте используется движок InnoDB, который обеспечивает ссылочную целостность и надежность при выполнении операций вставки, обновления и удаления данных.</w:t>
+      </w:r>
+    </w:p>
+    <w:p>
+      <w:pPr>
+        <w:keepNext w:val="0"/>
+        <w:keepLines w:val="0"/>
+        <w:pageBreakBefore w:val="0"/>
+        <w:widowControl/>
+        <w:kinsoku/>
+        <w:wordWrap/>
+        <w:overflowPunct/>
+        <w:topLinePunct w:val="0"/>
+        <w:autoSpaceDE/>
+        <w:autoSpaceDN/>
+        <w:bidi w:val="0"/>
+        <w:adjustRightInd/>
+        <w:snapToGrid/>
+        <w:ind w:firstLine="709"/>
+        <w:jc w:val="both"/>
+        <w:textAlignment w:val="auto"/>
+        <w:rPr>
+          <w:rFonts w:hint="default"/>
+          <w:lang w:val="en-US"/>
+        </w:rPr>
+      </w:pPr>
+    </w:p>
+    <w:p>
+      <w:pPr>
+        <w:keepNext w:val="0"/>
+        <w:keepLines w:val="0"/>
+        <w:pageBreakBefore w:val="0"/>
+        <w:widowControl/>
+        <w:kinsoku/>
+        <w:wordWrap/>
+        <w:overflowPunct/>
+        <w:topLinePunct w:val="0"/>
+        <w:autoSpaceDE/>
+        <w:autoSpaceDN/>
+        <w:bidi w:val="0"/>
+        <w:adjustRightInd/>
+        <w:snapToGrid/>
+        <w:ind w:firstLine="709"/>
+        <w:jc w:val="both"/>
+        <w:textAlignment w:val="auto"/>
+        <w:rPr>
+          <w:rFonts w:hint="default"/>
+          <w:lang w:val="en-US"/>
+        </w:rPr>
+      </w:pPr>
+      <w:r>
+        <w:rPr>
+          <w:rFonts w:hint="default"/>
+          <w:lang w:val="en-US"/>
+        </w:rPr>
+        <w:t>Немаловажным фактором является и удобство практической разработки. MySQL имеет развитую экосистему инструментов, широко поддерживается различными приложениями и позволяет визуально проектировать базу данных в MySQL Workbench. Использование кодировки utf8mb4 также делает систему пригодной для хранения русскоязычных текстовых данных, что особенно важно для названий блюд, ролей сотрудников, комментариев и описаний. Следовательно, выбранная СУБД полностью соответствует требованиям проекта по надежности, расширяемости и удобству сопровождения.</w:t>
+      </w:r>
+    </w:p>
+    <w:p>
+      <w:pPr>
+        <w:keepNext w:val="0"/>
+        <w:keepLines w:val="0"/>
+        <w:pageBreakBefore w:val="0"/>
+        <w:widowControl/>
+        <w:kinsoku/>
+        <w:wordWrap/>
+        <w:overflowPunct/>
+        <w:topLinePunct w:val="0"/>
+        <w:autoSpaceDE/>
+        <w:autoSpaceDN/>
+        <w:bidi w:val="0"/>
+        <w:adjustRightInd/>
+        <w:snapToGrid/>
+        <w:ind w:firstLine="709"/>
+        <w:jc w:val="both"/>
+        <w:textAlignment w:val="auto"/>
+        <w:rPr>
+          <w:rFonts w:hint="default"/>
+          <w:lang w:val="en-US"/>
+        </w:rPr>
+      </w:pPr>
+    </w:p>
+    <w:p>
+      <w:pPr>
+        <w:rPr>
+          <w:rFonts w:hint="default"/>
+          <w:sz w:val="28"/>
+          <w:szCs w:val="28"/>
+          <w:lang w:val="ru-RU"/>
+        </w:rPr>
+      </w:pPr>
+      <w:r>
+        <w:rPr>
+          <w:rFonts w:hint="default"/>
+          <w:sz w:val="28"/>
+          <w:szCs w:val="28"/>
+          <w:lang w:val="ru-RU"/>
+        </w:rPr>
+        <w:br w:type="page"/>
+      </w:r>
+    </w:p>
+    <w:p>
+      <w:pPr>
+        <w:pStyle w:val="3"/>
+        <w:bidi w:val="0"/>
+        <w:jc w:val="center"/>
+        <w:rPr>
+          <w:rFonts w:hint="default"/>
+          <w:sz w:val="28"/>
+          <w:szCs w:val="28"/>
+          <w:lang w:val="ru-RU"/>
+        </w:rPr>
+      </w:pPr>
+      <w:r>
+        <w:rPr>
+          <w:rFonts w:hint="default"/>
+          <w:sz w:val="28"/>
+          <w:szCs w:val="28"/>
+          <w:lang w:val="ru-RU"/>
+        </w:rPr>
+        <w:t>2.4 Разработка базы данных</w:t>
+      </w:r>
+    </w:p>
+    <w:p>
+      <w:pPr>
+        <w:keepNext w:val="0"/>
+        <w:keepLines w:val="0"/>
+        <w:pageBreakBefore w:val="0"/>
+        <w:widowControl/>
+        <w:kinsoku/>
+        <w:wordWrap/>
+        <w:overflowPunct/>
+        <w:topLinePunct w:val="0"/>
+        <w:autoSpaceDE/>
+        <w:autoSpaceDN/>
+        <w:bidi w:val="0"/>
+        <w:adjustRightInd/>
+        <w:snapToGrid/>
+        <w:ind w:firstLine="709"/>
+        <w:jc w:val="both"/>
+        <w:textAlignment w:val="auto"/>
+        <w:rPr>
+          <w:rFonts w:hint="default"/>
+          <w:lang w:val="en-US"/>
+        </w:rPr>
+      </w:pPr>
+    </w:p>
+    <w:p>
+      <w:pPr>
+        <w:keepNext w:val="0"/>
+        <w:keepLines w:val="0"/>
+        <w:pageBreakBefore w:val="0"/>
+        <w:widowControl/>
+        <w:kinsoku/>
+        <w:wordWrap/>
+        <w:overflowPunct/>
+        <w:topLinePunct w:val="0"/>
+        <w:autoSpaceDE/>
+        <w:autoSpaceDN/>
+        <w:bidi w:val="0"/>
+        <w:adjustRightInd/>
+        <w:snapToGrid/>
+        <w:ind w:firstLine="709"/>
+        <w:jc w:val="both"/>
+        <w:textAlignment w:val="auto"/>
+        <w:rPr>
+          <w:rFonts w:hint="default"/>
+          <w:lang w:val="en-US"/>
+        </w:rPr>
+      </w:pPr>
+      <w:r>
+        <w:rPr>
+          <w:rFonts w:hint="default"/>
+          <w:lang w:val="en-US"/>
+        </w:rPr>
+        <w:t>Разработка базы данных выполнялась поэтапно. На первом этапе была сформирована концептуальная модель предметной области, в которой определены основные сущности и связи между ними. После этого концептуальная схема была преобразована в логическую реляционную модель, где каждая сущность получила свое табличное представление, а повторяющиеся и независимые характеристики были вынесены в отдельные справочники.</w:t>
+      </w:r>
+    </w:p>
+    <w:p>
+      <w:pPr>
+        <w:keepNext w:val="0"/>
+        <w:keepLines w:val="0"/>
+        <w:pageBreakBefore w:val="0"/>
+        <w:widowControl/>
+        <w:kinsoku/>
+        <w:wordWrap/>
+        <w:overflowPunct/>
+        <w:topLinePunct w:val="0"/>
+        <w:autoSpaceDE/>
+        <w:autoSpaceDN/>
+        <w:bidi w:val="0"/>
+        <w:adjustRightInd/>
+        <w:snapToGrid/>
+        <w:ind w:firstLine="709"/>
+        <w:jc w:val="both"/>
+        <w:textAlignment w:val="auto"/>
+        <w:rPr>
+          <w:rFonts w:hint="default"/>
+          <w:lang w:val="en-US"/>
+        </w:rPr>
+      </w:pPr>
+    </w:p>
+    <w:p>
+      <w:pPr>
+        <w:keepNext w:val="0"/>
+        <w:keepLines w:val="0"/>
+        <w:pageBreakBefore w:val="0"/>
+        <w:widowControl/>
+        <w:kinsoku/>
+        <w:wordWrap/>
+        <w:overflowPunct/>
+        <w:topLinePunct w:val="0"/>
+        <w:autoSpaceDE/>
+        <w:autoSpaceDN/>
+        <w:bidi w:val="0"/>
+        <w:adjustRightInd/>
+        <w:snapToGrid/>
+        <w:ind w:firstLine="709"/>
+        <w:jc w:val="both"/>
+        <w:textAlignment w:val="auto"/>
+        <w:rPr>
+          <w:rFonts w:hint="default"/>
+          <w:lang w:val="en-US"/>
+        </w:rPr>
+      </w:pPr>
+      <w:r>
+        <w:rPr>
+          <w:rFonts w:hint="default"/>
+          <w:lang w:val="en-US"/>
+        </w:rPr>
+        <w:t>Следующим шагом стала разработка физической модели в MySQL Workbench. На этом уровне были определены имена таблиц, типы полей, первичные ключи, внешние ключи, индексы и ограничения целостности. В результате была сформирована структура, включающая 34 таблицы, охватывающие все основные функциональные блоки системы: персонал, доступ пользователей, планирование смен, бронирование, меню, модификаторы, рецептуры, заказы и складские операции.</w:t>
+      </w:r>
+    </w:p>
+    <w:p>
+      <w:pPr>
+        <w:keepNext w:val="0"/>
+        <w:keepLines w:val="0"/>
+        <w:pageBreakBefore w:val="0"/>
+        <w:widowControl/>
+        <w:kinsoku/>
+        <w:wordWrap/>
+        <w:overflowPunct/>
+        <w:topLinePunct w:val="0"/>
+        <w:autoSpaceDE/>
+        <w:autoSpaceDN/>
+        <w:bidi w:val="0"/>
+        <w:adjustRightInd/>
+        <w:snapToGrid/>
+        <w:ind w:firstLine="709"/>
+        <w:jc w:val="both"/>
+        <w:textAlignment w:val="auto"/>
+        <w:rPr>
+          <w:rFonts w:hint="default"/>
+          <w:lang w:val="en-US"/>
+        </w:rPr>
+      </w:pPr>
+    </w:p>
+    <w:p>
+      <w:pPr>
+        <w:keepNext w:val="0"/>
+        <w:keepLines w:val="0"/>
+        <w:pageBreakBefore w:val="0"/>
+        <w:widowControl/>
+        <w:kinsoku/>
+        <w:wordWrap/>
+        <w:overflowPunct/>
+        <w:topLinePunct w:val="0"/>
+        <w:autoSpaceDE/>
+        <w:autoSpaceDN/>
+        <w:bidi w:val="0"/>
+        <w:adjustRightInd/>
+        <w:snapToGrid/>
+        <w:ind w:firstLine="709"/>
+        <w:jc w:val="both"/>
+        <w:textAlignment w:val="auto"/>
+        <w:rPr>
+          <w:rFonts w:hint="default"/>
+          <w:lang w:val="en-US"/>
+        </w:rPr>
+      </w:pPr>
+      <w:r>
+        <w:rPr>
+          <w:rFonts w:hint="default"/>
+          <w:lang w:val="en-US"/>
+        </w:rPr>
+        <w:t>Отдельное внимание было уделено порядку заполнения базы данных. Сначала в SQL-скрипт были внесены справочные таблицы, не зависящие от других сущностей: employee_role, skill, shift_type, shift_status, swap_request_status, reservation_status, order_status, order_item_status, payment_method, stock_operation_type и measurement_unit. Затем могут заполняться основные таблицы сотрудников и пользователей системы, после чего таблицы, связанные с бронированием, прогнозированием нагрузки, сменами и меню.</w:t>
+      </w:r>
+    </w:p>
+    <w:p>
+      <w:pPr>
+        <w:keepNext w:val="0"/>
+        <w:keepLines w:val="0"/>
+        <w:pageBreakBefore w:val="0"/>
+        <w:widowControl/>
+        <w:kinsoku/>
+        <w:wordWrap/>
+        <w:overflowPunct/>
+        <w:topLinePunct w:val="0"/>
+        <w:autoSpaceDE/>
+        <w:autoSpaceDN/>
+        <w:bidi w:val="0"/>
+        <w:adjustRightInd/>
+        <w:snapToGrid/>
+        <w:ind w:firstLine="709"/>
+        <w:jc w:val="both"/>
+        <w:textAlignment w:val="auto"/>
+        <w:rPr>
+          <w:rFonts w:hint="default"/>
+          <w:lang w:val="en-US"/>
+        </w:rPr>
+      </w:pPr>
+    </w:p>
+    <w:p>
+      <w:pPr>
+        <w:keepNext w:val="0"/>
+        <w:keepLines w:val="0"/>
+        <w:pageBreakBefore w:val="0"/>
+        <w:widowControl/>
+        <w:kinsoku/>
+        <w:wordWrap/>
+        <w:overflowPunct/>
+        <w:topLinePunct w:val="0"/>
+        <w:autoSpaceDE/>
+        <w:autoSpaceDN/>
+        <w:bidi w:val="0"/>
+        <w:adjustRightInd/>
+        <w:snapToGrid/>
+        <w:ind w:firstLine="709"/>
+        <w:jc w:val="both"/>
+        <w:textAlignment w:val="auto"/>
+        <w:rPr>
+          <w:rFonts w:hint="default"/>
+          <w:lang w:val="en-US"/>
+        </w:rPr>
+      </w:pPr>
+      <w:r>
+        <w:rPr>
+          <w:rFonts w:hint="default"/>
+          <w:lang w:val="en-US"/>
+        </w:rPr>
+        <w:t>После создания справочных и основных сущностей база данных может наполняться операционными данными, формируемыми в ходе работы системы: заказами, позициями заказов, назначениями на смены, запросами на замену, складскими операциями и другими событиями. Такой порядок соответствует структуре внешних ключей и обеспечивает корректную загрузку данных без нарушения ссылочной целостности. Кроме того, в проекте предусмотрены представления v_order_total, v_ingredient_stock_balance и v_shift_assignment_hours, которые используются для аналитической обработки уже накопленных данных.</w:t>
+      </w:r>
+    </w:p>
+    <w:p>
+      <w:pPr>
+        <w:keepNext w:val="0"/>
+        <w:keepLines w:val="0"/>
+        <w:pageBreakBefore w:val="0"/>
+        <w:widowControl/>
+        <w:kinsoku/>
+        <w:wordWrap/>
+        <w:overflowPunct/>
+        <w:topLinePunct w:val="0"/>
+        <w:autoSpaceDE/>
+        <w:autoSpaceDN/>
+        <w:bidi w:val="0"/>
+        <w:adjustRightInd/>
+        <w:snapToGrid/>
+        <w:ind w:firstLine="709"/>
+        <w:jc w:val="both"/>
+        <w:textAlignment w:val="auto"/>
+        <w:rPr>
+          <w:rFonts w:hint="default"/>
+          <w:lang w:val="en-US"/>
+        </w:rPr>
+      </w:pPr>
+    </w:p>
+    <w:p>
+      <w:pPr>
+        <w:rPr>
+          <w:rFonts w:hint="default"/>
+          <w:sz w:val="28"/>
+          <w:szCs w:val="28"/>
+          <w:lang w:val="ru-RU"/>
+        </w:rPr>
+      </w:pPr>
+      <w:r>
+        <w:rPr>
+          <w:rFonts w:hint="default"/>
+          <w:sz w:val="28"/>
+          <w:szCs w:val="28"/>
+          <w:lang w:val="ru-RU"/>
+        </w:rPr>
+        <w:br w:type="page"/>
+      </w:r>
+    </w:p>
+    <w:p>
+      <w:pPr>
+        <w:pStyle w:val="3"/>
+        <w:bidi w:val="0"/>
+        <w:jc w:val="center"/>
+        <w:rPr>
+          <w:rFonts w:hint="default"/>
+          <w:sz w:val="28"/>
+          <w:szCs w:val="28"/>
+          <w:lang w:val="ru-RU"/>
+        </w:rPr>
+      </w:pPr>
       <w:bookmarkStart w:id="1" w:name="_GoBack"/>
       <w:bookmarkEnd w:id="1"/>
+      <w:r>
+        <w:rPr>
+          <w:rFonts w:hint="default"/>
+          <w:sz w:val="28"/>
+          <w:szCs w:val="28"/>
+          <w:lang w:val="ru-RU"/>
+        </w:rPr>
+        <w:t>2.5 Описание таблиц базы данных (словарь данных)</w:t>
+      </w:r>
+    </w:p>
+    <w:p>
+      <w:pPr>
+        <w:keepNext w:val="0"/>
+        <w:keepLines w:val="0"/>
+        <w:pageBreakBefore w:val="0"/>
+        <w:widowControl/>
+        <w:kinsoku/>
+        <w:wordWrap/>
+        <w:overflowPunct/>
+        <w:topLinePunct w:val="0"/>
+        <w:autoSpaceDE/>
+        <w:autoSpaceDN/>
+        <w:bidi w:val="0"/>
+        <w:adjustRightInd/>
+        <w:snapToGrid/>
+        <w:ind w:firstLine="709"/>
+        <w:jc w:val="both"/>
+        <w:textAlignment w:val="auto"/>
+        <w:rPr>
+          <w:rFonts w:hint="default"/>
+          <w:lang w:val="en-US"/>
+        </w:rPr>
+      </w:pPr>
+    </w:p>
+    <w:p>
+      <w:pPr>
+        <w:keepNext w:val="0"/>
+        <w:keepLines w:val="0"/>
+        <w:pageBreakBefore w:val="0"/>
+        <w:widowControl/>
+        <w:kinsoku/>
+        <w:wordWrap/>
+        <w:overflowPunct/>
+        <w:topLinePunct w:val="0"/>
+        <w:autoSpaceDE/>
+        <w:autoSpaceDN/>
+        <w:bidi w:val="0"/>
+        <w:adjustRightInd/>
+        <w:snapToGrid/>
+        <w:ind w:firstLine="709"/>
+        <w:jc w:val="both"/>
+        <w:textAlignment w:val="auto"/>
+        <w:rPr>
+          <w:rFonts w:hint="default"/>
+          <w:lang w:val="en-US"/>
+        </w:rPr>
+      </w:pPr>
+      <w:r>
+        <w:rPr>
+          <w:rFonts w:hint="default"/>
+          <w:lang w:val="en-US"/>
+        </w:rPr>
+        <w:t>Справочные таблицы базы данных предназначены для хранения устойчивых классификаторов и статусов, используемых в различных частях системы. К ним относятся employee_role, skill, shift_type, shift_status, swap_request_status, reservation_status, order_status, order_item_status, payment_method, stock_operation_type и measurement_unit. Эти таблицы обеспечивают единообразие значений и уменьшают дублирование данных в операционных сущностях.</w:t>
+      </w:r>
+    </w:p>
+    <w:p>
+      <w:pPr>
+        <w:keepNext w:val="0"/>
+        <w:keepLines w:val="0"/>
+        <w:pageBreakBefore w:val="0"/>
+        <w:widowControl/>
+        <w:kinsoku/>
+        <w:wordWrap/>
+        <w:overflowPunct/>
+        <w:topLinePunct w:val="0"/>
+        <w:autoSpaceDE/>
+        <w:autoSpaceDN/>
+        <w:bidi w:val="0"/>
+        <w:adjustRightInd/>
+        <w:snapToGrid/>
+        <w:ind w:firstLine="709"/>
+        <w:jc w:val="both"/>
+        <w:textAlignment w:val="auto"/>
+        <w:rPr>
+          <w:rFonts w:hint="default"/>
+          <w:lang w:val="en-US"/>
+        </w:rPr>
+      </w:pPr>
+    </w:p>
+    <w:p>
+      <w:pPr>
+        <w:keepNext w:val="0"/>
+        <w:keepLines w:val="0"/>
+        <w:pageBreakBefore w:val="0"/>
+        <w:widowControl/>
+        <w:kinsoku/>
+        <w:wordWrap/>
+        <w:overflowPunct/>
+        <w:topLinePunct w:val="0"/>
+        <w:autoSpaceDE/>
+        <w:autoSpaceDN/>
+        <w:bidi w:val="0"/>
+        <w:adjustRightInd/>
+        <w:snapToGrid/>
+        <w:ind w:firstLine="709"/>
+        <w:jc w:val="both"/>
+        <w:textAlignment w:val="auto"/>
+        <w:rPr>
+          <w:rFonts w:hint="default"/>
+          <w:lang w:val="en-US"/>
+        </w:rPr>
+      </w:pPr>
+      <w:r>
+        <w:rPr>
+          <w:rFonts w:hint="default"/>
+          <w:lang w:val="en-US"/>
+        </w:rPr>
+        <w:t>Блок персонала и доступа включает таблицы employee, app_user, employee_skill и employee_shift_preference. Таблица employee хранит сведения о сотрудниках, app_user содержит учетные записи пользователей системы, employee_skill фиксирует навыки сотрудников, а employee_shift_preference отражает предпочтения сотрудников по типам смен. Совокупно эти таблицы обеспечивают основу для управления персоналом и дальнейшего планирования работы.</w:t>
+      </w:r>
+    </w:p>
+    <w:p>
+      <w:pPr>
+        <w:keepNext w:val="0"/>
+        <w:keepLines w:val="0"/>
+        <w:pageBreakBefore w:val="0"/>
+        <w:widowControl/>
+        <w:kinsoku/>
+        <w:wordWrap/>
+        <w:overflowPunct/>
+        <w:topLinePunct w:val="0"/>
+        <w:autoSpaceDE/>
+        <w:autoSpaceDN/>
+        <w:bidi w:val="0"/>
+        <w:adjustRightInd/>
+        <w:snapToGrid/>
+        <w:ind w:firstLine="709"/>
+        <w:jc w:val="both"/>
+        <w:textAlignment w:val="auto"/>
+        <w:rPr>
+          <w:rFonts w:hint="default"/>
+          <w:lang w:val="en-US"/>
+        </w:rPr>
+      </w:pPr>
+    </w:p>
+    <w:p>
+      <w:pPr>
+        <w:keepNext w:val="0"/>
+        <w:keepLines w:val="0"/>
+        <w:pageBreakBefore w:val="0"/>
+        <w:widowControl/>
+        <w:kinsoku/>
+        <w:wordWrap/>
+        <w:overflowPunct/>
+        <w:topLinePunct w:val="0"/>
+        <w:autoSpaceDE/>
+        <w:autoSpaceDN/>
+        <w:bidi w:val="0"/>
+        <w:adjustRightInd/>
+        <w:snapToGrid/>
+        <w:ind w:firstLine="709"/>
+        <w:jc w:val="both"/>
+        <w:textAlignment w:val="auto"/>
+        <w:rPr>
+          <w:rFonts w:hint="default"/>
+          <w:lang w:val="en-US"/>
+        </w:rPr>
+      </w:pPr>
+      <w:r>
+        <w:rPr>
+          <w:rFonts w:hint="default"/>
+          <w:lang w:val="en-US"/>
+        </w:rPr>
+        <w:t>Блок зала и обслуживания гостей представлен таблицами restaurant_table, guest, reservation, workload_forecast, staffing_requirement, work_shift, shift_assignment и shift_swap_request. Здесь описываются столики ресторана, сами гости, бронирования, прогноз загрузки, потребность в сотрудниках, рабочие смены, назначения работников на смены и запросы на замену. Данный набор таблиц реализует ключевую для проекта задачу по организации и оптимизации работы персонала.</w:t>
+      </w:r>
+    </w:p>
+    <w:p>
+      <w:pPr>
+        <w:keepNext w:val="0"/>
+        <w:keepLines w:val="0"/>
+        <w:pageBreakBefore w:val="0"/>
+        <w:widowControl/>
+        <w:kinsoku/>
+        <w:wordWrap/>
+        <w:overflowPunct/>
+        <w:topLinePunct w:val="0"/>
+        <w:autoSpaceDE/>
+        <w:autoSpaceDN/>
+        <w:bidi w:val="0"/>
+        <w:adjustRightInd/>
+        <w:snapToGrid/>
+        <w:ind w:firstLine="709"/>
+        <w:jc w:val="both"/>
+        <w:textAlignment w:val="auto"/>
+        <w:rPr>
+          <w:rFonts w:hint="default"/>
+          <w:lang w:val="en-US"/>
+        </w:rPr>
+      </w:pPr>
+    </w:p>
+    <w:p>
+      <w:pPr>
+        <w:keepNext w:val="0"/>
+        <w:keepLines w:val="0"/>
+        <w:pageBreakBefore w:val="0"/>
+        <w:widowControl/>
+        <w:kinsoku/>
+        <w:wordWrap/>
+        <w:overflowPunct/>
+        <w:topLinePunct w:val="0"/>
+        <w:autoSpaceDE/>
+        <w:autoSpaceDN/>
+        <w:bidi w:val="0"/>
+        <w:adjustRightInd/>
+        <w:snapToGrid/>
+        <w:ind w:firstLine="709"/>
+        <w:jc w:val="both"/>
+        <w:textAlignment w:val="auto"/>
+        <w:rPr>
+          <w:rFonts w:hint="default"/>
+          <w:lang w:val="en-US"/>
+        </w:rPr>
+      </w:pPr>
+      <w:r>
+        <w:rPr>
+          <w:rFonts w:hint="default"/>
+          <w:lang w:val="en-US"/>
+        </w:rPr>
+        <w:t>Блок меню и производственного учета включает таблицы menu_category, dish, modifier_group, dish_modifier_group, modifier_option, ingredient и recipe_item. Таблица menu_category задает категории меню, dish хранит перечень блюд, modifier_group и modifier_option описывают возможные модификации заказа, а recipe_item связывает блюда с ингредиентами и нормами их расхода. Благодаря этому в системе поддерживается не только продажа блюд, но и учет их состава.</w:t>
+      </w:r>
+    </w:p>
+    <w:p>
+      <w:pPr>
+        <w:keepNext w:val="0"/>
+        <w:keepLines w:val="0"/>
+        <w:pageBreakBefore w:val="0"/>
+        <w:widowControl/>
+        <w:kinsoku/>
+        <w:wordWrap/>
+        <w:overflowPunct/>
+        <w:topLinePunct w:val="0"/>
+        <w:autoSpaceDE/>
+        <w:autoSpaceDN/>
+        <w:bidi w:val="0"/>
+        <w:adjustRightInd/>
+        <w:snapToGrid/>
+        <w:ind w:firstLine="709"/>
+        <w:jc w:val="both"/>
+        <w:textAlignment w:val="auto"/>
+        <w:rPr>
+          <w:rFonts w:hint="default"/>
+          <w:lang w:val="en-US"/>
+        </w:rPr>
+      </w:pPr>
+    </w:p>
+    <w:p>
+      <w:pPr>
+        <w:keepNext w:val="0"/>
+        <w:keepLines w:val="0"/>
+        <w:pageBreakBefore w:val="0"/>
+        <w:widowControl/>
+        <w:kinsoku/>
+        <w:wordWrap/>
+        <w:overflowPunct/>
+        <w:topLinePunct w:val="0"/>
+        <w:autoSpaceDE/>
+        <w:autoSpaceDN/>
+        <w:bidi w:val="0"/>
+        <w:adjustRightInd/>
+        <w:snapToGrid/>
+        <w:ind w:firstLine="709"/>
+        <w:jc w:val="both"/>
+        <w:textAlignment w:val="auto"/>
+        <w:rPr>
+          <w:rFonts w:hint="default"/>
+          <w:lang w:val="en-US"/>
+        </w:rPr>
+      </w:pPr>
+      <w:r>
+        <w:rPr>
+          <w:rFonts w:hint="default"/>
+          <w:lang w:val="en-US"/>
+        </w:rPr>
+        <w:t>Блок заказов и складского движения образуют таблицы customer_order, order_item, order_item_modifier и inventory_operation. Таблица customer_order хранит общие сведения о заказе, order_item фиксирует отдельные позиции внутри заказа, order_item_modifier отражает выбранные модификаторы, а inventory_operation регистрирует движения ингредиентов на складе. Именно эти таблицы обеспечивают взаимосвязь между обслуживанием гостей, реализацией блюд и учетом остатков сырья.</w:t>
+      </w:r>
+    </w:p>
+    <w:p>
+      <w:pPr>
+        <w:keepNext w:val="0"/>
+        <w:keepLines w:val="0"/>
+        <w:pageBreakBefore w:val="0"/>
+        <w:widowControl/>
+        <w:kinsoku/>
+        <w:wordWrap/>
+        <w:overflowPunct/>
+        <w:topLinePunct w:val="0"/>
+        <w:autoSpaceDE/>
+        <w:autoSpaceDN/>
+        <w:bidi w:val="0"/>
+        <w:adjustRightInd/>
+        <w:snapToGrid/>
+        <w:ind w:firstLine="709"/>
+        <w:jc w:val="both"/>
+        <w:textAlignment w:val="auto"/>
+        <w:rPr>
+          <w:rFonts w:hint="default"/>
+          <w:lang w:val="en-US"/>
+        </w:rPr>
+      </w:pPr>
+    </w:p>
+    <w:p>
+      <w:pPr>
+        <w:keepNext w:val="0"/>
+        <w:keepLines w:val="0"/>
+        <w:pageBreakBefore w:val="0"/>
+        <w:widowControl/>
+        <w:kinsoku/>
+        <w:wordWrap/>
+        <w:overflowPunct/>
+        <w:topLinePunct w:val="0"/>
+        <w:autoSpaceDE/>
+        <w:autoSpaceDN/>
+        <w:bidi w:val="0"/>
+        <w:adjustRightInd/>
+        <w:snapToGrid/>
+        <w:ind w:firstLine="709"/>
+        <w:jc w:val="both"/>
+        <w:textAlignment w:val="auto"/>
+        <w:rPr>
+          <w:rFonts w:hint="default"/>
+          <w:lang w:val="en-US"/>
+        </w:rPr>
+      </w:pPr>
+      <w:r>
+        <w:rPr>
+          <w:rFonts w:hint="default"/>
+          <w:lang w:val="en-US"/>
+        </w:rPr>
+        <w:t>Таким образом, словарь данных показывает, что каждая таблица в базе данных ГастроСофт выполняет четко определенную функцию, а вся схема в целом образует единую взаимосвязанную структуру, пригодную как для повседневной работы ресторана, так и для последующего анализа и оптимизации его деятельности.</w:t>
+      </w:r>
     </w:p>
     <w:sectPr>
       <w:footerReference r:id="rId7" w:type="default"/>
@@ -6975,7 +8291,7 @@
     <w:lsdException w:qFormat="1" w:unhideWhenUsed="0" w:uiPriority="0" w:semiHidden="0" w:name="Title"/>
     <w:lsdException w:unhideWhenUsed="0" w:uiPriority="0" w:semiHidden="0" w:name="Closing"/>
     <w:lsdException w:unhideWhenUsed="0" w:uiPriority="0" w:semiHidden="0" w:name="Signature"/>
-    <w:lsdException w:unhideWhenUsed="0" w:uiPriority="0" w:name="Default Paragraph Font"/>
+    <w:lsdException w:qFormat="1" w:unhideWhenUsed="0" w:uiPriority="0" w:name="Default Paragraph Font"/>
     <w:lsdException w:unhideWhenUsed="0" w:uiPriority="0" w:semiHidden="0" w:name="Body Text"/>
     <w:lsdException w:unhideWhenUsed="0" w:uiPriority="0" w:semiHidden="0" w:name="Body Text Indent"/>
     <w:lsdException w:unhideWhenUsed="0" w:uiPriority="0" w:semiHidden="0" w:name="List Continue"/>
@@ -7013,7 +8329,7 @@
     <w:lsdException w:unhideWhenUsed="0" w:uiPriority="0" w:semiHidden="0" w:name="HTML Sample"/>
     <w:lsdException w:unhideWhenUsed="0" w:uiPriority="0" w:semiHidden="0" w:name="HTML Typewriter"/>
     <w:lsdException w:unhideWhenUsed="0" w:uiPriority="0" w:semiHidden="0" w:name="HTML Variable"/>
-    <w:lsdException w:unhideWhenUsed="0" w:uiPriority="0" w:name="Normal Table"/>
+    <w:lsdException w:qFormat="1" w:unhideWhenUsed="0" w:uiPriority="0" w:name="Normal Table"/>
     <w:lsdException w:unhideWhenUsed="0" w:uiPriority="0" w:semiHidden="0" w:name="annotation subject"/>
     <w:lsdException w:unhideWhenUsed="0" w:uiPriority="0" w:semiHidden="0" w:name="Table Simple 1"/>
     <w:lsdException w:unhideWhenUsed="0" w:uiPriority="0" w:semiHidden="0" w:name="Table Simple 2"/>
@@ -7126,11 +8442,13 @@
   <w:style w:type="character" w:default="1" w:styleId="4">
     <w:name w:val="Default Paragraph Font"/>
     <w:semiHidden/>
+    <w:qFormat/>
     <w:uiPriority w:val="0"/>
   </w:style>
   <w:style w:type="table" w:default="1" w:styleId="5">
     <w:name w:val="Normal Table"/>
     <w:semiHidden/>
+    <w:qFormat/>
     <w:uiPriority w:val="0"/>
     <w:tblPr>
       <w:tblCellMar>

</xml_diff>

<commit_message>
update(docs): describe kitchen module functions
</commit_message>
<xml_diff>
--- a/Курсовая работаБурнаеваИСv2.docx
+++ b/Курсовая работаБурнаеваИСv2.docx
@@ -2968,7 +2968,7 @@
                     </pic:cNvPicPr>
                   </pic:nvPicPr>
                   <pic:blipFill>
-                    <a:blip r:embed="rId9"/>
+                    <a:blip r:embed="rId8"/>
                     <a:stretch>
                       <a:fillRect/>
                     </a:stretch>
@@ -3366,7 +3366,7 @@
                     </pic:cNvPicPr>
                   </pic:nvPicPr>
                   <pic:blipFill>
-                    <a:blip r:embed="rId10"/>
+                    <a:blip r:embed="rId9"/>
                     <a:stretch>
                       <a:fillRect/>
                     </a:stretch>
@@ -3771,7 +3771,7 @@
                     </pic:cNvPicPr>
                   </pic:nvPicPr>
                   <pic:blipFill>
-                    <a:blip r:embed="rId11"/>
+                    <a:blip r:embed="rId10"/>
                     <a:stretch>
                       <a:fillRect/>
                     </a:stretch>
@@ -6411,7 +6411,7 @@
                     <pic:cNvPicPr/>
                   </pic:nvPicPr>
                   <pic:blipFill>
-                    <a:blip r:embed="rId12"/>
+                    <a:blip r:embed="rId11"/>
                     <a:stretch>
                       <a:fillRect/>
                     </a:stretch>
@@ -7755,15 +7755,4137 @@
         </w:rPr>
         <w:t>Блок заказов и складского движения образуют таблицы customer_order, order_item, order_item_modifier и inventory_operation. Таблица customer_order хранит общие сведения о заказе, order_item фиксирует отдельные позиции внутри заказа, order_item_modifier отражает выбранные модификаторы, а inventory_operation регистрирует движения ингредиентов на складе. Именно эти таблицы обеспечивают взаимосвязь между обслуживанием гостей, реализацией блюд и учетом остатков сырья.</w:t>
       </w:r>
+    </w:p>
+    <w:p>
+      <w:pPr>
+        <w:pStyle w:val="3"/>
+        <w:bidi w:val="0"/>
+        <w:jc w:val="center"/>
+        <w:rPr>
+          <w:sz w:val="28"/>
+          <w:szCs w:val="28"/>
+        </w:rPr>
+      </w:pPr>
+      <w:r>
+        <w:rPr>
+          <w:sz w:val="28"/>
+          <w:szCs w:val="28"/>
+        </w:rPr>
+        <w:t>2.6 Описание функций кухонного модуля</w:t>
+      </w:r>
+    </w:p>
+    <w:p>
+      <w:r>
+        <w:t>В рамках проектной части выделены шесть функций, которые описывают работу выбранного кухонного модуля GastroSoft. Остальные модули и прототипы в данном разделе не рассматриваются и не изменяются; они упоминаются только как внешние источники данных или точки интеграции.</w:t>
+      </w:r>
+    </w:p>
+    <w:p>
+      <w:r>
+        <w:t>Для каждой функции приведены входные и выходные данные, словесное описание алгоритма, блок-схема по ГОСТ 19.701-90, а также описание работы функции в интерфейсе приложения.</w:t>
+      </w:r>
+    </w:p>
+    <w:p>
+      <w:pPr>
+        <w:pStyle w:val="3"/>
+        <w:jc w:val="center"/>
+        <w:rPr>
+          <w:sz w:val="28"/>
+          <w:szCs w:val="28"/>
+        </w:rPr>
+      </w:pPr>
+      <w:r>
+        <w:rPr>
+          <w:sz w:val="28"/>
+          <w:szCs w:val="28"/>
+        </w:rPr>
+        <w:t>2.6.1 Включение кухонного режима страницы заказов</w:t>
+      </w:r>
+    </w:p>
+    <w:p>
+      <w:r>
+        <w:rPr>
+          <w:b/>
+        </w:rPr>
+        <w:t xml:space="preserve">Функция в коде: </w:t>
+      </w:r>
+      <w:r>
+        <w:t>OrdersPage.apply_role_mode</w:t>
+      </w:r>
+    </w:p>
+    <w:p>
+      <w:r>
+        <w:rPr>
+          <w:b/>
+        </w:rPr>
+        <w:t xml:space="preserve">Входные данные: </w:t>
+      </w:r>
+      <w:r>
+        <w:t>текущая роль пользователя, права роли, виджеты страницы заказов.</w:t>
+      </w:r>
+    </w:p>
+    <w:p>
+      <w:r>
+        <w:rPr>
+          <w:b/>
+        </w:rPr>
+        <w:t xml:space="preserve">Выходные данные: </w:t>
+      </w:r>
+      <w:r>
+        <w:t>настроенная видимость блоков меню, текущего заказа, кухонной очереди и кнопок действий.</w:t>
+      </w:r>
+    </w:p>
+    <w:p>
+      <w:r>
+        <w:rPr>
+          <w:b/>
+        </w:rPr>
+        <w:t xml:space="preserve">Описание алгоритма: </w:t>
+      </w:r>
+    </w:p>
+    <w:p>
+      <w:pPr>
+        <w:numPr>
+          <w:numId w:val="0"/>
+        </w:numPr>
+        <w:ind w:leftChars="0"/>
+      </w:pPr>
+      <w:r>
+        <w:t>Получить текущую роль пользователя.</w:t>
+      </w:r>
+    </w:p>
+    <w:p>
+      <w:pPr>
+        <w:numPr>
+          <w:numId w:val="0"/>
+        </w:numPr>
+        <w:ind w:leftChars="0"/>
+      </w:pPr>
+      <w:r>
+        <w:t>Определить, может ли роль оформлять заказы, работать с кухней или закрывать заказы.</w:t>
+      </w:r>
+    </w:p>
+    <w:p>
+      <w:pPr>
+        <w:numPr>
+          <w:numId w:val="0"/>
+        </w:numPr>
+        <w:ind w:leftChars="0"/>
+      </w:pPr>
+      <w:r>
+        <w:t>Рассчитать, нужно ли показывать список заказов.</w:t>
+      </w:r>
+    </w:p>
+    <w:p>
+      <w:pPr>
+        <w:numPr>
+          <w:numId w:val="0"/>
+        </w:numPr>
+        <w:ind w:leftChars="0"/>
+      </w:pPr>
+      <w:r>
+        <w:t>Настроить видимость карточек меню, черновика заказа и кухонной очереди.</w:t>
+      </w:r>
+    </w:p>
+    <w:p>
+      <w:pPr>
+        <w:numPr>
+          <w:numId w:val="0"/>
+        </w:numPr>
+        <w:ind w:leftChars="0"/>
+      </w:pPr>
+      <w:r>
+        <w:t>Если роль относится к кухне, установить заголовок «Кухонная очередь» и начальный текст кнопки «Взять в работу».</w:t>
+      </w:r>
+    </w:p>
+    <w:p>
+      <w:pPr>
+        <w:numPr>
+          <w:numId w:val="0"/>
+        </w:numPr>
+        <w:ind w:leftChars="0"/>
+      </w:pPr>
+      <w:r>
+        <w:t>Если роль относится к кассе, показать экран заказов к оплате; иначе оставить режим просмотра очереди.</w:t>
+      </w:r>
+    </w:p>
+    <w:p>
+      <w:pPr>
+        <w:jc w:val="left"/>
+      </w:pPr>
+      <w:r>
+        <w:rPr>
+          <w:b/>
+        </w:rPr>
+        <w:t>Алгоритм (блок-схема по ГОСТу):</w:t>
+      </w:r>
+    </w:p>
+    <w:p>
+      <w:pPr>
+        <w:jc w:val="center"/>
+      </w:pPr>
+      <w:r>
+        <w:drawing>
+          <wp:inline distT="0" distB="0" distL="114300" distR="114300">
+            <wp:extent cx="5349240" cy="4392930"/>
+            <wp:effectExtent l="0" t="0" r="3810" b="7620"/>
+            <wp:docPr id="6" name="Picture 6"/>
+            <wp:cNvGraphicFramePr>
+              <a:graphicFrameLocks xmlns:a="http://schemas.openxmlformats.org/drawingml/2006/main" noChangeAspect="1"/>
+            </wp:cNvGraphicFramePr>
+            <a:graphic xmlns:a="http://schemas.openxmlformats.org/drawingml/2006/main">
+              <a:graphicData uri="http://schemas.openxmlformats.org/drawingml/2006/picture">
+                <pic:pic xmlns:pic="http://schemas.openxmlformats.org/drawingml/2006/picture">
+                  <pic:nvPicPr>
+                    <pic:cNvPr id="6" name="Picture 6"/>
+                    <pic:cNvPicPr>
+                      <a:picLocks noChangeAspect="1"/>
+                    </pic:cNvPicPr>
+                  </pic:nvPicPr>
+                  <pic:blipFill>
+                    <a:blip r:embed="rId12"/>
+                    <a:stretch>
+                      <a:fillRect/>
+                    </a:stretch>
+                  </pic:blipFill>
+                  <pic:spPr>
+                    <a:xfrm>
+                      <a:off x="0" y="0"/>
+                      <a:ext cx="5349240" cy="4393063"/>
+                    </a:xfrm>
+                    <a:prstGeom prst="rect">
+                      <a:avLst/>
+                    </a:prstGeom>
+                  </pic:spPr>
+                </pic:pic>
+              </a:graphicData>
+            </a:graphic>
+          </wp:inline>
+        </w:drawing>
+      </w:r>
+    </w:p>
+    <w:p>
+      <w:pPr>
+        <w:jc w:val="center"/>
+      </w:pPr>
+      <w:r>
+        <w:rPr>
+          <w:i/>
+        </w:rPr>
+        <w:t>Рисунок 2.6.1 - Блок-схема функции «Включение кухонного режима страницы заказов»</w:t>
+      </w:r>
+    </w:p>
+    <w:p>
+      <w:r>
+        <w:rPr>
+          <w:b/>
+        </w:rPr>
+        <w:t xml:space="preserve">Работа функции и интерфейс: </w:t>
+      </w:r>
+      <w:r>
+        <w:t>Функция вызывается при обновлении страницы заказов и адаптирует один экран под разные роли. Для повара и шеф-повара остаётся только рабочая область кухни: таблица заказов, фильтр, счётчики и кнопка изменения статуса. Остальные элементы оформления заказа скрываются, поэтому пользователь не видит лишних сценариев.</w:t>
+      </w:r>
+    </w:p>
+    <w:p>
+      <w:r>
+        <w:rPr>
+          <w:b/>
+        </w:rPr>
+        <w:t xml:space="preserve">Код в приложении: </w:t>
+      </w:r>
+      <w:r>
+        <w:t>листинг функции приведён в приложении А, пункт А.1.</w:t>
+      </w:r>
+    </w:p>
+    <w:p>
+      <w:pPr>
+        <w:pStyle w:val="3"/>
+        <w:jc w:val="center"/>
+        <w:rPr>
+          <w:sz w:val="28"/>
+          <w:szCs w:val="28"/>
+        </w:rPr>
+      </w:pPr>
+      <w:r>
+        <w:rPr>
+          <w:sz w:val="28"/>
+          <w:szCs w:val="28"/>
+        </w:rPr>
+        <w:t>2.6.2 Фильтрация заказов кухонной очереди</w:t>
+      </w:r>
+    </w:p>
+    <w:p>
+      <w:r>
+        <w:rPr>
+          <w:b/>
+        </w:rPr>
+        <w:t xml:space="preserve">Функция в коде: </w:t>
+      </w:r>
+      <w:r>
+        <w:t>OrdersPage._filtered_queue_indices</w:t>
+      </w:r>
+    </w:p>
+    <w:p>
+      <w:r>
+        <w:rPr>
+          <w:b/>
+        </w:rPr>
+        <w:t xml:space="preserve">Входные данные: </w:t>
+      </w:r>
+      <w:r>
+        <w:t>общая очередь `store.kitchen_queue`, выбранный фильтр статуса и роль пользователя.</w:t>
+      </w:r>
+    </w:p>
+    <w:p>
+      <w:r>
+        <w:rPr>
+          <w:b/>
+        </w:rPr>
+        <w:t xml:space="preserve">Выходные данные: </w:t>
+      </w:r>
+      <w:r>
+        <w:t>список индексов заказов, которые должны отображаться в таблице.</w:t>
+      </w:r>
+    </w:p>
+    <w:p>
+      <w:r>
+        <w:rPr>
+          <w:b/>
+        </w:rPr>
+        <w:t xml:space="preserve">Описание алгоритма: </w:t>
+      </w:r>
+    </w:p>
+    <w:p>
+      <w:pPr>
+        <w:numPr>
+          <w:numId w:val="0"/>
+        </w:numPr>
+        <w:ind w:leftChars="0"/>
+      </w:pPr>
+      <w:r>
+        <w:t>Получить выбранное значение фильтра статуса.</w:t>
+      </w:r>
+    </w:p>
+    <w:p>
+      <w:pPr>
+        <w:numPr>
+          <w:numId w:val="0"/>
+        </w:numPr>
+        <w:ind w:leftChars="0"/>
+      </w:pPr>
+      <w:r>
+        <w:t>Создать пустой список индексов.</w:t>
+      </w:r>
+    </w:p>
+    <w:p>
+      <w:pPr>
+        <w:numPr>
+          <w:numId w:val="0"/>
+        </w:numPr>
+        <w:ind w:leftChars="0"/>
+      </w:pPr>
+      <w:r>
+        <w:t>Последовательно перебрать все заказы из кухонной очереди.</w:t>
+      </w:r>
+    </w:p>
+    <w:p>
+      <w:pPr>
+        <w:numPr>
+          <w:numId w:val="0"/>
+        </w:numPr>
+        <w:ind w:leftChars="0"/>
+      </w:pPr>
+      <w:r>
+        <w:t>Для кухонной роли исключить заказы, статус которых не входит в активные кухонные статусы.</w:t>
+      </w:r>
+    </w:p>
+    <w:p>
+      <w:pPr>
+        <w:numPr>
+          <w:numId w:val="0"/>
+        </w:numPr>
+        <w:ind w:leftChars="0"/>
+      </w:pPr>
+      <w:r>
+        <w:t>Если выбран конкретный фильтр, оставить только заказы с совпадающим статусом.</w:t>
+      </w:r>
+    </w:p>
+    <w:p>
+      <w:pPr>
+        <w:numPr>
+          <w:numId w:val="0"/>
+        </w:numPr>
+        <w:ind w:leftChars="0"/>
+      </w:pPr>
+      <w:r>
+        <w:t>Для кассира оставить только заказы в статусах, доступных к выдаче или закрытию.</w:t>
+      </w:r>
+    </w:p>
+    <w:p>
+      <w:pPr>
+        <w:numPr>
+          <w:numId w:val="0"/>
+        </w:numPr>
+        <w:ind w:leftChars="0"/>
+      </w:pPr>
+      <w:r>
+        <w:t>Добавить подходящий индекс в результирующий список и вернуть его.</w:t>
+      </w:r>
+    </w:p>
+    <w:p>
+      <w:pPr>
+        <w:rPr>
+          <w:b/>
+        </w:rPr>
+      </w:pPr>
+    </w:p>
+    <w:p>
+      <w:pPr>
+        <w:rPr>
+          <w:b/>
+        </w:rPr>
+      </w:pPr>
+    </w:p>
+    <w:p>
+      <w:pPr>
+        <w:rPr>
+          <w:b/>
+        </w:rPr>
+      </w:pPr>
+    </w:p>
+    <w:p>
+      <w:pPr>
+        <w:rPr>
+          <w:b/>
+        </w:rPr>
+      </w:pPr>
+    </w:p>
+    <w:p>
+      <w:pPr>
+        <w:rPr>
+          <w:b/>
+        </w:rPr>
+      </w:pPr>
+    </w:p>
+    <w:p>
+      <w:pPr>
+        <w:rPr>
+          <w:b/>
+        </w:rPr>
+      </w:pPr>
+    </w:p>
+    <w:p>
+      <w:pPr>
+        <w:rPr>
+          <w:b/>
+        </w:rPr>
+      </w:pPr>
+    </w:p>
+    <w:p>
+      <w:pPr>
+        <w:rPr>
+          <w:b/>
+        </w:rPr>
+      </w:pPr>
+    </w:p>
+    <w:p>
+      <w:pPr>
+        <w:rPr>
+          <w:b/>
+        </w:rPr>
+      </w:pPr>
+    </w:p>
+    <w:p>
+      <w:pPr>
+        <w:rPr>
+          <w:b/>
+        </w:rPr>
+      </w:pPr>
+    </w:p>
+    <w:p>
+      <w:pPr>
+        <w:rPr>
+          <w:b/>
+        </w:rPr>
+      </w:pPr>
+    </w:p>
+    <w:p>
+      <w:pPr>
+        <w:rPr>
+          <w:b/>
+        </w:rPr>
+      </w:pPr>
+    </w:p>
+    <w:p>
+      <w:pPr>
+        <w:rPr>
+          <w:b/>
+        </w:rPr>
+      </w:pPr>
+    </w:p>
+    <w:p>
+      <w:pPr>
+        <w:rPr>
+          <w:b/>
+        </w:rPr>
+      </w:pPr>
+    </w:p>
+    <w:p>
+      <w:r>
+        <w:rPr>
+          <w:b/>
+        </w:rPr>
+        <w:t xml:space="preserve">Алгоритм (блок-схема по ГОСТу): </w:t>
+      </w:r>
+    </w:p>
+    <w:p>
+      <w:pPr>
+        <w:jc w:val="center"/>
+      </w:pPr>
+      <w:r>
+        <w:drawing>
+          <wp:inline distT="0" distB="0" distL="114300" distR="114300">
+            <wp:extent cx="5349240" cy="5342255"/>
+            <wp:effectExtent l="0" t="0" r="3810" b="10795"/>
+            <wp:docPr id="7" name="Picture 7"/>
+            <wp:cNvGraphicFramePr>
+              <a:graphicFrameLocks xmlns:a="http://schemas.openxmlformats.org/drawingml/2006/main" noChangeAspect="1"/>
+            </wp:cNvGraphicFramePr>
+            <a:graphic xmlns:a="http://schemas.openxmlformats.org/drawingml/2006/main">
+              <a:graphicData uri="http://schemas.openxmlformats.org/drawingml/2006/picture">
+                <pic:pic xmlns:pic="http://schemas.openxmlformats.org/drawingml/2006/picture">
+                  <pic:nvPicPr>
+                    <pic:cNvPr id="7" name="Picture 7"/>
+                    <pic:cNvPicPr>
+                      <a:picLocks noChangeAspect="1"/>
+                    </pic:cNvPicPr>
+                  </pic:nvPicPr>
+                  <pic:blipFill>
+                    <a:blip r:embed="rId13"/>
+                    <a:stretch>
+                      <a:fillRect/>
+                    </a:stretch>
+                  </pic:blipFill>
+                  <pic:spPr>
+                    <a:xfrm>
+                      <a:off x="0" y="0"/>
+                      <a:ext cx="5349240" cy="5342553"/>
+                    </a:xfrm>
+                    <a:prstGeom prst="rect">
+                      <a:avLst/>
+                    </a:prstGeom>
+                  </pic:spPr>
+                </pic:pic>
+              </a:graphicData>
+            </a:graphic>
+          </wp:inline>
+        </w:drawing>
+      </w:r>
+    </w:p>
+    <w:p>
+      <w:pPr>
+        <w:jc w:val="center"/>
+      </w:pPr>
+      <w:r>
+        <w:rPr>
+          <w:i/>
+        </w:rPr>
+        <w:t>Рисунок 2.6.2 - Блок-схема функции «Фильтрация заказов кухонной очереди»</w:t>
+      </w:r>
+    </w:p>
+    <w:p>
+      <w:r>
+        <w:rPr>
+          <w:b/>
+        </w:rPr>
+        <w:t xml:space="preserve">Работа функции и интерфейс: </w:t>
+      </w:r>
+      <w:r>
+        <w:t>Функция связывает выпадающий список фильтра с таблицей заказов. Когда пользователь выбирает «Все активные», «Принят», «Готовится» или «Готов», таблица получает не копии заказов, а индексы нужных записей. Это позволяет сохранить связь между выбранной строкой интерфейса и исходным заказом в хранилище.</w:t>
+      </w:r>
+    </w:p>
+    <w:p>
+      <w:r>
+        <w:rPr>
+          <w:b/>
+        </w:rPr>
+        <w:t xml:space="preserve">Код в приложении: </w:t>
+      </w:r>
+      <w:r>
+        <w:t>листинг функции приведён в приложении А, пункт А.2.</w:t>
+      </w:r>
+    </w:p>
+    <w:p>
+      <w:pPr>
+        <w:pStyle w:val="3"/>
+        <w:jc w:val="center"/>
+        <w:rPr>
+          <w:sz w:val="28"/>
+          <w:szCs w:val="28"/>
+        </w:rPr>
+      </w:pPr>
+      <w:r>
+        <w:rPr>
+          <w:sz w:val="28"/>
+          <w:szCs w:val="28"/>
+        </w:rPr>
+        <w:t>2.6.3 Формирование таблицы кухонной очереди</w:t>
+      </w:r>
+    </w:p>
+    <w:p>
+      <w:r>
+        <w:rPr>
+          <w:b/>
+        </w:rPr>
+        <w:t xml:space="preserve">Функция в коде: </w:t>
+      </w:r>
+      <w:r>
+        <w:t>OrdersPage.populate_kitchen</w:t>
+      </w:r>
+    </w:p>
+    <w:p>
+      <w:r>
+        <w:rPr>
+          <w:b/>
+        </w:rPr>
+        <w:t xml:space="preserve">Входные данные: </w:t>
+      </w:r>
+      <w:r>
+        <w:t>очередь заказов, роль пользователя, отфильтрованные индексы, данные заказа: номер, стол, время, состав и статус.</w:t>
+      </w:r>
+    </w:p>
+    <w:p>
+      <w:r>
+        <w:rPr>
+          <w:b/>
+        </w:rPr>
+        <w:t xml:space="preserve">Выходные данные: </w:t>
+      </w:r>
+      <w:r>
+        <w:t>заполненная таблица кухонной очереди, выделенная первая строка, обновлённые счётчики и состояние кнопок.</w:t>
+      </w:r>
+    </w:p>
+    <w:p>
+      <w:r>
+        <w:rPr>
+          <w:b/>
+        </w:rPr>
+        <w:t xml:space="preserve">Описание алгоритма: </w:t>
+      </w:r>
+    </w:p>
+    <w:p>
+      <w:pPr>
+        <w:numPr>
+          <w:numId w:val="0"/>
+        </w:numPr>
+        <w:ind w:leftChars="0"/>
+      </w:pPr>
+      <w:r>
+        <w:t>Определить роль пользователя и режим отображения страницы.</w:t>
+      </w:r>
+    </w:p>
+    <w:p>
+      <w:pPr>
+        <w:numPr>
+          <w:numId w:val="0"/>
+        </w:numPr>
+        <w:ind w:leftChars="0"/>
+      </w:pPr>
+      <w:r>
+        <w:t>Выбрать набор заголовков таблицы для кухни или общего режима.</w:t>
+      </w:r>
+    </w:p>
+    <w:p>
+      <w:pPr>
+        <w:numPr>
+          <w:numId w:val="0"/>
+        </w:numPr>
+        <w:ind w:leftChars="0"/>
+      </w:pPr>
+      <w:r>
+        <w:t>Получить список индексов заказов после фильтрации.</w:t>
+      </w:r>
+    </w:p>
+    <w:p>
+      <w:pPr>
+        <w:numPr>
+          <w:numId w:val="0"/>
+        </w:numPr>
+        <w:ind w:leftChars="0"/>
+      </w:pPr>
+      <w:r>
+        <w:t>Установить количество строк таблицы по числу видимых заказов.</w:t>
+      </w:r>
+    </w:p>
+    <w:p>
+      <w:pPr>
+        <w:numPr>
+          <w:numId w:val="0"/>
+        </w:numPr>
+        <w:ind w:leftChars="0"/>
+      </w:pPr>
+      <w:r>
+        <w:t>Для каждого видимого заказа заполнить ячейки номером, столом, временем, составом и статусом.</w:t>
+      </w:r>
+    </w:p>
+    <w:p>
+      <w:pPr>
+        <w:numPr>
+          <w:numId w:val="0"/>
+        </w:numPr>
+        <w:ind w:leftChars="0"/>
+      </w:pPr>
+      <w:r>
+        <w:t>Для ячейки статуса выбрать цветовое состояние: предупреждение, информация, успех или нейтральный тон.</w:t>
+      </w:r>
+    </w:p>
+    <w:p>
+      <w:pPr>
+        <w:numPr>
+          <w:numId w:val="0"/>
+        </w:numPr>
+        <w:ind w:leftChars="0"/>
+      </w:pPr>
+      <w:r>
+        <w:t>Если список не пустой, выделить первую строку.</w:t>
+      </w:r>
+    </w:p>
+    <w:p>
+      <w:pPr>
+        <w:numPr>
+          <w:numId w:val="0"/>
+        </w:numPr>
+        <w:ind w:leftChars="0"/>
+      </w:pPr>
+      <w:r>
+        <w:t>Обновить сводные счётчики и доступность кнопки действия.</w:t>
+      </w:r>
+    </w:p>
+    <w:p>
+      <w:r>
+        <w:rPr>
+          <w:b/>
+        </w:rPr>
+        <w:t xml:space="preserve">Алгоритм (блок-схема по ГОСТу): </w:t>
+      </w:r>
+    </w:p>
+    <w:p>
+      <w:pPr>
+        <w:jc w:val="center"/>
+      </w:pPr>
+      <w:r>
+        <w:drawing>
+          <wp:inline distT="0" distB="0" distL="114300" distR="114300">
+            <wp:extent cx="5349240" cy="6291580"/>
+            <wp:effectExtent l="0" t="0" r="3810" b="13970"/>
+            <wp:docPr id="8" name="Picture 8"/>
+            <wp:cNvGraphicFramePr>
+              <a:graphicFrameLocks xmlns:a="http://schemas.openxmlformats.org/drawingml/2006/main" noChangeAspect="1"/>
+            </wp:cNvGraphicFramePr>
+            <a:graphic xmlns:a="http://schemas.openxmlformats.org/drawingml/2006/main">
+              <a:graphicData uri="http://schemas.openxmlformats.org/drawingml/2006/picture">
+                <pic:pic xmlns:pic="http://schemas.openxmlformats.org/drawingml/2006/picture">
+                  <pic:nvPicPr>
+                    <pic:cNvPr id="8" name="Picture 8"/>
+                    <pic:cNvPicPr>
+                      <a:picLocks noChangeAspect="1"/>
+                    </pic:cNvPicPr>
+                  </pic:nvPicPr>
+                  <pic:blipFill>
+                    <a:blip r:embed="rId14"/>
+                    <a:stretch>
+                      <a:fillRect/>
+                    </a:stretch>
+                  </pic:blipFill>
+                  <pic:spPr>
+                    <a:xfrm>
+                      <a:off x="0" y="0"/>
+                      <a:ext cx="5349240" cy="6292044"/>
+                    </a:xfrm>
+                    <a:prstGeom prst="rect">
+                      <a:avLst/>
+                    </a:prstGeom>
+                  </pic:spPr>
+                </pic:pic>
+              </a:graphicData>
+            </a:graphic>
+          </wp:inline>
+        </w:drawing>
+      </w:r>
+    </w:p>
+    <w:p>
+      <w:pPr>
+        <w:jc w:val="center"/>
+      </w:pPr>
+      <w:r>
+        <w:rPr>
+          <w:i/>
+        </w:rPr>
+        <w:t>Рисунок 2.6.3 - Блок-схема функции «Формирование таблицы кухонной очереди»</w:t>
+      </w:r>
+    </w:p>
+    <w:p>
+      <w:r>
+        <w:rPr>
+          <w:b/>
+        </w:rPr>
+        <w:t xml:space="preserve">Работа функции и интерфейс: </w:t>
+      </w:r>
+      <w:r>
+        <w:t>Функция отвечает за основное представление кухни: именно она превращает данные из очереди в строки таблицы. Повар видит читаемый список активных заказов с временем и составом, а цвет статуса помогает быстро отличать новые, готовящиеся и готовые заказы.</w:t>
+      </w:r>
+    </w:p>
+    <w:p>
+      <w:r>
+        <w:rPr>
+          <w:b/>
+        </w:rPr>
+        <w:t xml:space="preserve">Код в приложении: </w:t>
+      </w:r>
+      <w:r>
+        <w:t>листинг функции приведён в приложении А, пункт А.3.</w:t>
+      </w:r>
+    </w:p>
+    <w:p>
+      <w:pPr>
+        <w:pStyle w:val="3"/>
+        <w:jc w:val="center"/>
+        <w:rPr>
+          <w:sz w:val="28"/>
+          <w:szCs w:val="28"/>
+        </w:rPr>
+      </w:pPr>
+      <w:r>
+        <w:rPr>
+          <w:sz w:val="28"/>
+          <w:szCs w:val="28"/>
+        </w:rPr>
+        <w:t>2.6.4 Расчёт сводных счётчиков кухни</w:t>
+      </w:r>
+    </w:p>
+    <w:p>
+      <w:r>
+        <w:rPr>
+          <w:b/>
+        </w:rPr>
+        <w:t xml:space="preserve">Функция в коде: </w:t>
+      </w:r>
+      <w:r>
+        <w:t>OrdersPage.update_kitchen_summary</w:t>
+      </w:r>
+    </w:p>
+    <w:p>
+      <w:r>
+        <w:rPr>
+          <w:b/>
+        </w:rPr>
+        <w:t xml:space="preserve">Входные данные: </w:t>
+      </w:r>
+      <w:r>
+        <w:t>очередь заказов `store.kitchen_queue` и набор активных кухонных статусов.</w:t>
+      </w:r>
+    </w:p>
+    <w:p>
+      <w:r>
+        <w:rPr>
+          <w:b/>
+        </w:rPr>
+        <w:t xml:space="preserve">Выходные данные: </w:t>
+      </w:r>
+      <w:r>
+        <w:t>обновлённые индикаторы количества заказов в состояниях «Принят», «Готовится» и «Готов».</w:t>
+      </w:r>
+    </w:p>
+    <w:p>
+      <w:r>
+        <w:rPr>
+          <w:b/>
+        </w:rPr>
+        <w:t xml:space="preserve">Описание алгоритма: </w:t>
+      </w:r>
+    </w:p>
+    <w:p>
+      <w:pPr>
+        <w:numPr>
+          <w:numId w:val="0"/>
+        </w:numPr>
+        <w:ind w:leftChars="0"/>
+      </w:pPr>
+      <w:r>
+        <w:t>Создать словарь количества заказов по активным кухонным статусам.</w:t>
+      </w:r>
+    </w:p>
+    <w:p>
+      <w:pPr>
+        <w:numPr>
+          <w:numId w:val="0"/>
+        </w:numPr>
+        <w:ind w:leftChars="0"/>
+      </w:pPr>
+      <w:r>
+        <w:t>Для каждого статуса посчитать записи очереди, у которых статус совпадает.</w:t>
+      </w:r>
+    </w:p>
+    <w:p>
+      <w:pPr>
+        <w:numPr>
+          <w:numId w:val="0"/>
+        </w:numPr>
+        <w:ind w:leftChars="0"/>
+      </w:pPr>
+      <w:r>
+        <w:t>Передать количество новых заказов в индикатор «Принято».</w:t>
+      </w:r>
+    </w:p>
+    <w:p>
+      <w:pPr>
+        <w:numPr>
+          <w:numId w:val="0"/>
+        </w:numPr>
+        <w:ind w:leftChars="0"/>
+      </w:pPr>
+      <w:r>
+        <w:t>Передать количество заказов в работе в индикатор «В работе».</w:t>
+      </w:r>
+    </w:p>
+    <w:p>
+      <w:pPr>
+        <w:numPr>
+          <w:numId w:val="0"/>
+        </w:numPr>
+        <w:ind w:leftChars="0"/>
+      </w:pPr>
+      <w:r>
+        <w:t>Передать количество готовых заказов в индикатор «Готово».</w:t>
+      </w:r>
+    </w:p>
+    <w:p>
+      <w:r>
+        <w:rPr>
+          <w:b/>
+        </w:rPr>
+        <w:t xml:space="preserve">Алгоритм (блок-схема по ГОСТу): </w:t>
+      </w:r>
+    </w:p>
+    <w:p>
+      <w:pPr>
+        <w:jc w:val="center"/>
+      </w:pPr>
+      <w:r>
+        <w:drawing>
+          <wp:inline distT="0" distB="0" distL="114300" distR="114300">
+            <wp:extent cx="5349240" cy="4392930"/>
+            <wp:effectExtent l="0" t="0" r="3810" b="7620"/>
+            <wp:docPr id="9" name="Picture 9"/>
+            <wp:cNvGraphicFramePr>
+              <a:graphicFrameLocks xmlns:a="http://schemas.openxmlformats.org/drawingml/2006/main" noChangeAspect="1"/>
+            </wp:cNvGraphicFramePr>
+            <a:graphic xmlns:a="http://schemas.openxmlformats.org/drawingml/2006/main">
+              <a:graphicData uri="http://schemas.openxmlformats.org/drawingml/2006/picture">
+                <pic:pic xmlns:pic="http://schemas.openxmlformats.org/drawingml/2006/picture">
+                  <pic:nvPicPr>
+                    <pic:cNvPr id="9" name="Picture 9"/>
+                    <pic:cNvPicPr>
+                      <a:picLocks noChangeAspect="1"/>
+                    </pic:cNvPicPr>
+                  </pic:nvPicPr>
+                  <pic:blipFill>
+                    <a:blip r:embed="rId15"/>
+                    <a:stretch>
+                      <a:fillRect/>
+                    </a:stretch>
+                  </pic:blipFill>
+                  <pic:spPr>
+                    <a:xfrm>
+                      <a:off x="0" y="0"/>
+                      <a:ext cx="5349240" cy="4393063"/>
+                    </a:xfrm>
+                    <a:prstGeom prst="rect">
+                      <a:avLst/>
+                    </a:prstGeom>
+                  </pic:spPr>
+                </pic:pic>
+              </a:graphicData>
+            </a:graphic>
+          </wp:inline>
+        </w:drawing>
+      </w:r>
+    </w:p>
+    <w:p>
+      <w:pPr>
+        <w:jc w:val="center"/>
+      </w:pPr>
+      <w:r>
+        <w:rPr>
+          <w:i/>
+        </w:rPr>
+        <w:t>Рисунок 2.6.4 - Блок-схема функции «Расчёт сводных счётчиков кухни»</w:t>
+      </w:r>
+    </w:p>
+    <w:p>
+      <w:r>
+        <w:rPr>
+          <w:b/>
+        </w:rPr>
+        <w:t xml:space="preserve">Работа функции и интерфейс: </w:t>
+      </w:r>
+      <w:r>
+        <w:t>Функция обновляет небольшие статусные метки над таблицей. Они дают повару и шеф-повару быстрый обзор загрузки кухни без чтения каждой строки: сколько заказов только поступило, сколько уже готовится и сколько ожидает выдачи.</w:t>
+      </w:r>
+    </w:p>
+    <w:p>
+      <w:r>
+        <w:rPr>
+          <w:b/>
+        </w:rPr>
+        <w:t xml:space="preserve">Код в приложении: </w:t>
+      </w:r>
+      <w:r>
+        <w:t>листинг функции приведён в приложении А, пункт А.4.</w:t>
+      </w:r>
+    </w:p>
+    <w:p>
+      <w:pPr>
+        <w:pStyle w:val="3"/>
+        <w:jc w:val="center"/>
+        <w:rPr>
+          <w:sz w:val="28"/>
+          <w:szCs w:val="28"/>
+        </w:rPr>
+      </w:pPr>
+      <w:r>
+        <w:rPr>
+          <w:sz w:val="28"/>
+          <w:szCs w:val="28"/>
+        </w:rPr>
+        <w:t>2.6.5 Обновление кнопки действия для выбранного заказа</w:t>
+      </w:r>
+    </w:p>
+    <w:p>
+      <w:r>
+        <w:rPr>
+          <w:b/>
+        </w:rPr>
+        <w:t xml:space="preserve">Функция в коде: </w:t>
+      </w:r>
+      <w:r>
+        <w:t>OrdersPage.update_kitchen_actions</w:t>
+      </w:r>
+    </w:p>
+    <w:p>
+      <w:r>
+        <w:rPr>
+          <w:b/>
+        </w:rPr>
+        <w:t xml:space="preserve">Входные данные: </w:t>
+      </w:r>
+      <w:r>
+        <w:t>текущая роль пользователя, выбранная строка таблицы и статус выбранного заказа.</w:t>
+      </w:r>
+    </w:p>
+    <w:p>
+      <w:r>
+        <w:rPr>
+          <w:b/>
+        </w:rPr>
+        <w:t xml:space="preserve">Выходные данные: </w:t>
+      </w:r>
+      <w:r>
+        <w:t>текст и доступность кнопки перехода заказа на следующий этап.</w:t>
+      </w:r>
+    </w:p>
+    <w:p>
+      <w:r>
+        <w:rPr>
+          <w:b/>
+        </w:rPr>
+        <w:t xml:space="preserve">Описание алгоритма: </w:t>
+      </w:r>
+    </w:p>
+    <w:p>
+      <w:pPr>
+        <w:numPr>
+          <w:numId w:val="0"/>
+        </w:numPr>
+        <w:ind w:leftChars="0"/>
+      </w:pPr>
+      <w:r>
+        <w:t>Получить роль пользователя.</w:t>
+      </w:r>
+    </w:p>
+    <w:p>
+      <w:pPr>
+        <w:numPr>
+          <w:numId w:val="0"/>
+        </w:numPr>
+        <w:ind w:leftChars="0"/>
+      </w:pPr>
+      <w:r>
+        <w:t>Если роль не может работать с кухней, отключить кнопку следующего статуса и завершить выполнение.</w:t>
+      </w:r>
+    </w:p>
+    <w:p>
+      <w:pPr>
+        <w:numPr>
+          <w:numId w:val="0"/>
+        </w:numPr>
+        <w:ind w:leftChars="0"/>
+      </w:pPr>
+      <w:r>
+        <w:t>Определить индекс выбранного заказа.</w:t>
+      </w:r>
+    </w:p>
+    <w:p>
+      <w:pPr>
+        <w:numPr>
+          <w:numId w:val="0"/>
+        </w:numPr>
+        <w:ind w:leftChars="0"/>
+      </w:pPr>
+      <w:r>
+        <w:t>Если заказ не выбран, вывести текст «Выбери заказ» и отключить кнопку.</w:t>
+      </w:r>
+    </w:p>
+    <w:p>
+      <w:pPr>
+        <w:numPr>
+          <w:numId w:val="0"/>
+        </w:numPr>
+        <w:ind w:leftChars="0"/>
+      </w:pPr>
+      <w:r>
+        <w:t>Получить текущий статус выбранного заказа.</w:t>
+      </w:r>
+    </w:p>
+    <w:p>
+      <w:pPr>
+        <w:numPr>
+          <w:numId w:val="0"/>
+        </w:numPr>
+        <w:ind w:leftChars="0"/>
+      </w:pPr>
+      <w:r>
+        <w:t>По статусу выбрать текст кнопки и признак доступности действия.</w:t>
+      </w:r>
+    </w:p>
+    <w:p>
+      <w:pPr>
+        <w:numPr>
+          <w:numId w:val="0"/>
+        </w:numPr>
+        <w:ind w:leftChars="0"/>
+      </w:pPr>
+      <w:r>
+        <w:t>Применить выбранный текст и состояние кнопки в интерфейсе.</w:t>
+      </w:r>
+    </w:p>
+    <w:p>
+      <w:pPr>
+        <w:rPr>
+          <w:b/>
+        </w:rPr>
+      </w:pPr>
+    </w:p>
+    <w:p>
+      <w:pPr>
+        <w:rPr>
+          <w:b/>
+        </w:rPr>
+      </w:pPr>
+    </w:p>
+    <w:p>
+      <w:pPr>
+        <w:rPr>
+          <w:b/>
+        </w:rPr>
+      </w:pPr>
+    </w:p>
+    <w:p>
+      <w:pPr>
+        <w:rPr>
+          <w:b/>
+        </w:rPr>
+      </w:pPr>
+    </w:p>
+    <w:p>
+      <w:pPr>
+        <w:rPr>
+          <w:b/>
+        </w:rPr>
+      </w:pPr>
+    </w:p>
+    <w:p>
+      <w:pPr>
+        <w:rPr>
+          <w:b/>
+        </w:rPr>
+      </w:pPr>
+    </w:p>
+    <w:p>
+      <w:r>
+        <w:rPr>
+          <w:b/>
+        </w:rPr>
+        <w:t xml:space="preserve">Алгоритм (блок-схема по ГОСТу): </w:t>
+      </w:r>
+    </w:p>
+    <w:p>
+      <w:pPr>
+        <w:jc w:val="center"/>
+      </w:pPr>
+      <w:r>
+        <w:drawing>
+          <wp:inline distT="0" distB="0" distL="114300" distR="114300">
+            <wp:extent cx="5349240" cy="5342255"/>
+            <wp:effectExtent l="0" t="0" r="3810" b="10795"/>
+            <wp:docPr id="10" name="Picture 10"/>
+            <wp:cNvGraphicFramePr>
+              <a:graphicFrameLocks xmlns:a="http://schemas.openxmlformats.org/drawingml/2006/main" noChangeAspect="1"/>
+            </wp:cNvGraphicFramePr>
+            <a:graphic xmlns:a="http://schemas.openxmlformats.org/drawingml/2006/main">
+              <a:graphicData uri="http://schemas.openxmlformats.org/drawingml/2006/picture">
+                <pic:pic xmlns:pic="http://schemas.openxmlformats.org/drawingml/2006/picture">
+                  <pic:nvPicPr>
+                    <pic:cNvPr id="10" name="Picture 10"/>
+                    <pic:cNvPicPr>
+                      <a:picLocks noChangeAspect="1"/>
+                    </pic:cNvPicPr>
+                  </pic:nvPicPr>
+                  <pic:blipFill>
+                    <a:blip r:embed="rId16"/>
+                    <a:stretch>
+                      <a:fillRect/>
+                    </a:stretch>
+                  </pic:blipFill>
+                  <pic:spPr>
+                    <a:xfrm>
+                      <a:off x="0" y="0"/>
+                      <a:ext cx="5349240" cy="5342553"/>
+                    </a:xfrm>
+                    <a:prstGeom prst="rect">
+                      <a:avLst/>
+                    </a:prstGeom>
+                  </pic:spPr>
+                </pic:pic>
+              </a:graphicData>
+            </a:graphic>
+          </wp:inline>
+        </w:drawing>
+      </w:r>
+    </w:p>
+    <w:p>
+      <w:pPr>
+        <w:jc w:val="center"/>
+      </w:pPr>
+      <w:r>
+        <w:rPr>
+          <w:i/>
+        </w:rPr>
+        <w:t>Рисунок 2.6.5 - Блок-схема функции «Обновление кнопки действия для выбранного заказа»</w:t>
+      </w:r>
+    </w:p>
+    <w:p>
+      <w:r>
+        <w:rPr>
+          <w:b/>
+        </w:rPr>
+        <w:t xml:space="preserve">Работа функции и интерфейс: </w:t>
+      </w:r>
+      <w:r>
+        <w:t>Функция вызывается при выборе строки в таблице. Она не меняет данные заказа, а подготавливает безопасное действие: для статуса «Принят» предлагает взять заказ в работу, для «Готовится» - отметить готовым, а для «Готов» блокирует повторное выполнение.</w:t>
+      </w:r>
+    </w:p>
+    <w:p>
+      <w:r>
+        <w:rPr>
+          <w:b/>
+        </w:rPr>
+        <w:t xml:space="preserve">Код в приложении: </w:t>
+      </w:r>
+      <w:r>
+        <w:t>листинг функции приведён в приложении А, пункт А.5.</w:t>
+      </w:r>
+    </w:p>
+    <w:p>
+      <w:pPr>
+        <w:pStyle w:val="3"/>
+        <w:jc w:val="center"/>
+      </w:pPr>
+      <w:r>
+        <w:rPr>
+          <w:sz w:val="28"/>
+          <w:szCs w:val="28"/>
+        </w:rPr>
+        <w:t>2.6.6 Перевод заказа на следующий кухонный статус</w:t>
+      </w:r>
+    </w:p>
+    <w:p>
+      <w:r>
+        <w:rPr>
+          <w:b/>
+        </w:rPr>
+        <w:t xml:space="preserve">Функция в коде: </w:t>
+      </w:r>
+      <w:r>
+        <w:t>MySQLBackedStore.advance_kitchen_order</w:t>
+      </w:r>
+    </w:p>
+    <w:p>
+      <w:r>
+        <w:rPr>
+          <w:b/>
+        </w:rPr>
+        <w:t xml:space="preserve">Входные данные: </w:t>
+      </w:r>
+      <w:r>
+        <w:t>индекс выбранного заказа в очереди `kitchen_queue`.</w:t>
+      </w:r>
+    </w:p>
+    <w:p>
+      <w:r>
+        <w:rPr>
+          <w:b/>
+        </w:rPr>
+        <w:t xml:space="preserve">Выходные данные: </w:t>
+      </w:r>
+      <w:r>
+        <w:t>текстовое сообщение о результате, обновлённый статус заказа и позиций заказа в базе данных.</w:t>
+      </w:r>
+    </w:p>
+    <w:p>
+      <w:r>
+        <w:rPr>
+          <w:b/>
+        </w:rPr>
+        <w:t xml:space="preserve">Описание алгоритма: </w:t>
+      </w:r>
+    </w:p>
+    <w:p>
+      <w:pPr>
+        <w:numPr>
+          <w:numId w:val="0"/>
+        </w:numPr>
+        <w:ind w:leftChars="0"/>
+      </w:pPr>
+      <w:r>
+        <w:t>Проверить, подключена ли MySQL-база и корректен ли индекс заказа.</w:t>
+      </w:r>
+    </w:p>
+    <w:p>
+      <w:pPr>
+        <w:numPr>
+          <w:numId w:val="0"/>
+        </w:numPr>
+        <w:ind w:leftChars="0"/>
+      </w:pPr>
+      <w:r>
+        <w:t>Получить выбранный заказ из очереди.</w:t>
+      </w:r>
+    </w:p>
+    <w:p>
+      <w:pPr>
+        <w:numPr>
+          <w:numId w:val="0"/>
+        </w:numPr>
+        <w:ind w:leftChars="0"/>
+      </w:pPr>
+      <w:r>
+        <w:t>Определить код текущего статуса заказа.</w:t>
+      </w:r>
+    </w:p>
+    <w:p>
+      <w:pPr>
+        <w:numPr>
+          <w:numId w:val="0"/>
+        </w:numPr>
+        <w:ind w:leftChars="0"/>
+      </w:pPr>
+      <w:r>
+        <w:t>Если заказ уже готов, вернуть сообщение без изменения данных.</w:t>
+      </w:r>
+    </w:p>
+    <w:p>
+      <w:pPr>
+        <w:numPr>
+          <w:numId w:val="0"/>
+        </w:numPr>
+        <w:ind w:leftChars="0"/>
+      </w:pPr>
+      <w:r>
+        <w:t>Если заказ выдан или закрыт, вернуть сообщение без изменения данных.</w:t>
+      </w:r>
+    </w:p>
+    <w:p>
+      <w:pPr>
+        <w:numPr>
+          <w:numId w:val="0"/>
+        </w:numPr>
+        <w:ind w:leftChars="0"/>
+      </w:pPr>
+      <w:r>
+        <w:t>Если заказ готовится, выбрать следующий статус READY; иначе выбрать PREPARING.</w:t>
+      </w:r>
+    </w:p>
+    <w:p>
+      <w:pPr>
+        <w:numPr>
+          <w:numId w:val="0"/>
+        </w:numPr>
+        <w:ind w:leftChars="0"/>
+      </w:pPr>
+      <w:r>
+        <w:t>Передать заказ и новый статус во внутреннюю функцию обновления статуса.</w:t>
+      </w:r>
+    </w:p>
+    <w:p>
+      <w:pPr>
+        <w:numPr>
+          <w:numId w:val="0"/>
+        </w:numPr>
+        <w:ind w:leftChars="0"/>
+      </w:pPr>
+      <w:r>
+        <w:t>Вернуть сообщение о результате операции.</w:t>
+      </w:r>
+    </w:p>
+    <w:p>
+      <w:r>
+        <w:rPr>
+          <w:b/>
+        </w:rPr>
+        <w:t xml:space="preserve">Алгоритм (блок-схема по ГОСТу): </w:t>
+      </w:r>
+    </w:p>
+    <w:p>
+      <w:pPr>
+        <w:jc w:val="center"/>
+      </w:pPr>
+      <w:r>
+        <w:drawing>
+          <wp:inline distT="0" distB="0" distL="114300" distR="114300">
+            <wp:extent cx="5349240" cy="6766560"/>
+            <wp:effectExtent l="0" t="0" r="3810" b="15240"/>
+            <wp:docPr id="11" name="Picture 11"/>
+            <wp:cNvGraphicFramePr>
+              <a:graphicFrameLocks xmlns:a="http://schemas.openxmlformats.org/drawingml/2006/main" noChangeAspect="1"/>
+            </wp:cNvGraphicFramePr>
+            <a:graphic xmlns:a="http://schemas.openxmlformats.org/drawingml/2006/main">
+              <a:graphicData uri="http://schemas.openxmlformats.org/drawingml/2006/picture">
+                <pic:pic xmlns:pic="http://schemas.openxmlformats.org/drawingml/2006/picture">
+                  <pic:nvPicPr>
+                    <pic:cNvPr id="11" name="Picture 11"/>
+                    <pic:cNvPicPr>
+                      <a:picLocks noChangeAspect="1"/>
+                    </pic:cNvPicPr>
+                  </pic:nvPicPr>
+                  <pic:blipFill>
+                    <a:blip r:embed="rId17"/>
+                    <a:stretch>
+                      <a:fillRect/>
+                    </a:stretch>
+                  </pic:blipFill>
+                  <pic:spPr>
+                    <a:xfrm>
+                      <a:off x="0" y="0"/>
+                      <a:ext cx="5349240" cy="6766789"/>
+                    </a:xfrm>
+                    <a:prstGeom prst="rect">
+                      <a:avLst/>
+                    </a:prstGeom>
+                  </pic:spPr>
+                </pic:pic>
+              </a:graphicData>
+            </a:graphic>
+          </wp:inline>
+        </w:drawing>
+      </w:r>
+    </w:p>
+    <w:p>
+      <w:pPr>
+        <w:jc w:val="center"/>
+      </w:pPr>
+      <w:r>
+        <w:rPr>
+          <w:i/>
+        </w:rPr>
+        <w:t>Рисунок 2.6.6 - Блок-схема функции «Перевод заказа на следующий кухонный статус»</w:t>
+      </w:r>
+    </w:p>
+    <w:p>
+      <w:r>
+        <w:rPr>
+          <w:b/>
+        </w:rPr>
+        <w:t xml:space="preserve">Работа функции и интерфейс: </w:t>
+      </w:r>
+      <w:r>
+        <w:t>Функция относится к слою хранения данных, но используется в кухонном сценарии через кнопку на странице заказов. После выбора строки повар нажимает кнопку действия, интерфейс передаёт индекс заказа в хранилище, а хранилище меняет статус в таблицах MySQL и возвращает сообщение для строки состояния приложения.</w:t>
+      </w:r>
+    </w:p>
+    <w:p>
+      <w:r>
+        <w:rPr>
+          <w:b/>
+        </w:rPr>
+        <w:t xml:space="preserve">Код в приложении: </w:t>
+      </w:r>
+      <w:r>
+        <w:t>листинг функции приведён в приложении А, пункт А.6.</w:t>
+      </w:r>
+    </w:p>
+    <w:p>
+      <w:r>
+        <w:br w:type="page"/>
+      </w:r>
+    </w:p>
+    <w:p>
+      <w:pPr>
+        <w:pStyle w:val="2"/>
+      </w:pPr>
+      <w:r>
+        <w:t>ПРИЛОЖЕНИЕ А. Листинги функций кухонного модуля</w:t>
+      </w:r>
+    </w:p>
+    <w:p>
+      <w:r>
+        <w:t>Ниже приведён исходный код выбранных функций. При оформлении финальной версии приложения к пояснительной записке эти листинги можно заменить скриншотами из среды разработки.</w:t>
+      </w:r>
+    </w:p>
+    <w:p>
+      <w:pPr>
+        <w:pStyle w:val="3"/>
+        <w:rPr>
+          <w:rFonts w:hint="default" w:ascii="Times New Roman" w:hAnsi="Times New Roman" w:cs="Times New Roman"/>
+          <w:sz w:val="28"/>
+          <w:szCs w:val="28"/>
+        </w:rPr>
+      </w:pPr>
+      <w:r>
+        <w:rPr>
+          <w:rFonts w:hint="default" w:ascii="Times New Roman" w:hAnsi="Times New Roman" w:cs="Times New Roman"/>
+          <w:sz w:val="28"/>
+          <w:szCs w:val="28"/>
+        </w:rPr>
+        <w:t>А.1 OrdersPage.apply_role_mode</w:t>
+      </w:r>
+    </w:p>
+    <w:p>
+      <w:pPr>
+        <w:rPr>
+          <w:rFonts w:hint="default" w:ascii="Times New Roman" w:hAnsi="Times New Roman" w:cs="Times New Roman"/>
+          <w:sz w:val="28"/>
+          <w:szCs w:val="28"/>
+        </w:rPr>
+      </w:pPr>
+      <w:r>
+        <w:rPr>
+          <w:rFonts w:hint="default" w:ascii="Times New Roman" w:hAnsi="Times New Roman" w:cs="Times New Roman"/>
+          <w:b/>
+          <w:sz w:val="28"/>
+          <w:szCs w:val="28"/>
+        </w:rPr>
+        <w:t xml:space="preserve">Файл: </w:t>
+      </w:r>
+      <w:r>
+        <w:rPr>
+          <w:rFonts w:hint="default" w:ascii="Times New Roman" w:hAnsi="Times New Roman" w:cs="Times New Roman"/>
+          <w:sz w:val="28"/>
+          <w:szCs w:val="28"/>
+        </w:rPr>
+        <w:t>gastrosoft_app/pages/orders_page.p</w:t>
+      </w:r>
       <w:bookmarkStart w:id="1" w:name="_GoBack"/>
       <w:bookmarkEnd w:id="1"/>
+      <w:r>
+        <w:rPr>
+          <w:rFonts w:hint="default" w:ascii="Times New Roman" w:hAnsi="Times New Roman" w:cs="Times New Roman"/>
+          <w:sz w:val="28"/>
+          <w:szCs w:val="28"/>
+        </w:rPr>
+        <w:t>y</w:t>
+      </w:r>
+    </w:p>
+    <w:p>
+      <w:pPr>
+        <w:spacing w:after="0" w:line="240" w:lineRule="auto"/>
+        <w:rPr>
+          <w:rFonts w:hint="default" w:ascii="Times New Roman" w:hAnsi="Times New Roman" w:cs="Times New Roman"/>
+          <w:sz w:val="28"/>
+          <w:szCs w:val="28"/>
+        </w:rPr>
+      </w:pPr>
+      <w:r>
+        <w:rPr>
+          <w:rFonts w:hint="default" w:ascii="Times New Roman" w:hAnsi="Times New Roman" w:eastAsia="Courier New" w:cs="Times New Roman"/>
+          <w:sz w:val="28"/>
+          <w:szCs w:val="28"/>
+        </w:rPr>
+        <w:t>def apply_role_mode(self) -&gt; None:</w:t>
+      </w:r>
+    </w:p>
+    <w:p>
+      <w:pPr>
+        <w:spacing w:after="0" w:line="240" w:lineRule="auto"/>
+        <w:rPr>
+          <w:rFonts w:hint="default" w:ascii="Times New Roman" w:hAnsi="Times New Roman" w:cs="Times New Roman"/>
+          <w:sz w:val="28"/>
+          <w:szCs w:val="28"/>
+        </w:rPr>
+      </w:pPr>
+      <w:r>
+        <w:rPr>
+          <w:rFonts w:hint="default" w:ascii="Times New Roman" w:hAnsi="Times New Roman" w:eastAsia="Courier New" w:cs="Times New Roman"/>
+          <w:sz w:val="28"/>
+          <w:szCs w:val="28"/>
+        </w:rPr>
+        <w:t xml:space="preserve">    role = self._current_role()</w:t>
+      </w:r>
+    </w:p>
+    <w:p>
+      <w:pPr>
+        <w:spacing w:after="0" w:line="240" w:lineRule="auto"/>
+        <w:rPr>
+          <w:rFonts w:hint="default" w:ascii="Times New Roman" w:hAnsi="Times New Roman" w:cs="Times New Roman"/>
+          <w:sz w:val="28"/>
+          <w:szCs w:val="28"/>
+        </w:rPr>
+      </w:pPr>
+      <w:r>
+        <w:rPr>
+          <w:rFonts w:hint="default" w:ascii="Times New Roman" w:hAnsi="Times New Roman" w:eastAsia="Courier New" w:cs="Times New Roman"/>
+          <w:sz w:val="28"/>
+          <w:szCs w:val="28"/>
+        </w:rPr>
+        <w:t xml:space="preserve">    can_create = can_create_orders(role)</w:t>
+      </w:r>
+    </w:p>
+    <w:p>
+      <w:pPr>
+        <w:spacing w:after="0" w:line="240" w:lineRule="auto"/>
+        <w:rPr>
+          <w:rFonts w:hint="default" w:ascii="Times New Roman" w:hAnsi="Times New Roman" w:cs="Times New Roman"/>
+          <w:sz w:val="28"/>
+          <w:szCs w:val="28"/>
+        </w:rPr>
+      </w:pPr>
+      <w:r>
+        <w:rPr>
+          <w:rFonts w:hint="default" w:ascii="Times New Roman" w:hAnsi="Times New Roman" w:eastAsia="Courier New" w:cs="Times New Roman"/>
+          <w:sz w:val="28"/>
+          <w:szCs w:val="28"/>
+        </w:rPr>
+        <w:t xml:space="preserve">    is_kitchen = can_process_kitchen(role)</w:t>
+      </w:r>
+    </w:p>
+    <w:p>
+      <w:pPr>
+        <w:spacing w:after="0" w:line="240" w:lineRule="auto"/>
+        <w:rPr>
+          <w:rFonts w:hint="default" w:ascii="Times New Roman" w:hAnsi="Times New Roman" w:cs="Times New Roman"/>
+          <w:sz w:val="28"/>
+          <w:szCs w:val="28"/>
+        </w:rPr>
+      </w:pPr>
+      <w:r>
+        <w:rPr>
+          <w:rFonts w:hint="default" w:ascii="Times New Roman" w:hAnsi="Times New Roman" w:eastAsia="Courier New" w:cs="Times New Roman"/>
+          <w:sz w:val="28"/>
+          <w:szCs w:val="28"/>
+        </w:rPr>
+        <w:t xml:space="preserve">    can_close = can_close_orders(role)</w:t>
+      </w:r>
+    </w:p>
+    <w:p>
+      <w:pPr>
+        <w:spacing w:after="0" w:line="240" w:lineRule="auto"/>
+        <w:rPr>
+          <w:rFonts w:hint="default" w:ascii="Times New Roman" w:hAnsi="Times New Roman" w:cs="Times New Roman"/>
+          <w:sz w:val="28"/>
+          <w:szCs w:val="28"/>
+        </w:rPr>
+      </w:pPr>
+      <w:r>
+        <w:rPr>
+          <w:rFonts w:hint="default" w:ascii="Times New Roman" w:hAnsi="Times New Roman" w:eastAsia="Courier New" w:cs="Times New Roman"/>
+          <w:sz w:val="28"/>
+          <w:szCs w:val="28"/>
+        </w:rPr>
+        <w:t xml:space="preserve">    show_order_list = is_kitchen or can_close</w:t>
+      </w:r>
+    </w:p>
+    <w:p>
+      <w:pPr>
+        <w:spacing w:after="0" w:line="240" w:lineRule="auto"/>
+        <w:rPr>
+          <w:rFonts w:hint="default" w:ascii="Times New Roman" w:hAnsi="Times New Roman" w:cs="Times New Roman"/>
+          <w:sz w:val="28"/>
+          <w:szCs w:val="28"/>
+        </w:rPr>
+      </w:pPr>
+      <w:r>
+        <w:rPr>
+          <w:rFonts w:hint="default" w:ascii="Times New Roman" w:hAnsi="Times New Roman" w:eastAsia="Courier New" w:cs="Times New Roman"/>
+          <w:sz w:val="28"/>
+          <w:szCs w:val="28"/>
+        </w:rPr>
+        <w:t xml:space="preserve"> </w:t>
+      </w:r>
+    </w:p>
+    <w:p>
+      <w:pPr>
+        <w:spacing w:after="0" w:line="240" w:lineRule="auto"/>
+        <w:rPr>
+          <w:rFonts w:hint="default" w:ascii="Times New Roman" w:hAnsi="Times New Roman" w:cs="Times New Roman"/>
+          <w:sz w:val="28"/>
+          <w:szCs w:val="28"/>
+        </w:rPr>
+      </w:pPr>
+      <w:r>
+        <w:rPr>
+          <w:rFonts w:hint="default" w:ascii="Times New Roman" w:hAnsi="Times New Roman" w:eastAsia="Courier New" w:cs="Times New Roman"/>
+          <w:sz w:val="28"/>
+          <w:szCs w:val="28"/>
+        </w:rPr>
+        <w:t xml:space="preserve">    self.menu_card.setVisible(can_create)</w:t>
+      </w:r>
+    </w:p>
+    <w:p>
+      <w:pPr>
+        <w:spacing w:after="0" w:line="240" w:lineRule="auto"/>
+        <w:rPr>
+          <w:rFonts w:hint="default" w:ascii="Times New Roman" w:hAnsi="Times New Roman" w:cs="Times New Roman"/>
+          <w:sz w:val="28"/>
+          <w:szCs w:val="28"/>
+        </w:rPr>
+      </w:pPr>
+      <w:r>
+        <w:rPr>
+          <w:rFonts w:hint="default" w:ascii="Times New Roman" w:hAnsi="Times New Roman" w:eastAsia="Courier New" w:cs="Times New Roman"/>
+          <w:sz w:val="28"/>
+          <w:szCs w:val="28"/>
+        </w:rPr>
+        <w:t xml:space="preserve">    self.order_card.setVisible(can_create)</w:t>
+      </w:r>
+    </w:p>
+    <w:p>
+      <w:pPr>
+        <w:spacing w:after="0" w:line="240" w:lineRule="auto"/>
+        <w:rPr>
+          <w:rFonts w:hint="default" w:ascii="Times New Roman" w:hAnsi="Times New Roman" w:cs="Times New Roman"/>
+          <w:sz w:val="28"/>
+          <w:szCs w:val="28"/>
+        </w:rPr>
+      </w:pPr>
+      <w:r>
+        <w:rPr>
+          <w:rFonts w:hint="default" w:ascii="Times New Roman" w:hAnsi="Times New Roman" w:eastAsia="Courier New" w:cs="Times New Roman"/>
+          <w:sz w:val="28"/>
+          <w:szCs w:val="28"/>
+        </w:rPr>
+        <w:t xml:space="preserve">    self.kitchen_card.setVisible(show_order_list)</w:t>
+      </w:r>
+    </w:p>
+    <w:p>
+      <w:pPr>
+        <w:spacing w:after="0" w:line="240" w:lineRule="auto"/>
+        <w:rPr>
+          <w:rFonts w:hint="default" w:ascii="Times New Roman" w:hAnsi="Times New Roman" w:cs="Times New Roman"/>
+          <w:sz w:val="28"/>
+          <w:szCs w:val="28"/>
+        </w:rPr>
+      </w:pPr>
+      <w:r>
+        <w:rPr>
+          <w:rFonts w:hint="default" w:ascii="Times New Roman" w:hAnsi="Times New Roman" w:eastAsia="Courier New" w:cs="Times New Roman"/>
+          <w:sz w:val="28"/>
+          <w:szCs w:val="28"/>
+        </w:rPr>
+        <w:t xml:space="preserve">    self.kitchen_controls.setVisible(is_kitchen)</w:t>
+      </w:r>
+    </w:p>
+    <w:p>
+      <w:pPr>
+        <w:spacing w:after="0" w:line="240" w:lineRule="auto"/>
+        <w:rPr>
+          <w:rFonts w:hint="default" w:ascii="Times New Roman" w:hAnsi="Times New Roman" w:cs="Times New Roman"/>
+          <w:sz w:val="28"/>
+          <w:szCs w:val="28"/>
+        </w:rPr>
+      </w:pPr>
+      <w:r>
+        <w:rPr>
+          <w:rFonts w:hint="default" w:ascii="Times New Roman" w:hAnsi="Times New Roman" w:eastAsia="Courier New" w:cs="Times New Roman"/>
+          <w:sz w:val="28"/>
+          <w:szCs w:val="28"/>
+        </w:rPr>
+        <w:t xml:space="preserve">    self.next_status_button.setVisible(is_kitchen)</w:t>
+      </w:r>
+    </w:p>
+    <w:p>
+      <w:pPr>
+        <w:spacing w:after="0" w:line="240" w:lineRule="auto"/>
+        <w:rPr>
+          <w:rFonts w:hint="default" w:ascii="Times New Roman" w:hAnsi="Times New Roman" w:cs="Times New Roman"/>
+          <w:sz w:val="28"/>
+          <w:szCs w:val="28"/>
+        </w:rPr>
+      </w:pPr>
+      <w:r>
+        <w:rPr>
+          <w:rFonts w:hint="default" w:ascii="Times New Roman" w:hAnsi="Times New Roman" w:eastAsia="Courier New" w:cs="Times New Roman"/>
+          <w:sz w:val="28"/>
+          <w:szCs w:val="28"/>
+        </w:rPr>
+        <w:t xml:space="preserve">    self.close_order_button.setVisible(can_close)</w:t>
+      </w:r>
+    </w:p>
+    <w:p>
+      <w:pPr>
+        <w:spacing w:after="0" w:line="240" w:lineRule="auto"/>
+        <w:rPr>
+          <w:rFonts w:hint="default" w:ascii="Times New Roman" w:hAnsi="Times New Roman" w:cs="Times New Roman"/>
+          <w:sz w:val="28"/>
+          <w:szCs w:val="28"/>
+        </w:rPr>
+      </w:pPr>
+      <w:r>
+        <w:rPr>
+          <w:rFonts w:hint="default" w:ascii="Times New Roman" w:hAnsi="Times New Roman" w:eastAsia="Courier New" w:cs="Times New Roman"/>
+          <w:sz w:val="28"/>
+          <w:szCs w:val="28"/>
+        </w:rPr>
+        <w:t xml:space="preserve"> </w:t>
+      </w:r>
+    </w:p>
+    <w:p>
+      <w:pPr>
+        <w:spacing w:after="0" w:line="240" w:lineRule="auto"/>
+        <w:rPr>
+          <w:rFonts w:hint="default" w:ascii="Times New Roman" w:hAnsi="Times New Roman" w:cs="Times New Roman"/>
+          <w:sz w:val="28"/>
+          <w:szCs w:val="28"/>
+        </w:rPr>
+      </w:pPr>
+      <w:r>
+        <w:rPr>
+          <w:rFonts w:hint="default" w:ascii="Times New Roman" w:hAnsi="Times New Roman" w:eastAsia="Courier New" w:cs="Times New Roman"/>
+          <w:sz w:val="28"/>
+          <w:szCs w:val="28"/>
+        </w:rPr>
+        <w:t xml:space="preserve">    if is_kitchen:</w:t>
+      </w:r>
+    </w:p>
+    <w:p>
+      <w:pPr>
+        <w:spacing w:after="0" w:line="240" w:lineRule="auto"/>
+        <w:rPr>
+          <w:rFonts w:hint="default" w:ascii="Times New Roman" w:hAnsi="Times New Roman" w:cs="Times New Roman"/>
+          <w:sz w:val="28"/>
+          <w:szCs w:val="28"/>
+        </w:rPr>
+      </w:pPr>
+      <w:r>
+        <w:rPr>
+          <w:rFonts w:hint="default" w:ascii="Times New Roman" w:hAnsi="Times New Roman" w:eastAsia="Courier New" w:cs="Times New Roman"/>
+          <w:sz w:val="28"/>
+          <w:szCs w:val="28"/>
+        </w:rPr>
+        <w:t xml:space="preserve">        self.kitchen_card.set_header("Кухонная очередь", "Повар и шеф-повар меняют только статусы приготовления.")</w:t>
+      </w:r>
+    </w:p>
+    <w:p>
+      <w:pPr>
+        <w:spacing w:after="0" w:line="240" w:lineRule="auto"/>
+        <w:rPr>
+          <w:rFonts w:hint="default" w:ascii="Times New Roman" w:hAnsi="Times New Roman" w:cs="Times New Roman"/>
+          <w:sz w:val="28"/>
+          <w:szCs w:val="28"/>
+        </w:rPr>
+      </w:pPr>
+      <w:r>
+        <w:rPr>
+          <w:rFonts w:hint="default" w:ascii="Times New Roman" w:hAnsi="Times New Roman" w:eastAsia="Courier New" w:cs="Times New Roman"/>
+          <w:sz w:val="28"/>
+          <w:szCs w:val="28"/>
+        </w:rPr>
+        <w:t xml:space="preserve">        self.next_status_button.setText("Взять в работу")</w:t>
+      </w:r>
+    </w:p>
+    <w:p>
+      <w:pPr>
+        <w:spacing w:after="0" w:line="240" w:lineRule="auto"/>
+        <w:rPr>
+          <w:rFonts w:hint="default" w:ascii="Times New Roman" w:hAnsi="Times New Roman" w:cs="Times New Roman"/>
+          <w:sz w:val="28"/>
+          <w:szCs w:val="28"/>
+        </w:rPr>
+      </w:pPr>
+      <w:r>
+        <w:rPr>
+          <w:rFonts w:hint="default" w:ascii="Times New Roman" w:hAnsi="Times New Roman" w:eastAsia="Courier New" w:cs="Times New Roman"/>
+          <w:sz w:val="28"/>
+          <w:szCs w:val="28"/>
+        </w:rPr>
+        <w:t xml:space="preserve">    elif can_close:</w:t>
+      </w:r>
+    </w:p>
+    <w:p>
+      <w:pPr>
+        <w:spacing w:after="0" w:line="240" w:lineRule="auto"/>
+        <w:rPr>
+          <w:rFonts w:hint="default" w:ascii="Times New Roman" w:hAnsi="Times New Roman" w:cs="Times New Roman"/>
+          <w:sz w:val="28"/>
+          <w:szCs w:val="28"/>
+        </w:rPr>
+      </w:pPr>
+      <w:r>
+        <w:rPr>
+          <w:rFonts w:hint="default" w:ascii="Times New Roman" w:hAnsi="Times New Roman" w:eastAsia="Courier New" w:cs="Times New Roman"/>
+          <w:sz w:val="28"/>
+          <w:szCs w:val="28"/>
+        </w:rPr>
+        <w:t xml:space="preserve">        self.kitchen_card.set_header("Заказы к оплате", "Кассир закрывает готовые и выданные заказы.")</w:t>
+      </w:r>
+    </w:p>
+    <w:p>
+      <w:pPr>
+        <w:spacing w:after="0" w:line="240" w:lineRule="auto"/>
+        <w:rPr>
+          <w:rFonts w:hint="default" w:ascii="Times New Roman" w:hAnsi="Times New Roman" w:cs="Times New Roman"/>
+          <w:sz w:val="28"/>
+          <w:szCs w:val="28"/>
+        </w:rPr>
+      </w:pPr>
+      <w:r>
+        <w:rPr>
+          <w:rFonts w:hint="default" w:ascii="Times New Roman" w:hAnsi="Times New Roman" w:eastAsia="Courier New" w:cs="Times New Roman"/>
+          <w:sz w:val="28"/>
+          <w:szCs w:val="28"/>
+        </w:rPr>
+        <w:t xml:space="preserve">    else:</w:t>
+      </w:r>
+    </w:p>
+    <w:p>
+      <w:pPr>
+        <w:spacing w:after="0" w:line="240" w:lineRule="auto"/>
+        <w:rPr>
+          <w:rFonts w:hint="default" w:ascii="Times New Roman" w:hAnsi="Times New Roman" w:cs="Times New Roman"/>
+          <w:sz w:val="28"/>
+          <w:szCs w:val="28"/>
+        </w:rPr>
+      </w:pPr>
+      <w:r>
+        <w:rPr>
+          <w:rFonts w:hint="default" w:ascii="Times New Roman" w:hAnsi="Times New Roman" w:eastAsia="Courier New" w:cs="Times New Roman"/>
+          <w:sz w:val="28"/>
+          <w:szCs w:val="28"/>
+        </w:rPr>
+        <w:t xml:space="preserve">        self.kitchen_card.set_header("Очередь заказов", "Просмотр заказов текущей смены.")</w:t>
+      </w:r>
+    </w:p>
+    <w:p>
+      <w:pPr>
+        <w:pStyle w:val="3"/>
+        <w:rPr>
+          <w:rFonts w:hint="default" w:ascii="Times New Roman" w:hAnsi="Times New Roman" w:cs="Times New Roman"/>
+          <w:sz w:val="28"/>
+          <w:szCs w:val="28"/>
+        </w:rPr>
+      </w:pPr>
+      <w:r>
+        <w:rPr>
+          <w:rFonts w:hint="default" w:ascii="Times New Roman" w:hAnsi="Times New Roman" w:cs="Times New Roman"/>
+          <w:sz w:val="28"/>
+          <w:szCs w:val="28"/>
+        </w:rPr>
+        <w:t>А.2 OrdersPage._filtered_queue_indices</w:t>
+      </w:r>
+    </w:p>
+    <w:p>
+      <w:pPr>
+        <w:rPr>
+          <w:rFonts w:hint="default" w:ascii="Times New Roman" w:hAnsi="Times New Roman" w:cs="Times New Roman"/>
+          <w:sz w:val="28"/>
+          <w:szCs w:val="28"/>
+        </w:rPr>
+      </w:pPr>
+      <w:r>
+        <w:rPr>
+          <w:rFonts w:hint="default" w:ascii="Times New Roman" w:hAnsi="Times New Roman" w:cs="Times New Roman"/>
+          <w:b/>
+          <w:sz w:val="28"/>
+          <w:szCs w:val="28"/>
+        </w:rPr>
+        <w:t xml:space="preserve">Файл: </w:t>
+      </w:r>
+      <w:r>
+        <w:rPr>
+          <w:rFonts w:hint="default" w:ascii="Times New Roman" w:hAnsi="Times New Roman" w:cs="Times New Roman"/>
+          <w:sz w:val="28"/>
+          <w:szCs w:val="28"/>
+        </w:rPr>
+        <w:t>gastrosoft_app/pages/orders_page.py</w:t>
+      </w:r>
+    </w:p>
+    <w:p>
+      <w:pPr>
+        <w:spacing w:after="0" w:line="240" w:lineRule="auto"/>
+        <w:rPr>
+          <w:rFonts w:hint="default" w:ascii="Times New Roman" w:hAnsi="Times New Roman" w:cs="Times New Roman"/>
+          <w:sz w:val="28"/>
+          <w:szCs w:val="28"/>
+        </w:rPr>
+      </w:pPr>
+      <w:r>
+        <w:rPr>
+          <w:rFonts w:hint="default" w:ascii="Times New Roman" w:hAnsi="Times New Roman" w:eastAsia="Courier New" w:cs="Times New Roman"/>
+          <w:sz w:val="28"/>
+          <w:szCs w:val="28"/>
+        </w:rPr>
+        <w:t>def _filtered_queue_indices(self) -&gt; list[int]:</w:t>
+      </w:r>
+    </w:p>
+    <w:p>
+      <w:pPr>
+        <w:spacing w:after="0" w:line="240" w:lineRule="auto"/>
+        <w:rPr>
+          <w:rFonts w:hint="default" w:ascii="Times New Roman" w:hAnsi="Times New Roman" w:cs="Times New Roman"/>
+          <w:sz w:val="28"/>
+          <w:szCs w:val="28"/>
+        </w:rPr>
+      </w:pPr>
+      <w:r>
+        <w:rPr>
+          <w:rFonts w:hint="default" w:ascii="Times New Roman" w:hAnsi="Times New Roman" w:eastAsia="Courier New" w:cs="Times New Roman"/>
+          <w:sz w:val="28"/>
+          <w:szCs w:val="28"/>
+        </w:rPr>
+        <w:t xml:space="preserve">    selected_status = self.kitchen_filter.currentText()</w:t>
+      </w:r>
+    </w:p>
+    <w:p>
+      <w:pPr>
+        <w:spacing w:after="0" w:line="240" w:lineRule="auto"/>
+        <w:rPr>
+          <w:rFonts w:hint="default" w:ascii="Times New Roman" w:hAnsi="Times New Roman" w:cs="Times New Roman"/>
+          <w:sz w:val="28"/>
+          <w:szCs w:val="28"/>
+        </w:rPr>
+      </w:pPr>
+      <w:r>
+        <w:rPr>
+          <w:rFonts w:hint="default" w:ascii="Times New Roman" w:hAnsi="Times New Roman" w:eastAsia="Courier New" w:cs="Times New Roman"/>
+          <w:sz w:val="28"/>
+          <w:szCs w:val="28"/>
+        </w:rPr>
+        <w:t xml:space="preserve">    indices = []</w:t>
+      </w:r>
+    </w:p>
+    <w:p>
+      <w:pPr>
+        <w:spacing w:after="0" w:line="240" w:lineRule="auto"/>
+        <w:rPr>
+          <w:rFonts w:hint="default" w:ascii="Times New Roman" w:hAnsi="Times New Roman" w:cs="Times New Roman"/>
+          <w:sz w:val="28"/>
+          <w:szCs w:val="28"/>
+        </w:rPr>
+      </w:pPr>
+      <w:r>
+        <w:rPr>
+          <w:rFonts w:hint="default" w:ascii="Times New Roman" w:hAnsi="Times New Roman" w:eastAsia="Courier New" w:cs="Times New Roman"/>
+          <w:sz w:val="28"/>
+          <w:szCs w:val="28"/>
+        </w:rPr>
+        <w:t xml:space="preserve">    role = self._current_role()</w:t>
+      </w:r>
+    </w:p>
+    <w:p>
+      <w:pPr>
+        <w:spacing w:after="0" w:line="240" w:lineRule="auto"/>
+        <w:rPr>
+          <w:rFonts w:hint="default" w:ascii="Times New Roman" w:hAnsi="Times New Roman" w:cs="Times New Roman"/>
+          <w:sz w:val="28"/>
+          <w:szCs w:val="28"/>
+        </w:rPr>
+      </w:pPr>
+      <w:r>
+        <w:rPr>
+          <w:rFonts w:hint="default" w:ascii="Times New Roman" w:hAnsi="Times New Roman" w:eastAsia="Courier New" w:cs="Times New Roman"/>
+          <w:sz w:val="28"/>
+          <w:szCs w:val="28"/>
+        </w:rPr>
+        <w:t xml:space="preserve">    for index, item in enumerate(self.store.kitchen_queue):</w:t>
+      </w:r>
+    </w:p>
+    <w:p>
+      <w:pPr>
+        <w:spacing w:after="0" w:line="240" w:lineRule="auto"/>
+        <w:rPr>
+          <w:rFonts w:hint="default" w:ascii="Times New Roman" w:hAnsi="Times New Roman" w:cs="Times New Roman"/>
+          <w:sz w:val="28"/>
+          <w:szCs w:val="28"/>
+        </w:rPr>
+      </w:pPr>
+      <w:r>
+        <w:rPr>
+          <w:rFonts w:hint="default" w:ascii="Times New Roman" w:hAnsi="Times New Roman" w:eastAsia="Courier New" w:cs="Times New Roman"/>
+          <w:sz w:val="28"/>
+          <w:szCs w:val="28"/>
+        </w:rPr>
+        <w:t xml:space="preserve">        status = item["status"]</w:t>
+      </w:r>
+    </w:p>
+    <w:p>
+      <w:pPr>
+        <w:spacing w:after="0" w:line="240" w:lineRule="auto"/>
+        <w:rPr>
+          <w:rFonts w:hint="default" w:ascii="Times New Roman" w:hAnsi="Times New Roman" w:cs="Times New Roman"/>
+          <w:sz w:val="28"/>
+          <w:szCs w:val="28"/>
+        </w:rPr>
+      </w:pPr>
+      <w:r>
+        <w:rPr>
+          <w:rFonts w:hint="default" w:ascii="Times New Roman" w:hAnsi="Times New Roman" w:eastAsia="Courier New" w:cs="Times New Roman"/>
+          <w:sz w:val="28"/>
+          <w:szCs w:val="28"/>
+        </w:rPr>
+        <w:t xml:space="preserve">        if can_process_kitchen(role) and status not in KITCHEN_ACTIVE_STATUSES:</w:t>
+      </w:r>
+    </w:p>
+    <w:p>
+      <w:pPr>
+        <w:spacing w:after="0" w:line="240" w:lineRule="auto"/>
+        <w:rPr>
+          <w:rFonts w:hint="default" w:ascii="Times New Roman" w:hAnsi="Times New Roman" w:cs="Times New Roman"/>
+          <w:sz w:val="28"/>
+          <w:szCs w:val="28"/>
+        </w:rPr>
+      </w:pPr>
+      <w:r>
+        <w:rPr>
+          <w:rFonts w:hint="default" w:ascii="Times New Roman" w:hAnsi="Times New Roman" w:eastAsia="Courier New" w:cs="Times New Roman"/>
+          <w:sz w:val="28"/>
+          <w:szCs w:val="28"/>
+        </w:rPr>
+        <w:t xml:space="preserve">            continue</w:t>
+      </w:r>
+    </w:p>
+    <w:p>
+      <w:pPr>
+        <w:spacing w:after="0" w:line="240" w:lineRule="auto"/>
+        <w:rPr>
+          <w:rFonts w:hint="default" w:ascii="Times New Roman" w:hAnsi="Times New Roman" w:cs="Times New Roman"/>
+          <w:sz w:val="28"/>
+          <w:szCs w:val="28"/>
+        </w:rPr>
+      </w:pPr>
+      <w:r>
+        <w:rPr>
+          <w:rFonts w:hint="default" w:ascii="Times New Roman" w:hAnsi="Times New Roman" w:eastAsia="Courier New" w:cs="Times New Roman"/>
+          <w:sz w:val="28"/>
+          <w:szCs w:val="28"/>
+        </w:rPr>
+        <w:t xml:space="preserve">        if can_process_kitchen(role) and selected_status != "Все активные" and status != selected_status:</w:t>
+      </w:r>
+    </w:p>
+    <w:p>
+      <w:pPr>
+        <w:spacing w:after="0" w:line="240" w:lineRule="auto"/>
+        <w:rPr>
+          <w:rFonts w:hint="default" w:ascii="Times New Roman" w:hAnsi="Times New Roman" w:cs="Times New Roman"/>
+          <w:sz w:val="28"/>
+          <w:szCs w:val="28"/>
+        </w:rPr>
+      </w:pPr>
+      <w:r>
+        <w:rPr>
+          <w:rFonts w:hint="default" w:ascii="Times New Roman" w:hAnsi="Times New Roman" w:eastAsia="Courier New" w:cs="Times New Roman"/>
+          <w:sz w:val="28"/>
+          <w:szCs w:val="28"/>
+        </w:rPr>
+        <w:t xml:space="preserve">            continue</w:t>
+      </w:r>
+    </w:p>
+    <w:p>
+      <w:pPr>
+        <w:spacing w:after="0" w:line="240" w:lineRule="auto"/>
+        <w:rPr>
+          <w:rFonts w:hint="default" w:ascii="Times New Roman" w:hAnsi="Times New Roman" w:cs="Times New Roman"/>
+          <w:sz w:val="28"/>
+          <w:szCs w:val="28"/>
+        </w:rPr>
+      </w:pPr>
+      <w:r>
+        <w:rPr>
+          <w:rFonts w:hint="default" w:ascii="Times New Roman" w:hAnsi="Times New Roman" w:eastAsia="Courier New" w:cs="Times New Roman"/>
+          <w:sz w:val="28"/>
+          <w:szCs w:val="28"/>
+        </w:rPr>
+        <w:t xml:space="preserve">        if role == "Кассир" and status not in CASHIER_VISIBLE_STATUSES:</w:t>
+      </w:r>
+    </w:p>
+    <w:p>
+      <w:pPr>
+        <w:spacing w:after="0" w:line="240" w:lineRule="auto"/>
+        <w:rPr>
+          <w:rFonts w:hint="default" w:ascii="Times New Roman" w:hAnsi="Times New Roman" w:cs="Times New Roman"/>
+          <w:sz w:val="28"/>
+          <w:szCs w:val="28"/>
+        </w:rPr>
+      </w:pPr>
+      <w:r>
+        <w:rPr>
+          <w:rFonts w:hint="default" w:ascii="Times New Roman" w:hAnsi="Times New Roman" w:eastAsia="Courier New" w:cs="Times New Roman"/>
+          <w:sz w:val="28"/>
+          <w:szCs w:val="28"/>
+        </w:rPr>
+        <w:t xml:space="preserve">            continue</w:t>
+      </w:r>
+    </w:p>
+    <w:p>
+      <w:pPr>
+        <w:spacing w:after="0" w:line="240" w:lineRule="auto"/>
+        <w:rPr>
+          <w:rFonts w:hint="default" w:ascii="Times New Roman" w:hAnsi="Times New Roman" w:cs="Times New Roman"/>
+          <w:sz w:val="28"/>
+          <w:szCs w:val="28"/>
+        </w:rPr>
+      </w:pPr>
+      <w:r>
+        <w:rPr>
+          <w:rFonts w:hint="default" w:ascii="Times New Roman" w:hAnsi="Times New Roman" w:eastAsia="Courier New" w:cs="Times New Roman"/>
+          <w:sz w:val="28"/>
+          <w:szCs w:val="28"/>
+        </w:rPr>
+        <w:t xml:space="preserve">        indices.append(index)</w:t>
+      </w:r>
+    </w:p>
+    <w:p>
+      <w:pPr>
+        <w:spacing w:after="0" w:line="240" w:lineRule="auto"/>
+        <w:rPr>
+          <w:rFonts w:hint="default" w:ascii="Times New Roman" w:hAnsi="Times New Roman" w:cs="Times New Roman"/>
+          <w:sz w:val="28"/>
+          <w:szCs w:val="28"/>
+        </w:rPr>
+      </w:pPr>
+      <w:r>
+        <w:rPr>
+          <w:rFonts w:hint="default" w:ascii="Times New Roman" w:hAnsi="Times New Roman" w:eastAsia="Courier New" w:cs="Times New Roman"/>
+          <w:sz w:val="28"/>
+          <w:szCs w:val="28"/>
+        </w:rPr>
+        <w:t xml:space="preserve">    return indices</w:t>
+      </w:r>
+    </w:p>
+    <w:p>
+      <w:pPr>
+        <w:pStyle w:val="3"/>
+        <w:rPr>
+          <w:rFonts w:hint="default" w:ascii="Times New Roman" w:hAnsi="Times New Roman" w:cs="Times New Roman"/>
+          <w:sz w:val="28"/>
+          <w:szCs w:val="28"/>
+        </w:rPr>
+      </w:pPr>
+      <w:r>
+        <w:rPr>
+          <w:rFonts w:hint="default" w:ascii="Times New Roman" w:hAnsi="Times New Roman" w:cs="Times New Roman"/>
+          <w:sz w:val="28"/>
+          <w:szCs w:val="28"/>
+        </w:rPr>
+        <w:t>А.3 OrdersPage.populate_kitchen</w:t>
+      </w:r>
+    </w:p>
+    <w:p>
+      <w:pPr>
+        <w:rPr>
+          <w:rFonts w:hint="default" w:ascii="Times New Roman" w:hAnsi="Times New Roman" w:cs="Times New Roman"/>
+          <w:sz w:val="28"/>
+          <w:szCs w:val="28"/>
+        </w:rPr>
+      </w:pPr>
+      <w:r>
+        <w:rPr>
+          <w:rFonts w:hint="default" w:ascii="Times New Roman" w:hAnsi="Times New Roman" w:cs="Times New Roman"/>
+          <w:b/>
+          <w:sz w:val="28"/>
+          <w:szCs w:val="28"/>
+        </w:rPr>
+        <w:t xml:space="preserve">Файл: </w:t>
+      </w:r>
+      <w:r>
+        <w:rPr>
+          <w:rFonts w:hint="default" w:ascii="Times New Roman" w:hAnsi="Times New Roman" w:cs="Times New Roman"/>
+          <w:sz w:val="28"/>
+          <w:szCs w:val="28"/>
+        </w:rPr>
+        <w:t>gastrosoft_app/pages/orders_page.py</w:t>
+      </w:r>
+    </w:p>
+    <w:p>
+      <w:pPr>
+        <w:spacing w:after="0" w:line="240" w:lineRule="auto"/>
+        <w:rPr>
+          <w:rFonts w:hint="default" w:ascii="Times New Roman" w:hAnsi="Times New Roman" w:cs="Times New Roman"/>
+          <w:sz w:val="28"/>
+          <w:szCs w:val="28"/>
+        </w:rPr>
+      </w:pPr>
+      <w:r>
+        <w:rPr>
+          <w:rFonts w:hint="default" w:ascii="Times New Roman" w:hAnsi="Times New Roman" w:eastAsia="Courier New" w:cs="Times New Roman"/>
+          <w:sz w:val="28"/>
+          <w:szCs w:val="28"/>
+        </w:rPr>
+        <w:t>def populate_kitchen(self) -&gt; None:</w:t>
+      </w:r>
+    </w:p>
+    <w:p>
+      <w:pPr>
+        <w:spacing w:after="0" w:line="240" w:lineRule="auto"/>
+        <w:rPr>
+          <w:rFonts w:hint="default" w:ascii="Times New Roman" w:hAnsi="Times New Roman" w:cs="Times New Roman"/>
+          <w:sz w:val="28"/>
+          <w:szCs w:val="28"/>
+        </w:rPr>
+      </w:pPr>
+      <w:r>
+        <w:rPr>
+          <w:rFonts w:hint="default" w:ascii="Times New Roman" w:hAnsi="Times New Roman" w:eastAsia="Courier New" w:cs="Times New Roman"/>
+          <w:sz w:val="28"/>
+          <w:szCs w:val="28"/>
+        </w:rPr>
+        <w:t xml:space="preserve">    role = self._current_role()</w:t>
+      </w:r>
+    </w:p>
+    <w:p>
+      <w:pPr>
+        <w:spacing w:after="0" w:line="240" w:lineRule="auto"/>
+        <w:rPr>
+          <w:rFonts w:hint="default" w:ascii="Times New Roman" w:hAnsi="Times New Roman" w:cs="Times New Roman"/>
+          <w:sz w:val="28"/>
+          <w:szCs w:val="28"/>
+        </w:rPr>
+      </w:pPr>
+      <w:r>
+        <w:rPr>
+          <w:rFonts w:hint="default" w:ascii="Times New Roman" w:hAnsi="Times New Roman" w:eastAsia="Courier New" w:cs="Times New Roman"/>
+          <w:sz w:val="28"/>
+          <w:szCs w:val="28"/>
+        </w:rPr>
+        <w:t xml:space="preserve">    is_kitchen = can_process_kitchen(role)</w:t>
+      </w:r>
+    </w:p>
+    <w:p>
+      <w:pPr>
+        <w:spacing w:after="0" w:line="240" w:lineRule="auto"/>
+        <w:rPr>
+          <w:rFonts w:hint="default" w:ascii="Times New Roman" w:hAnsi="Times New Roman" w:cs="Times New Roman"/>
+          <w:sz w:val="28"/>
+          <w:szCs w:val="28"/>
+        </w:rPr>
+      </w:pPr>
+      <w:r>
+        <w:rPr>
+          <w:rFonts w:hint="default" w:ascii="Times New Roman" w:hAnsi="Times New Roman" w:eastAsia="Courier New" w:cs="Times New Roman"/>
+          <w:sz w:val="28"/>
+          <w:szCs w:val="28"/>
+        </w:rPr>
+        <w:t xml:space="preserve">    headers = (</w:t>
+      </w:r>
+    </w:p>
+    <w:p>
+      <w:pPr>
+        <w:spacing w:after="0" w:line="240" w:lineRule="auto"/>
+        <w:rPr>
+          <w:rFonts w:hint="default" w:ascii="Times New Roman" w:hAnsi="Times New Roman" w:cs="Times New Roman"/>
+          <w:sz w:val="28"/>
+          <w:szCs w:val="28"/>
+        </w:rPr>
+      </w:pPr>
+      <w:r>
+        <w:rPr>
+          <w:rFonts w:hint="default" w:ascii="Times New Roman" w:hAnsi="Times New Roman" w:eastAsia="Courier New" w:cs="Times New Roman"/>
+          <w:sz w:val="28"/>
+          <w:szCs w:val="28"/>
+        </w:rPr>
+        <w:t xml:space="preserve">        ["Номер", "Стол", "Время", "Состав заказа", "Статус"]</w:t>
+      </w:r>
+    </w:p>
+    <w:p>
+      <w:pPr>
+        <w:spacing w:after="0" w:line="240" w:lineRule="auto"/>
+        <w:rPr>
+          <w:rFonts w:hint="default" w:ascii="Times New Roman" w:hAnsi="Times New Roman" w:cs="Times New Roman"/>
+          <w:sz w:val="28"/>
+          <w:szCs w:val="28"/>
+        </w:rPr>
+      </w:pPr>
+      <w:r>
+        <w:rPr>
+          <w:rFonts w:hint="default" w:ascii="Times New Roman" w:hAnsi="Times New Roman" w:eastAsia="Courier New" w:cs="Times New Roman"/>
+          <w:sz w:val="28"/>
+          <w:szCs w:val="28"/>
+        </w:rPr>
+        <w:t xml:space="preserve">        if is_kitchen</w:t>
+      </w:r>
+    </w:p>
+    <w:p>
+      <w:pPr>
+        <w:spacing w:after="0" w:line="240" w:lineRule="auto"/>
+        <w:rPr>
+          <w:rFonts w:hint="default" w:ascii="Times New Roman" w:hAnsi="Times New Roman" w:cs="Times New Roman"/>
+          <w:sz w:val="28"/>
+          <w:szCs w:val="28"/>
+        </w:rPr>
+      </w:pPr>
+      <w:r>
+        <w:rPr>
+          <w:rFonts w:hint="default" w:ascii="Times New Roman" w:hAnsi="Times New Roman" w:eastAsia="Courier New" w:cs="Times New Roman"/>
+          <w:sz w:val="28"/>
+          <w:szCs w:val="28"/>
+        </w:rPr>
+        <w:t xml:space="preserve">        else ["Номер", "Стол", "Время", "Состав", "Статус"]</w:t>
+      </w:r>
+    </w:p>
+    <w:p>
+      <w:pPr>
+        <w:spacing w:after="0" w:line="240" w:lineRule="auto"/>
+        <w:rPr>
+          <w:rFonts w:hint="default" w:ascii="Times New Roman" w:hAnsi="Times New Roman" w:cs="Times New Roman"/>
+          <w:sz w:val="28"/>
+          <w:szCs w:val="28"/>
+        </w:rPr>
+      </w:pPr>
+      <w:r>
+        <w:rPr>
+          <w:rFonts w:hint="default" w:ascii="Times New Roman" w:hAnsi="Times New Roman" w:eastAsia="Courier New" w:cs="Times New Roman"/>
+          <w:sz w:val="28"/>
+          <w:szCs w:val="28"/>
+        </w:rPr>
+        <w:t xml:space="preserve">    )</w:t>
+      </w:r>
+    </w:p>
+    <w:p>
+      <w:pPr>
+        <w:spacing w:after="0" w:line="240" w:lineRule="auto"/>
+        <w:rPr>
+          <w:rFonts w:hint="default" w:ascii="Times New Roman" w:hAnsi="Times New Roman" w:cs="Times New Roman"/>
+          <w:sz w:val="28"/>
+          <w:szCs w:val="28"/>
+        </w:rPr>
+      </w:pPr>
+      <w:r>
+        <w:rPr>
+          <w:rFonts w:hint="default" w:ascii="Times New Roman" w:hAnsi="Times New Roman" w:eastAsia="Courier New" w:cs="Times New Roman"/>
+          <w:sz w:val="28"/>
+          <w:szCs w:val="28"/>
+        </w:rPr>
+        <w:t xml:space="preserve">    self.kitchen_table.setColumnCount(len(headers))</w:t>
+      </w:r>
+    </w:p>
+    <w:p>
+      <w:pPr>
+        <w:spacing w:after="0" w:line="240" w:lineRule="auto"/>
+        <w:rPr>
+          <w:rFonts w:hint="default" w:ascii="Times New Roman" w:hAnsi="Times New Roman" w:cs="Times New Roman"/>
+          <w:sz w:val="28"/>
+          <w:szCs w:val="28"/>
+        </w:rPr>
+      </w:pPr>
+      <w:r>
+        <w:rPr>
+          <w:rFonts w:hint="default" w:ascii="Times New Roman" w:hAnsi="Times New Roman" w:eastAsia="Courier New" w:cs="Times New Roman"/>
+          <w:sz w:val="28"/>
+          <w:szCs w:val="28"/>
+        </w:rPr>
+        <w:t xml:space="preserve">    self.kitchen_table.setHorizontalHeaderLabels(headers)</w:t>
+      </w:r>
+    </w:p>
+    <w:p>
+      <w:pPr>
+        <w:spacing w:after="0" w:line="240" w:lineRule="auto"/>
+        <w:rPr>
+          <w:rFonts w:hint="default" w:ascii="Times New Roman" w:hAnsi="Times New Roman" w:cs="Times New Roman"/>
+          <w:sz w:val="28"/>
+          <w:szCs w:val="28"/>
+        </w:rPr>
+      </w:pPr>
+      <w:r>
+        <w:rPr>
+          <w:rFonts w:hint="default" w:ascii="Times New Roman" w:hAnsi="Times New Roman" w:eastAsia="Courier New" w:cs="Times New Roman"/>
+          <w:sz w:val="28"/>
+          <w:szCs w:val="28"/>
+        </w:rPr>
+        <w:t xml:space="preserve">    self.kitchen_table.verticalHeader().setDefaultSectionSize(58 if is_kitchen else 34)</w:t>
+      </w:r>
+    </w:p>
+    <w:p>
+      <w:pPr>
+        <w:spacing w:after="0" w:line="240" w:lineRule="auto"/>
+        <w:rPr>
+          <w:rFonts w:hint="default" w:ascii="Times New Roman" w:hAnsi="Times New Roman" w:cs="Times New Roman"/>
+          <w:sz w:val="28"/>
+          <w:szCs w:val="28"/>
+        </w:rPr>
+      </w:pPr>
+      <w:r>
+        <w:rPr>
+          <w:rFonts w:hint="default" w:ascii="Times New Roman" w:hAnsi="Times New Roman" w:eastAsia="Courier New" w:cs="Times New Roman"/>
+          <w:sz w:val="28"/>
+          <w:szCs w:val="28"/>
+        </w:rPr>
+        <w:t xml:space="preserve"> </w:t>
+      </w:r>
+    </w:p>
+    <w:p>
+      <w:pPr>
+        <w:spacing w:after="0" w:line="240" w:lineRule="auto"/>
+        <w:rPr>
+          <w:rFonts w:hint="default" w:ascii="Times New Roman" w:hAnsi="Times New Roman" w:cs="Times New Roman"/>
+          <w:sz w:val="28"/>
+          <w:szCs w:val="28"/>
+        </w:rPr>
+      </w:pPr>
+      <w:r>
+        <w:rPr>
+          <w:rFonts w:hint="default" w:ascii="Times New Roman" w:hAnsi="Times New Roman" w:eastAsia="Courier New" w:cs="Times New Roman"/>
+          <w:sz w:val="28"/>
+          <w:szCs w:val="28"/>
+        </w:rPr>
+        <w:t xml:space="preserve">    self.visible_queue_indices = self._filtered_queue_indices()</w:t>
+      </w:r>
+    </w:p>
+    <w:p>
+      <w:pPr>
+        <w:spacing w:after="0" w:line="240" w:lineRule="auto"/>
+        <w:rPr>
+          <w:rFonts w:hint="default" w:ascii="Times New Roman" w:hAnsi="Times New Roman" w:cs="Times New Roman"/>
+          <w:sz w:val="28"/>
+          <w:szCs w:val="28"/>
+        </w:rPr>
+      </w:pPr>
+      <w:r>
+        <w:rPr>
+          <w:rFonts w:hint="default" w:ascii="Times New Roman" w:hAnsi="Times New Roman" w:eastAsia="Courier New" w:cs="Times New Roman"/>
+          <w:sz w:val="28"/>
+          <w:szCs w:val="28"/>
+        </w:rPr>
+        <w:t xml:space="preserve">    self.kitchen_table.setRowCount(len(self.visible_queue_indices))</w:t>
+      </w:r>
+    </w:p>
+    <w:p>
+      <w:pPr>
+        <w:spacing w:after="0" w:line="240" w:lineRule="auto"/>
+        <w:rPr>
+          <w:rFonts w:hint="default" w:ascii="Times New Roman" w:hAnsi="Times New Roman" w:cs="Times New Roman"/>
+          <w:sz w:val="28"/>
+          <w:szCs w:val="28"/>
+        </w:rPr>
+      </w:pPr>
+      <w:r>
+        <w:rPr>
+          <w:rFonts w:hint="default" w:ascii="Times New Roman" w:hAnsi="Times New Roman" w:eastAsia="Courier New" w:cs="Times New Roman"/>
+          <w:sz w:val="28"/>
+          <w:szCs w:val="28"/>
+        </w:rPr>
+        <w:t xml:space="preserve">    for row_index, queue_index in enumerate(self.visible_queue_indices):</w:t>
+      </w:r>
+    </w:p>
+    <w:p>
+      <w:pPr>
+        <w:spacing w:after="0" w:line="240" w:lineRule="auto"/>
+        <w:rPr>
+          <w:rFonts w:hint="default" w:ascii="Times New Roman" w:hAnsi="Times New Roman" w:cs="Times New Roman"/>
+          <w:sz w:val="28"/>
+          <w:szCs w:val="28"/>
+        </w:rPr>
+      </w:pPr>
+      <w:r>
+        <w:rPr>
+          <w:rFonts w:hint="default" w:ascii="Times New Roman" w:hAnsi="Times New Roman" w:eastAsia="Courier New" w:cs="Times New Roman"/>
+          <w:sz w:val="28"/>
+          <w:szCs w:val="28"/>
+        </w:rPr>
+        <w:t xml:space="preserve">        queue_item = self.store.kitchen_queue[queue_index]</w:t>
+      </w:r>
+    </w:p>
+    <w:p>
+      <w:pPr>
+        <w:spacing w:after="0" w:line="240" w:lineRule="auto"/>
+        <w:rPr>
+          <w:rFonts w:hint="default" w:ascii="Times New Roman" w:hAnsi="Times New Roman" w:cs="Times New Roman"/>
+          <w:sz w:val="28"/>
+          <w:szCs w:val="28"/>
+        </w:rPr>
+      </w:pPr>
+      <w:r>
+        <w:rPr>
+          <w:rFonts w:hint="default" w:ascii="Times New Roman" w:hAnsi="Times New Roman" w:eastAsia="Courier New" w:cs="Times New Roman"/>
+          <w:sz w:val="28"/>
+          <w:szCs w:val="28"/>
+        </w:rPr>
+        <w:t xml:space="preserve">        values = (</w:t>
+      </w:r>
+    </w:p>
+    <w:p>
+      <w:pPr>
+        <w:spacing w:after="0" w:line="240" w:lineRule="auto"/>
+        <w:rPr>
+          <w:rFonts w:hint="default" w:ascii="Times New Roman" w:hAnsi="Times New Roman" w:cs="Times New Roman"/>
+          <w:sz w:val="28"/>
+          <w:szCs w:val="28"/>
+        </w:rPr>
+      </w:pPr>
+      <w:r>
+        <w:rPr>
+          <w:rFonts w:hint="default" w:ascii="Times New Roman" w:hAnsi="Times New Roman" w:eastAsia="Courier New" w:cs="Times New Roman"/>
+          <w:sz w:val="28"/>
+          <w:szCs w:val="28"/>
+        </w:rPr>
+        <w:t xml:space="preserve">            [</w:t>
+      </w:r>
+    </w:p>
+    <w:p>
+      <w:pPr>
+        <w:spacing w:after="0" w:line="240" w:lineRule="auto"/>
+        <w:rPr>
+          <w:rFonts w:hint="default" w:ascii="Times New Roman" w:hAnsi="Times New Roman" w:cs="Times New Roman"/>
+          <w:sz w:val="28"/>
+          <w:szCs w:val="28"/>
+        </w:rPr>
+      </w:pPr>
+      <w:r>
+        <w:rPr>
+          <w:rFonts w:hint="default" w:ascii="Times New Roman" w:hAnsi="Times New Roman" w:eastAsia="Courier New" w:cs="Times New Roman"/>
+          <w:sz w:val="28"/>
+          <w:szCs w:val="28"/>
+        </w:rPr>
+        <w:t xml:space="preserve">                queue_item["order_no"],</w:t>
+      </w:r>
+    </w:p>
+    <w:p>
+      <w:pPr>
+        <w:spacing w:after="0" w:line="240" w:lineRule="auto"/>
+        <w:rPr>
+          <w:rFonts w:hint="default" w:ascii="Times New Roman" w:hAnsi="Times New Roman" w:cs="Times New Roman"/>
+          <w:sz w:val="28"/>
+          <w:szCs w:val="28"/>
+        </w:rPr>
+      </w:pPr>
+      <w:r>
+        <w:rPr>
+          <w:rFonts w:hint="default" w:ascii="Times New Roman" w:hAnsi="Times New Roman" w:eastAsia="Courier New" w:cs="Times New Roman"/>
+          <w:sz w:val="28"/>
+          <w:szCs w:val="28"/>
+        </w:rPr>
+        <w:t xml:space="preserve">                queue_item["table"],</w:t>
+      </w:r>
+    </w:p>
+    <w:p>
+      <w:pPr>
+        <w:spacing w:after="0" w:line="240" w:lineRule="auto"/>
+        <w:rPr>
+          <w:rFonts w:hint="default" w:ascii="Times New Roman" w:hAnsi="Times New Roman" w:cs="Times New Roman"/>
+          <w:sz w:val="28"/>
+          <w:szCs w:val="28"/>
+        </w:rPr>
+      </w:pPr>
+      <w:r>
+        <w:rPr>
+          <w:rFonts w:hint="default" w:ascii="Times New Roman" w:hAnsi="Times New Roman" w:eastAsia="Courier New" w:cs="Times New Roman"/>
+          <w:sz w:val="28"/>
+          <w:szCs w:val="28"/>
+        </w:rPr>
+        <w:t xml:space="preserve">                queue_item.get("created", "-"),</w:t>
+      </w:r>
+    </w:p>
+    <w:p>
+      <w:pPr>
+        <w:spacing w:after="0" w:line="240" w:lineRule="auto"/>
+        <w:rPr>
+          <w:rFonts w:hint="default" w:ascii="Times New Roman" w:hAnsi="Times New Roman" w:cs="Times New Roman"/>
+          <w:sz w:val="28"/>
+          <w:szCs w:val="28"/>
+        </w:rPr>
+      </w:pPr>
+      <w:r>
+        <w:rPr>
+          <w:rFonts w:hint="default" w:ascii="Times New Roman" w:hAnsi="Times New Roman" w:eastAsia="Courier New" w:cs="Times New Roman"/>
+          <w:sz w:val="28"/>
+          <w:szCs w:val="28"/>
+        </w:rPr>
+        <w:t xml:space="preserve">                queue_item["items"],</w:t>
+      </w:r>
+    </w:p>
+    <w:p>
+      <w:pPr>
+        <w:spacing w:after="0" w:line="240" w:lineRule="auto"/>
+        <w:rPr>
+          <w:rFonts w:hint="default" w:ascii="Times New Roman" w:hAnsi="Times New Roman" w:cs="Times New Roman"/>
+          <w:sz w:val="28"/>
+          <w:szCs w:val="28"/>
+        </w:rPr>
+      </w:pPr>
+      <w:r>
+        <w:rPr>
+          <w:rFonts w:hint="default" w:ascii="Times New Roman" w:hAnsi="Times New Roman" w:eastAsia="Courier New" w:cs="Times New Roman"/>
+          <w:sz w:val="28"/>
+          <w:szCs w:val="28"/>
+        </w:rPr>
+        <w:t xml:space="preserve">                queue_item["status"],</w:t>
+      </w:r>
+    </w:p>
+    <w:p>
+      <w:pPr>
+        <w:spacing w:after="0" w:line="240" w:lineRule="auto"/>
+        <w:rPr>
+          <w:rFonts w:hint="default" w:ascii="Times New Roman" w:hAnsi="Times New Roman" w:cs="Times New Roman"/>
+          <w:sz w:val="28"/>
+          <w:szCs w:val="28"/>
+        </w:rPr>
+      </w:pPr>
+      <w:r>
+        <w:rPr>
+          <w:rFonts w:hint="default" w:ascii="Times New Roman" w:hAnsi="Times New Roman" w:eastAsia="Courier New" w:cs="Times New Roman"/>
+          <w:sz w:val="28"/>
+          <w:szCs w:val="28"/>
+        </w:rPr>
+        <w:t xml:space="preserve">            ]</w:t>
+      </w:r>
+    </w:p>
+    <w:p>
+      <w:pPr>
+        <w:spacing w:after="0" w:line="240" w:lineRule="auto"/>
+        <w:rPr>
+          <w:rFonts w:hint="default" w:ascii="Times New Roman" w:hAnsi="Times New Roman" w:cs="Times New Roman"/>
+          <w:sz w:val="28"/>
+          <w:szCs w:val="28"/>
+        </w:rPr>
+      </w:pPr>
+      <w:r>
+        <w:rPr>
+          <w:rFonts w:hint="default" w:ascii="Times New Roman" w:hAnsi="Times New Roman" w:eastAsia="Courier New" w:cs="Times New Roman"/>
+          <w:sz w:val="28"/>
+          <w:szCs w:val="28"/>
+        </w:rPr>
+        <w:t xml:space="preserve">            if is_kitchen</w:t>
+      </w:r>
+    </w:p>
+    <w:p>
+      <w:pPr>
+        <w:spacing w:after="0" w:line="240" w:lineRule="auto"/>
+        <w:rPr>
+          <w:rFonts w:hint="default" w:ascii="Times New Roman" w:hAnsi="Times New Roman" w:cs="Times New Roman"/>
+          <w:sz w:val="28"/>
+          <w:szCs w:val="28"/>
+        </w:rPr>
+      </w:pPr>
+      <w:r>
+        <w:rPr>
+          <w:rFonts w:hint="default" w:ascii="Times New Roman" w:hAnsi="Times New Roman" w:eastAsia="Courier New" w:cs="Times New Roman"/>
+          <w:sz w:val="28"/>
+          <w:szCs w:val="28"/>
+        </w:rPr>
+        <w:t xml:space="preserve">            else [</w:t>
+      </w:r>
+    </w:p>
+    <w:p>
+      <w:pPr>
+        <w:spacing w:after="0" w:line="240" w:lineRule="auto"/>
+        <w:rPr>
+          <w:rFonts w:hint="default" w:ascii="Times New Roman" w:hAnsi="Times New Roman" w:cs="Times New Roman"/>
+          <w:sz w:val="28"/>
+          <w:szCs w:val="28"/>
+        </w:rPr>
+      </w:pPr>
+      <w:r>
+        <w:rPr>
+          <w:rFonts w:hint="default" w:ascii="Times New Roman" w:hAnsi="Times New Roman" w:eastAsia="Courier New" w:cs="Times New Roman"/>
+          <w:sz w:val="28"/>
+          <w:szCs w:val="28"/>
+        </w:rPr>
+        <w:t xml:space="preserve">                queue_item["order_no"],</w:t>
+      </w:r>
+    </w:p>
+    <w:p>
+      <w:pPr>
+        <w:spacing w:after="0" w:line="240" w:lineRule="auto"/>
+        <w:rPr>
+          <w:rFonts w:hint="default" w:ascii="Times New Roman" w:hAnsi="Times New Roman" w:cs="Times New Roman"/>
+          <w:sz w:val="28"/>
+          <w:szCs w:val="28"/>
+        </w:rPr>
+      </w:pPr>
+      <w:r>
+        <w:rPr>
+          <w:rFonts w:hint="default" w:ascii="Times New Roman" w:hAnsi="Times New Roman" w:eastAsia="Courier New" w:cs="Times New Roman"/>
+          <w:sz w:val="28"/>
+          <w:szCs w:val="28"/>
+        </w:rPr>
+        <w:t xml:space="preserve">                queue_item["table"],</w:t>
+      </w:r>
+    </w:p>
+    <w:p>
+      <w:pPr>
+        <w:spacing w:after="0" w:line="240" w:lineRule="auto"/>
+        <w:rPr>
+          <w:rFonts w:hint="default" w:ascii="Times New Roman" w:hAnsi="Times New Roman" w:cs="Times New Roman"/>
+          <w:sz w:val="28"/>
+          <w:szCs w:val="28"/>
+        </w:rPr>
+      </w:pPr>
+      <w:r>
+        <w:rPr>
+          <w:rFonts w:hint="default" w:ascii="Times New Roman" w:hAnsi="Times New Roman" w:eastAsia="Courier New" w:cs="Times New Roman"/>
+          <w:sz w:val="28"/>
+          <w:szCs w:val="28"/>
+        </w:rPr>
+        <w:t xml:space="preserve">                queue_item.get("created", "-"),</w:t>
+      </w:r>
+    </w:p>
+    <w:p>
+      <w:pPr>
+        <w:spacing w:after="0" w:line="240" w:lineRule="auto"/>
+        <w:rPr>
+          <w:rFonts w:hint="default" w:ascii="Times New Roman" w:hAnsi="Times New Roman" w:cs="Times New Roman"/>
+          <w:sz w:val="28"/>
+          <w:szCs w:val="28"/>
+        </w:rPr>
+      </w:pPr>
+      <w:r>
+        <w:rPr>
+          <w:rFonts w:hint="default" w:ascii="Times New Roman" w:hAnsi="Times New Roman" w:eastAsia="Courier New" w:cs="Times New Roman"/>
+          <w:sz w:val="28"/>
+          <w:szCs w:val="28"/>
+        </w:rPr>
+        <w:t xml:space="preserve">                queue_item["items"],</w:t>
+      </w:r>
+    </w:p>
+    <w:p>
+      <w:pPr>
+        <w:spacing w:after="0" w:line="240" w:lineRule="auto"/>
+        <w:rPr>
+          <w:rFonts w:hint="default" w:ascii="Times New Roman" w:hAnsi="Times New Roman" w:cs="Times New Roman"/>
+          <w:sz w:val="28"/>
+          <w:szCs w:val="28"/>
+        </w:rPr>
+      </w:pPr>
+      <w:r>
+        <w:rPr>
+          <w:rFonts w:hint="default" w:ascii="Times New Roman" w:hAnsi="Times New Roman" w:eastAsia="Courier New" w:cs="Times New Roman"/>
+          <w:sz w:val="28"/>
+          <w:szCs w:val="28"/>
+        </w:rPr>
+        <w:t xml:space="preserve">                queue_item["status"],</w:t>
+      </w:r>
+    </w:p>
+    <w:p>
+      <w:pPr>
+        <w:spacing w:after="0" w:line="240" w:lineRule="auto"/>
+        <w:rPr>
+          <w:rFonts w:hint="default" w:ascii="Times New Roman" w:hAnsi="Times New Roman" w:cs="Times New Roman"/>
+          <w:sz w:val="28"/>
+          <w:szCs w:val="28"/>
+        </w:rPr>
+      </w:pPr>
+      <w:r>
+        <w:rPr>
+          <w:rFonts w:hint="default" w:ascii="Times New Roman" w:hAnsi="Times New Roman" w:eastAsia="Courier New" w:cs="Times New Roman"/>
+          <w:sz w:val="28"/>
+          <w:szCs w:val="28"/>
+        </w:rPr>
+        <w:t xml:space="preserve">            ]</w:t>
+      </w:r>
+    </w:p>
+    <w:p>
+      <w:pPr>
+        <w:spacing w:after="0" w:line="240" w:lineRule="auto"/>
+        <w:rPr>
+          <w:rFonts w:hint="default" w:ascii="Times New Roman" w:hAnsi="Times New Roman" w:cs="Times New Roman"/>
+          <w:sz w:val="28"/>
+          <w:szCs w:val="28"/>
+        </w:rPr>
+      </w:pPr>
+      <w:r>
+        <w:rPr>
+          <w:rFonts w:hint="default" w:ascii="Times New Roman" w:hAnsi="Times New Roman" w:eastAsia="Courier New" w:cs="Times New Roman"/>
+          <w:sz w:val="28"/>
+          <w:szCs w:val="28"/>
+        </w:rPr>
+        <w:t xml:space="preserve">        )</w:t>
+      </w:r>
+    </w:p>
+    <w:p>
+      <w:pPr>
+        <w:spacing w:after="0" w:line="240" w:lineRule="auto"/>
+        <w:rPr>
+          <w:rFonts w:hint="default" w:ascii="Times New Roman" w:hAnsi="Times New Roman" w:cs="Times New Roman"/>
+          <w:sz w:val="28"/>
+          <w:szCs w:val="28"/>
+        </w:rPr>
+      </w:pPr>
+      <w:r>
+        <w:rPr>
+          <w:rFonts w:hint="default" w:ascii="Times New Roman" w:hAnsi="Times New Roman" w:eastAsia="Courier New" w:cs="Times New Roman"/>
+          <w:sz w:val="28"/>
+          <w:szCs w:val="28"/>
+        </w:rPr>
+        <w:t xml:space="preserve">        for column_index, value in enumerate(values):</w:t>
+      </w:r>
+    </w:p>
+    <w:p>
+      <w:pPr>
+        <w:spacing w:after="0" w:line="240" w:lineRule="auto"/>
+        <w:rPr>
+          <w:rFonts w:hint="default" w:ascii="Times New Roman" w:hAnsi="Times New Roman" w:cs="Times New Roman"/>
+          <w:sz w:val="28"/>
+          <w:szCs w:val="28"/>
+        </w:rPr>
+      </w:pPr>
+      <w:r>
+        <w:rPr>
+          <w:rFonts w:hint="default" w:ascii="Times New Roman" w:hAnsi="Times New Roman" w:eastAsia="Courier New" w:cs="Times New Roman"/>
+          <w:sz w:val="28"/>
+          <w:szCs w:val="28"/>
+        </w:rPr>
+        <w:t xml:space="preserve">            item = QTableWidgetItem(str(value))</w:t>
+      </w:r>
+    </w:p>
+    <w:p>
+      <w:pPr>
+        <w:spacing w:after="0" w:line="240" w:lineRule="auto"/>
+        <w:rPr>
+          <w:rFonts w:hint="default" w:ascii="Times New Roman" w:hAnsi="Times New Roman" w:cs="Times New Roman"/>
+          <w:sz w:val="28"/>
+          <w:szCs w:val="28"/>
+        </w:rPr>
+      </w:pPr>
+      <w:r>
+        <w:rPr>
+          <w:rFonts w:hint="default" w:ascii="Times New Roman" w:hAnsi="Times New Roman" w:eastAsia="Courier New" w:cs="Times New Roman"/>
+          <w:sz w:val="28"/>
+          <w:szCs w:val="28"/>
+        </w:rPr>
+        <w:t xml:space="preserve">            item.setFlags(item.flags() &amp; ~Qt.ItemFlag.ItemIsEditable)</w:t>
+      </w:r>
+    </w:p>
+    <w:p>
+      <w:pPr>
+        <w:spacing w:after="0" w:line="240" w:lineRule="auto"/>
+        <w:rPr>
+          <w:rFonts w:hint="default" w:ascii="Times New Roman" w:hAnsi="Times New Roman" w:cs="Times New Roman"/>
+          <w:sz w:val="28"/>
+          <w:szCs w:val="28"/>
+        </w:rPr>
+      </w:pPr>
+      <w:r>
+        <w:rPr>
+          <w:rFonts w:hint="default" w:ascii="Times New Roman" w:hAnsi="Times New Roman" w:eastAsia="Courier New" w:cs="Times New Roman"/>
+          <w:sz w:val="28"/>
+          <w:szCs w:val="28"/>
+        </w:rPr>
+        <w:t xml:space="preserve">            item.setToolTip(str(value))</w:t>
+      </w:r>
+    </w:p>
+    <w:p>
+      <w:pPr>
+        <w:spacing w:after="0" w:line="240" w:lineRule="auto"/>
+        <w:rPr>
+          <w:rFonts w:hint="default" w:ascii="Times New Roman" w:hAnsi="Times New Roman" w:cs="Times New Roman"/>
+          <w:sz w:val="28"/>
+          <w:szCs w:val="28"/>
+        </w:rPr>
+      </w:pPr>
+      <w:r>
+        <w:rPr>
+          <w:rFonts w:hint="default" w:ascii="Times New Roman" w:hAnsi="Times New Roman" w:eastAsia="Courier New" w:cs="Times New Roman"/>
+          <w:sz w:val="28"/>
+          <w:szCs w:val="28"/>
+        </w:rPr>
+        <w:t xml:space="preserve">            if column_index == len(headers) - 1:</w:t>
+      </w:r>
+    </w:p>
+    <w:p>
+      <w:pPr>
+        <w:spacing w:after="0" w:line="240" w:lineRule="auto"/>
+        <w:rPr>
+          <w:rFonts w:hint="default" w:ascii="Times New Roman" w:hAnsi="Times New Roman" w:cs="Times New Roman"/>
+          <w:sz w:val="28"/>
+          <w:szCs w:val="28"/>
+        </w:rPr>
+      </w:pPr>
+      <w:r>
+        <w:rPr>
+          <w:rFonts w:hint="default" w:ascii="Times New Roman" w:hAnsi="Times New Roman" w:eastAsia="Courier New" w:cs="Times New Roman"/>
+          <w:sz w:val="28"/>
+          <w:szCs w:val="28"/>
+        </w:rPr>
+        <w:t xml:space="preserve">                tone = "warning"</w:t>
+      </w:r>
+    </w:p>
+    <w:p>
+      <w:pPr>
+        <w:spacing w:after="0" w:line="240" w:lineRule="auto"/>
+        <w:rPr>
+          <w:rFonts w:hint="default" w:ascii="Times New Roman" w:hAnsi="Times New Roman" w:cs="Times New Roman"/>
+          <w:sz w:val="28"/>
+          <w:szCs w:val="28"/>
+        </w:rPr>
+      </w:pPr>
+      <w:r>
+        <w:rPr>
+          <w:rFonts w:hint="default" w:ascii="Times New Roman" w:hAnsi="Times New Roman" w:eastAsia="Courier New" w:cs="Times New Roman"/>
+          <w:sz w:val="28"/>
+          <w:szCs w:val="28"/>
+        </w:rPr>
+        <w:t xml:space="preserve">                if value == "Готов":</w:t>
+      </w:r>
+    </w:p>
+    <w:p>
+      <w:pPr>
+        <w:spacing w:after="0" w:line="240" w:lineRule="auto"/>
+        <w:rPr>
+          <w:rFonts w:hint="default" w:ascii="Times New Roman" w:hAnsi="Times New Roman" w:cs="Times New Roman"/>
+          <w:sz w:val="28"/>
+          <w:szCs w:val="28"/>
+        </w:rPr>
+      </w:pPr>
+      <w:r>
+        <w:rPr>
+          <w:rFonts w:hint="default" w:ascii="Times New Roman" w:hAnsi="Times New Roman" w:eastAsia="Courier New" w:cs="Times New Roman"/>
+          <w:sz w:val="28"/>
+          <w:szCs w:val="28"/>
+        </w:rPr>
+        <w:t xml:space="preserve">                    tone = "success"</w:t>
+      </w:r>
+    </w:p>
+    <w:p>
+      <w:pPr>
+        <w:spacing w:after="0" w:line="240" w:lineRule="auto"/>
+        <w:rPr>
+          <w:rFonts w:hint="default" w:ascii="Times New Roman" w:hAnsi="Times New Roman" w:cs="Times New Roman"/>
+          <w:sz w:val="28"/>
+          <w:szCs w:val="28"/>
+        </w:rPr>
+      </w:pPr>
+      <w:r>
+        <w:rPr>
+          <w:rFonts w:hint="default" w:ascii="Times New Roman" w:hAnsi="Times New Roman" w:eastAsia="Courier New" w:cs="Times New Roman"/>
+          <w:sz w:val="28"/>
+          <w:szCs w:val="28"/>
+        </w:rPr>
+        <w:t xml:space="preserve">                elif value == "Выдан":</w:t>
+      </w:r>
+    </w:p>
+    <w:p>
+      <w:pPr>
+        <w:spacing w:after="0" w:line="240" w:lineRule="auto"/>
+        <w:rPr>
+          <w:rFonts w:hint="default" w:ascii="Times New Roman" w:hAnsi="Times New Roman" w:cs="Times New Roman"/>
+          <w:sz w:val="28"/>
+          <w:szCs w:val="28"/>
+        </w:rPr>
+      </w:pPr>
+      <w:r>
+        <w:rPr>
+          <w:rFonts w:hint="default" w:ascii="Times New Roman" w:hAnsi="Times New Roman" w:eastAsia="Courier New" w:cs="Times New Roman"/>
+          <w:sz w:val="28"/>
+          <w:szCs w:val="28"/>
+        </w:rPr>
+        <w:t xml:space="preserve">                    tone = "muted"</w:t>
+      </w:r>
+    </w:p>
+    <w:p>
+      <w:pPr>
+        <w:spacing w:after="0" w:line="240" w:lineRule="auto"/>
+        <w:rPr>
+          <w:rFonts w:hint="default" w:ascii="Times New Roman" w:hAnsi="Times New Roman" w:cs="Times New Roman"/>
+          <w:sz w:val="28"/>
+          <w:szCs w:val="28"/>
+        </w:rPr>
+      </w:pPr>
+      <w:r>
+        <w:rPr>
+          <w:rFonts w:hint="default" w:ascii="Times New Roman" w:hAnsi="Times New Roman" w:eastAsia="Courier New" w:cs="Times New Roman"/>
+          <w:sz w:val="28"/>
+          <w:szCs w:val="28"/>
+        </w:rPr>
+        <w:t xml:space="preserve">                elif value == "Готовится":</w:t>
+      </w:r>
+    </w:p>
+    <w:p>
+      <w:pPr>
+        <w:spacing w:after="0" w:line="240" w:lineRule="auto"/>
+        <w:rPr>
+          <w:rFonts w:hint="default" w:ascii="Times New Roman" w:hAnsi="Times New Roman" w:cs="Times New Roman"/>
+          <w:sz w:val="28"/>
+          <w:szCs w:val="28"/>
+        </w:rPr>
+      </w:pPr>
+      <w:r>
+        <w:rPr>
+          <w:rFonts w:hint="default" w:ascii="Times New Roman" w:hAnsi="Times New Roman" w:eastAsia="Courier New" w:cs="Times New Roman"/>
+          <w:sz w:val="28"/>
+          <w:szCs w:val="28"/>
+        </w:rPr>
+        <w:t xml:space="preserve">                    tone = "info"</w:t>
+      </w:r>
+    </w:p>
+    <w:p>
+      <w:pPr>
+        <w:spacing w:after="0" w:line="240" w:lineRule="auto"/>
+        <w:rPr>
+          <w:rFonts w:hint="default" w:ascii="Times New Roman" w:hAnsi="Times New Roman" w:cs="Times New Roman"/>
+          <w:sz w:val="28"/>
+          <w:szCs w:val="28"/>
+        </w:rPr>
+      </w:pPr>
+      <w:r>
+        <w:rPr>
+          <w:rFonts w:hint="default" w:ascii="Times New Roman" w:hAnsi="Times New Roman" w:eastAsia="Courier New" w:cs="Times New Roman"/>
+          <w:sz w:val="28"/>
+          <w:szCs w:val="28"/>
+        </w:rPr>
+        <w:t xml:space="preserve">                tint_table_item(item, tone)</w:t>
+      </w:r>
+    </w:p>
+    <w:p>
+      <w:pPr>
+        <w:spacing w:after="0" w:line="240" w:lineRule="auto"/>
+        <w:rPr>
+          <w:rFonts w:hint="default" w:ascii="Times New Roman" w:hAnsi="Times New Roman" w:cs="Times New Roman"/>
+          <w:sz w:val="28"/>
+          <w:szCs w:val="28"/>
+        </w:rPr>
+      </w:pPr>
+      <w:r>
+        <w:rPr>
+          <w:rFonts w:hint="default" w:ascii="Times New Roman" w:hAnsi="Times New Roman" w:eastAsia="Courier New" w:cs="Times New Roman"/>
+          <w:sz w:val="28"/>
+          <w:szCs w:val="28"/>
+        </w:rPr>
+        <w:t xml:space="preserve">            self.kitchen_table.setItem(row_index, column_index, item)</w:t>
+      </w:r>
+    </w:p>
+    <w:p>
+      <w:pPr>
+        <w:spacing w:after="0" w:line="240" w:lineRule="auto"/>
+        <w:rPr>
+          <w:rFonts w:hint="default" w:ascii="Times New Roman" w:hAnsi="Times New Roman" w:cs="Times New Roman"/>
+          <w:sz w:val="28"/>
+          <w:szCs w:val="28"/>
+        </w:rPr>
+      </w:pPr>
+      <w:r>
+        <w:rPr>
+          <w:rFonts w:hint="default" w:ascii="Times New Roman" w:hAnsi="Times New Roman" w:eastAsia="Courier New" w:cs="Times New Roman"/>
+          <w:sz w:val="28"/>
+          <w:szCs w:val="28"/>
+        </w:rPr>
+        <w:t xml:space="preserve">    if self.visible_queue_indices:</w:t>
+      </w:r>
+    </w:p>
+    <w:p>
+      <w:pPr>
+        <w:spacing w:after="0" w:line="240" w:lineRule="auto"/>
+        <w:rPr>
+          <w:rFonts w:hint="default" w:ascii="Times New Roman" w:hAnsi="Times New Roman" w:cs="Times New Roman"/>
+          <w:sz w:val="28"/>
+          <w:szCs w:val="28"/>
+        </w:rPr>
+      </w:pPr>
+      <w:r>
+        <w:rPr>
+          <w:rFonts w:hint="default" w:ascii="Times New Roman" w:hAnsi="Times New Roman" w:eastAsia="Courier New" w:cs="Times New Roman"/>
+          <w:sz w:val="28"/>
+          <w:szCs w:val="28"/>
+        </w:rPr>
+        <w:t xml:space="preserve">        self.kitchen_table.selectRow(0)</w:t>
+      </w:r>
+    </w:p>
+    <w:p>
+      <w:pPr>
+        <w:spacing w:after="0" w:line="240" w:lineRule="auto"/>
+        <w:rPr>
+          <w:rFonts w:hint="default" w:ascii="Times New Roman" w:hAnsi="Times New Roman" w:cs="Times New Roman"/>
+          <w:sz w:val="28"/>
+          <w:szCs w:val="28"/>
+        </w:rPr>
+      </w:pPr>
+      <w:r>
+        <w:rPr>
+          <w:rFonts w:hint="default" w:ascii="Times New Roman" w:hAnsi="Times New Roman" w:eastAsia="Courier New" w:cs="Times New Roman"/>
+          <w:sz w:val="28"/>
+          <w:szCs w:val="28"/>
+        </w:rPr>
+        <w:t xml:space="preserve"> </w:t>
+      </w:r>
+    </w:p>
+    <w:p>
+      <w:pPr>
+        <w:spacing w:after="0" w:line="240" w:lineRule="auto"/>
+        <w:rPr>
+          <w:rFonts w:hint="default" w:ascii="Times New Roman" w:hAnsi="Times New Roman" w:cs="Times New Roman"/>
+          <w:sz w:val="28"/>
+          <w:szCs w:val="28"/>
+        </w:rPr>
+      </w:pPr>
+      <w:r>
+        <w:rPr>
+          <w:rFonts w:hint="default" w:ascii="Times New Roman" w:hAnsi="Times New Roman" w:eastAsia="Courier New" w:cs="Times New Roman"/>
+          <w:sz w:val="28"/>
+          <w:szCs w:val="28"/>
+        </w:rPr>
+        <w:t xml:space="preserve">    self.update_kitchen_summary()</w:t>
+      </w:r>
+    </w:p>
+    <w:p>
+      <w:pPr>
+        <w:spacing w:after="0" w:line="240" w:lineRule="auto"/>
+        <w:rPr>
+          <w:rFonts w:hint="default" w:ascii="Times New Roman" w:hAnsi="Times New Roman" w:cs="Times New Roman"/>
+          <w:sz w:val="28"/>
+          <w:szCs w:val="28"/>
+        </w:rPr>
+      </w:pPr>
+      <w:r>
+        <w:rPr>
+          <w:rFonts w:hint="default" w:ascii="Times New Roman" w:hAnsi="Times New Roman" w:eastAsia="Courier New" w:cs="Times New Roman"/>
+          <w:sz w:val="28"/>
+          <w:szCs w:val="28"/>
+        </w:rPr>
+        <w:t xml:space="preserve">    self.update_kitchen_actions()</w:t>
+      </w:r>
+    </w:p>
+    <w:p>
+      <w:pPr>
+        <w:pStyle w:val="3"/>
+        <w:rPr>
+          <w:rFonts w:hint="default" w:ascii="Times New Roman" w:hAnsi="Times New Roman" w:cs="Times New Roman"/>
+          <w:sz w:val="28"/>
+          <w:szCs w:val="28"/>
+        </w:rPr>
+      </w:pPr>
+      <w:r>
+        <w:rPr>
+          <w:rFonts w:hint="default" w:ascii="Times New Roman" w:hAnsi="Times New Roman" w:cs="Times New Roman"/>
+          <w:sz w:val="28"/>
+          <w:szCs w:val="28"/>
+        </w:rPr>
+        <w:t>А.4 OrdersPage.update_kitchen_summary</w:t>
+      </w:r>
+    </w:p>
+    <w:p>
+      <w:pPr>
+        <w:rPr>
+          <w:rFonts w:hint="default" w:ascii="Times New Roman" w:hAnsi="Times New Roman" w:cs="Times New Roman"/>
+          <w:sz w:val="28"/>
+          <w:szCs w:val="28"/>
+        </w:rPr>
+      </w:pPr>
+      <w:r>
+        <w:rPr>
+          <w:rFonts w:hint="default" w:ascii="Times New Roman" w:hAnsi="Times New Roman" w:cs="Times New Roman"/>
+          <w:b/>
+          <w:sz w:val="28"/>
+          <w:szCs w:val="28"/>
+        </w:rPr>
+        <w:t xml:space="preserve">Файл: </w:t>
+      </w:r>
+      <w:r>
+        <w:rPr>
+          <w:rFonts w:hint="default" w:ascii="Times New Roman" w:hAnsi="Times New Roman" w:cs="Times New Roman"/>
+          <w:sz w:val="28"/>
+          <w:szCs w:val="28"/>
+        </w:rPr>
+        <w:t>gastrosoft_app/pages/orders_page.py</w:t>
+      </w:r>
+    </w:p>
+    <w:p>
+      <w:pPr>
+        <w:spacing w:after="0" w:line="240" w:lineRule="auto"/>
+        <w:rPr>
+          <w:rFonts w:hint="default" w:ascii="Times New Roman" w:hAnsi="Times New Roman" w:cs="Times New Roman"/>
+          <w:sz w:val="28"/>
+          <w:szCs w:val="28"/>
+        </w:rPr>
+      </w:pPr>
+      <w:r>
+        <w:rPr>
+          <w:rFonts w:hint="default" w:ascii="Times New Roman" w:hAnsi="Times New Roman" w:eastAsia="Courier New" w:cs="Times New Roman"/>
+          <w:sz w:val="28"/>
+          <w:szCs w:val="28"/>
+        </w:rPr>
+        <w:t>def update_kitchen_summary(self) -&gt; None:</w:t>
+      </w:r>
+    </w:p>
+    <w:p>
+      <w:pPr>
+        <w:spacing w:after="0" w:line="240" w:lineRule="auto"/>
+        <w:rPr>
+          <w:rFonts w:hint="default" w:ascii="Times New Roman" w:hAnsi="Times New Roman" w:cs="Times New Roman"/>
+          <w:sz w:val="28"/>
+          <w:szCs w:val="28"/>
+        </w:rPr>
+      </w:pPr>
+      <w:r>
+        <w:rPr>
+          <w:rFonts w:hint="default" w:ascii="Times New Roman" w:hAnsi="Times New Roman" w:eastAsia="Courier New" w:cs="Times New Roman"/>
+          <w:sz w:val="28"/>
+          <w:szCs w:val="28"/>
+        </w:rPr>
+        <w:t xml:space="preserve">    counts = {</w:t>
+      </w:r>
+    </w:p>
+    <w:p>
+      <w:pPr>
+        <w:spacing w:after="0" w:line="240" w:lineRule="auto"/>
+        <w:rPr>
+          <w:rFonts w:hint="default" w:ascii="Times New Roman" w:hAnsi="Times New Roman" w:cs="Times New Roman"/>
+          <w:sz w:val="28"/>
+          <w:szCs w:val="28"/>
+        </w:rPr>
+      </w:pPr>
+      <w:r>
+        <w:rPr>
+          <w:rFonts w:hint="default" w:ascii="Times New Roman" w:hAnsi="Times New Roman" w:eastAsia="Courier New" w:cs="Times New Roman"/>
+          <w:sz w:val="28"/>
+          <w:szCs w:val="28"/>
+        </w:rPr>
+        <w:t xml:space="preserve">        status: len([item for item in self.store.kitchen_queue if item["status"] == status])</w:t>
+      </w:r>
+    </w:p>
+    <w:p>
+      <w:pPr>
+        <w:spacing w:after="0" w:line="240" w:lineRule="auto"/>
+        <w:rPr>
+          <w:rFonts w:hint="default" w:ascii="Times New Roman" w:hAnsi="Times New Roman" w:cs="Times New Roman"/>
+          <w:sz w:val="28"/>
+          <w:szCs w:val="28"/>
+        </w:rPr>
+      </w:pPr>
+      <w:r>
+        <w:rPr>
+          <w:rFonts w:hint="default" w:ascii="Times New Roman" w:hAnsi="Times New Roman" w:eastAsia="Courier New" w:cs="Times New Roman"/>
+          <w:sz w:val="28"/>
+          <w:szCs w:val="28"/>
+        </w:rPr>
+        <w:t xml:space="preserve">        for status in KITCHEN_ACTIVE_STATUSES</w:t>
+      </w:r>
+    </w:p>
+    <w:p>
+      <w:pPr>
+        <w:spacing w:after="0" w:line="240" w:lineRule="auto"/>
+        <w:rPr>
+          <w:rFonts w:hint="default" w:ascii="Times New Roman" w:hAnsi="Times New Roman" w:cs="Times New Roman"/>
+          <w:sz w:val="28"/>
+          <w:szCs w:val="28"/>
+        </w:rPr>
+      </w:pPr>
+      <w:r>
+        <w:rPr>
+          <w:rFonts w:hint="default" w:ascii="Times New Roman" w:hAnsi="Times New Roman" w:eastAsia="Courier New" w:cs="Times New Roman"/>
+          <w:sz w:val="28"/>
+          <w:szCs w:val="28"/>
+        </w:rPr>
+        <w:t xml:space="preserve">    }</w:t>
+      </w:r>
+    </w:p>
+    <w:p>
+      <w:pPr>
+        <w:spacing w:after="0" w:line="240" w:lineRule="auto"/>
+        <w:rPr>
+          <w:rFonts w:hint="default" w:ascii="Times New Roman" w:hAnsi="Times New Roman" w:cs="Times New Roman"/>
+          <w:sz w:val="28"/>
+          <w:szCs w:val="28"/>
+        </w:rPr>
+      </w:pPr>
+      <w:r>
+        <w:rPr>
+          <w:rFonts w:hint="default" w:ascii="Times New Roman" w:hAnsi="Times New Roman" w:eastAsia="Courier New" w:cs="Times New Roman"/>
+          <w:sz w:val="28"/>
+          <w:szCs w:val="28"/>
+        </w:rPr>
+        <w:t xml:space="preserve">    self.summary_pills["accepted"].set_state(f"Принято: {counts['Принят']}", "warning")</w:t>
+      </w:r>
+    </w:p>
+    <w:p>
+      <w:pPr>
+        <w:spacing w:after="0" w:line="240" w:lineRule="auto"/>
+        <w:rPr>
+          <w:rFonts w:hint="default" w:ascii="Times New Roman" w:hAnsi="Times New Roman" w:cs="Times New Roman"/>
+          <w:sz w:val="28"/>
+          <w:szCs w:val="28"/>
+        </w:rPr>
+      </w:pPr>
+      <w:r>
+        <w:rPr>
+          <w:rFonts w:hint="default" w:ascii="Times New Roman" w:hAnsi="Times New Roman" w:eastAsia="Courier New" w:cs="Times New Roman"/>
+          <w:sz w:val="28"/>
+          <w:szCs w:val="28"/>
+        </w:rPr>
+        <w:t xml:space="preserve">    self.summary_pills["preparing"].set_state(f"В работе: {counts['Готовится']}", "info")</w:t>
+      </w:r>
+    </w:p>
+    <w:p>
+      <w:pPr>
+        <w:spacing w:after="0" w:line="240" w:lineRule="auto"/>
+        <w:rPr>
+          <w:rFonts w:hint="default" w:ascii="Times New Roman" w:hAnsi="Times New Roman" w:cs="Times New Roman"/>
+          <w:sz w:val="28"/>
+          <w:szCs w:val="28"/>
+        </w:rPr>
+      </w:pPr>
+      <w:r>
+        <w:rPr>
+          <w:rFonts w:hint="default" w:ascii="Times New Roman" w:hAnsi="Times New Roman" w:eastAsia="Courier New" w:cs="Times New Roman"/>
+          <w:sz w:val="28"/>
+          <w:szCs w:val="28"/>
+        </w:rPr>
+        <w:t xml:space="preserve">    self.summary_pills["ready"].set_state(f"Готово: {counts['Готов']}", "success")</w:t>
+      </w:r>
+    </w:p>
+    <w:p>
+      <w:pPr>
+        <w:pStyle w:val="3"/>
+        <w:rPr>
+          <w:rFonts w:hint="default" w:ascii="Times New Roman" w:hAnsi="Times New Roman" w:cs="Times New Roman"/>
+          <w:sz w:val="28"/>
+          <w:szCs w:val="28"/>
+        </w:rPr>
+      </w:pPr>
+      <w:r>
+        <w:rPr>
+          <w:rFonts w:hint="default" w:ascii="Times New Roman" w:hAnsi="Times New Roman" w:cs="Times New Roman"/>
+          <w:sz w:val="28"/>
+          <w:szCs w:val="28"/>
+        </w:rPr>
+        <w:t>А.5 OrdersPage.update_kitchen_actions</w:t>
+      </w:r>
+    </w:p>
+    <w:p>
+      <w:pPr>
+        <w:rPr>
+          <w:rFonts w:hint="default" w:ascii="Times New Roman" w:hAnsi="Times New Roman" w:cs="Times New Roman"/>
+          <w:sz w:val="28"/>
+          <w:szCs w:val="28"/>
+        </w:rPr>
+      </w:pPr>
+      <w:r>
+        <w:rPr>
+          <w:rFonts w:hint="default" w:ascii="Times New Roman" w:hAnsi="Times New Roman" w:cs="Times New Roman"/>
+          <w:b/>
+          <w:sz w:val="28"/>
+          <w:szCs w:val="28"/>
+        </w:rPr>
+        <w:t xml:space="preserve">Файл: </w:t>
+      </w:r>
+      <w:r>
+        <w:rPr>
+          <w:rFonts w:hint="default" w:ascii="Times New Roman" w:hAnsi="Times New Roman" w:cs="Times New Roman"/>
+          <w:sz w:val="28"/>
+          <w:szCs w:val="28"/>
+        </w:rPr>
+        <w:t>gastrosoft_app/pages/orders_page.py</w:t>
+      </w:r>
+    </w:p>
+    <w:p>
+      <w:pPr>
+        <w:spacing w:after="0" w:line="240" w:lineRule="auto"/>
+        <w:rPr>
+          <w:rFonts w:hint="default" w:ascii="Times New Roman" w:hAnsi="Times New Roman" w:cs="Times New Roman"/>
+          <w:sz w:val="28"/>
+          <w:szCs w:val="28"/>
+        </w:rPr>
+      </w:pPr>
+      <w:r>
+        <w:rPr>
+          <w:rFonts w:hint="default" w:ascii="Times New Roman" w:hAnsi="Times New Roman" w:eastAsia="Courier New" w:cs="Times New Roman"/>
+          <w:sz w:val="28"/>
+          <w:szCs w:val="28"/>
+        </w:rPr>
+        <w:t>def update_kitchen_actions(self) -&gt; None:</w:t>
+      </w:r>
+    </w:p>
+    <w:p>
+      <w:pPr>
+        <w:spacing w:after="0" w:line="240" w:lineRule="auto"/>
+        <w:rPr>
+          <w:rFonts w:hint="default" w:ascii="Times New Roman" w:hAnsi="Times New Roman" w:cs="Times New Roman"/>
+          <w:sz w:val="28"/>
+          <w:szCs w:val="28"/>
+        </w:rPr>
+      </w:pPr>
+      <w:r>
+        <w:rPr>
+          <w:rFonts w:hint="default" w:ascii="Times New Roman" w:hAnsi="Times New Roman" w:eastAsia="Courier New" w:cs="Times New Roman"/>
+          <w:sz w:val="28"/>
+          <w:szCs w:val="28"/>
+        </w:rPr>
+        <w:t xml:space="preserve">    role = self._current_role()</w:t>
+      </w:r>
+    </w:p>
+    <w:p>
+      <w:pPr>
+        <w:spacing w:after="0" w:line="240" w:lineRule="auto"/>
+        <w:rPr>
+          <w:rFonts w:hint="default" w:ascii="Times New Roman" w:hAnsi="Times New Roman" w:cs="Times New Roman"/>
+          <w:sz w:val="28"/>
+          <w:szCs w:val="28"/>
+        </w:rPr>
+      </w:pPr>
+      <w:r>
+        <w:rPr>
+          <w:rFonts w:hint="default" w:ascii="Times New Roman" w:hAnsi="Times New Roman" w:eastAsia="Courier New" w:cs="Times New Roman"/>
+          <w:sz w:val="28"/>
+          <w:szCs w:val="28"/>
+        </w:rPr>
+        <w:t xml:space="preserve">    if not can_process_kitchen(role):</w:t>
+      </w:r>
+    </w:p>
+    <w:p>
+      <w:pPr>
+        <w:spacing w:after="0" w:line="240" w:lineRule="auto"/>
+        <w:rPr>
+          <w:rFonts w:hint="default" w:ascii="Times New Roman" w:hAnsi="Times New Roman" w:cs="Times New Roman"/>
+          <w:sz w:val="28"/>
+          <w:szCs w:val="28"/>
+        </w:rPr>
+      </w:pPr>
+      <w:r>
+        <w:rPr>
+          <w:rFonts w:hint="default" w:ascii="Times New Roman" w:hAnsi="Times New Roman" w:eastAsia="Courier New" w:cs="Times New Roman"/>
+          <w:sz w:val="28"/>
+          <w:szCs w:val="28"/>
+        </w:rPr>
+        <w:t xml:space="preserve">        self.next_status_button.setEnabled(False)</w:t>
+      </w:r>
+    </w:p>
+    <w:p>
+      <w:pPr>
+        <w:spacing w:after="0" w:line="240" w:lineRule="auto"/>
+        <w:rPr>
+          <w:rFonts w:hint="default" w:ascii="Times New Roman" w:hAnsi="Times New Roman" w:cs="Times New Roman"/>
+          <w:sz w:val="28"/>
+          <w:szCs w:val="28"/>
+        </w:rPr>
+      </w:pPr>
+      <w:r>
+        <w:rPr>
+          <w:rFonts w:hint="default" w:ascii="Times New Roman" w:hAnsi="Times New Roman" w:eastAsia="Courier New" w:cs="Times New Roman"/>
+          <w:sz w:val="28"/>
+          <w:szCs w:val="28"/>
+        </w:rPr>
+        <w:t xml:space="preserve">        self.close_order_button.setEnabled(self._selected_queue_index() &gt;= 0 and can_close_orders(role))</w:t>
+      </w:r>
+    </w:p>
+    <w:p>
+      <w:pPr>
+        <w:spacing w:after="0" w:line="240" w:lineRule="auto"/>
+        <w:rPr>
+          <w:rFonts w:hint="default" w:ascii="Times New Roman" w:hAnsi="Times New Roman" w:cs="Times New Roman"/>
+          <w:sz w:val="28"/>
+          <w:szCs w:val="28"/>
+        </w:rPr>
+      </w:pPr>
+      <w:r>
+        <w:rPr>
+          <w:rFonts w:hint="default" w:ascii="Times New Roman" w:hAnsi="Times New Roman" w:eastAsia="Courier New" w:cs="Times New Roman"/>
+          <w:sz w:val="28"/>
+          <w:szCs w:val="28"/>
+        </w:rPr>
+        <w:t xml:space="preserve">        return</w:t>
+      </w:r>
+    </w:p>
+    <w:p>
+      <w:pPr>
+        <w:spacing w:after="0" w:line="240" w:lineRule="auto"/>
+        <w:rPr>
+          <w:rFonts w:hint="default" w:ascii="Times New Roman" w:hAnsi="Times New Roman" w:cs="Times New Roman"/>
+          <w:sz w:val="28"/>
+          <w:szCs w:val="28"/>
+        </w:rPr>
+      </w:pPr>
+      <w:r>
+        <w:rPr>
+          <w:rFonts w:hint="default" w:ascii="Times New Roman" w:hAnsi="Times New Roman" w:eastAsia="Courier New" w:cs="Times New Roman"/>
+          <w:sz w:val="28"/>
+          <w:szCs w:val="28"/>
+        </w:rPr>
+        <w:t xml:space="preserve"> </w:t>
+      </w:r>
+    </w:p>
+    <w:p>
+      <w:pPr>
+        <w:spacing w:after="0" w:line="240" w:lineRule="auto"/>
+        <w:rPr>
+          <w:rFonts w:hint="default" w:ascii="Times New Roman" w:hAnsi="Times New Roman" w:cs="Times New Roman"/>
+          <w:sz w:val="28"/>
+          <w:szCs w:val="28"/>
+        </w:rPr>
+      </w:pPr>
+      <w:r>
+        <w:rPr>
+          <w:rFonts w:hint="default" w:ascii="Times New Roman" w:hAnsi="Times New Roman" w:eastAsia="Courier New" w:cs="Times New Roman"/>
+          <w:sz w:val="28"/>
+          <w:szCs w:val="28"/>
+        </w:rPr>
+        <w:t xml:space="preserve">    queue_index = self._selected_queue_index()</w:t>
+      </w:r>
+    </w:p>
+    <w:p>
+      <w:pPr>
+        <w:spacing w:after="0" w:line="240" w:lineRule="auto"/>
+        <w:rPr>
+          <w:rFonts w:hint="default" w:ascii="Times New Roman" w:hAnsi="Times New Roman" w:cs="Times New Roman"/>
+          <w:sz w:val="28"/>
+          <w:szCs w:val="28"/>
+        </w:rPr>
+      </w:pPr>
+      <w:r>
+        <w:rPr>
+          <w:rFonts w:hint="default" w:ascii="Times New Roman" w:hAnsi="Times New Roman" w:eastAsia="Courier New" w:cs="Times New Roman"/>
+          <w:sz w:val="28"/>
+          <w:szCs w:val="28"/>
+        </w:rPr>
+        <w:t xml:space="preserve">    if queue_index &lt; 0:</w:t>
+      </w:r>
+    </w:p>
+    <w:p>
+      <w:pPr>
+        <w:spacing w:after="0" w:line="240" w:lineRule="auto"/>
+        <w:rPr>
+          <w:rFonts w:hint="default" w:ascii="Times New Roman" w:hAnsi="Times New Roman" w:cs="Times New Roman"/>
+          <w:sz w:val="28"/>
+          <w:szCs w:val="28"/>
+        </w:rPr>
+      </w:pPr>
+      <w:r>
+        <w:rPr>
+          <w:rFonts w:hint="default" w:ascii="Times New Roman" w:hAnsi="Times New Roman" w:eastAsia="Courier New" w:cs="Times New Roman"/>
+          <w:sz w:val="28"/>
+          <w:szCs w:val="28"/>
+        </w:rPr>
+        <w:t xml:space="preserve">        self.next_status_button.setText("Выбери заказ")</w:t>
+      </w:r>
+    </w:p>
+    <w:p>
+      <w:pPr>
+        <w:spacing w:after="0" w:line="240" w:lineRule="auto"/>
+        <w:rPr>
+          <w:rFonts w:hint="default" w:ascii="Times New Roman" w:hAnsi="Times New Roman" w:cs="Times New Roman"/>
+          <w:sz w:val="28"/>
+          <w:szCs w:val="28"/>
+        </w:rPr>
+      </w:pPr>
+      <w:r>
+        <w:rPr>
+          <w:rFonts w:hint="default" w:ascii="Times New Roman" w:hAnsi="Times New Roman" w:eastAsia="Courier New" w:cs="Times New Roman"/>
+          <w:sz w:val="28"/>
+          <w:szCs w:val="28"/>
+        </w:rPr>
+        <w:t xml:space="preserve">        self.next_status_button.setEnabled(False)</w:t>
+      </w:r>
+    </w:p>
+    <w:p>
+      <w:pPr>
+        <w:spacing w:after="0" w:line="240" w:lineRule="auto"/>
+        <w:rPr>
+          <w:rFonts w:hint="default" w:ascii="Times New Roman" w:hAnsi="Times New Roman" w:cs="Times New Roman"/>
+          <w:sz w:val="28"/>
+          <w:szCs w:val="28"/>
+        </w:rPr>
+      </w:pPr>
+      <w:r>
+        <w:rPr>
+          <w:rFonts w:hint="default" w:ascii="Times New Roman" w:hAnsi="Times New Roman" w:eastAsia="Courier New" w:cs="Times New Roman"/>
+          <w:sz w:val="28"/>
+          <w:szCs w:val="28"/>
+        </w:rPr>
+        <w:t xml:space="preserve">        return</w:t>
+      </w:r>
+    </w:p>
+    <w:p>
+      <w:pPr>
+        <w:spacing w:after="0" w:line="240" w:lineRule="auto"/>
+        <w:rPr>
+          <w:rFonts w:hint="default" w:ascii="Times New Roman" w:hAnsi="Times New Roman" w:cs="Times New Roman"/>
+          <w:sz w:val="28"/>
+          <w:szCs w:val="28"/>
+        </w:rPr>
+      </w:pPr>
+      <w:r>
+        <w:rPr>
+          <w:rFonts w:hint="default" w:ascii="Times New Roman" w:hAnsi="Times New Roman" w:eastAsia="Courier New" w:cs="Times New Roman"/>
+          <w:sz w:val="28"/>
+          <w:szCs w:val="28"/>
+        </w:rPr>
+        <w:t xml:space="preserve"> </w:t>
+      </w:r>
+    </w:p>
+    <w:p>
+      <w:pPr>
+        <w:spacing w:after="0" w:line="240" w:lineRule="auto"/>
+        <w:rPr>
+          <w:rFonts w:hint="default" w:ascii="Times New Roman" w:hAnsi="Times New Roman" w:cs="Times New Roman"/>
+          <w:sz w:val="28"/>
+          <w:szCs w:val="28"/>
+        </w:rPr>
+      </w:pPr>
+      <w:r>
+        <w:rPr>
+          <w:rFonts w:hint="default" w:ascii="Times New Roman" w:hAnsi="Times New Roman" w:eastAsia="Courier New" w:cs="Times New Roman"/>
+          <w:sz w:val="28"/>
+          <w:szCs w:val="28"/>
+        </w:rPr>
+        <w:t xml:space="preserve">    status = self.store.kitchen_queue[queue_index]["status"]</w:t>
+      </w:r>
+    </w:p>
+    <w:p>
+      <w:pPr>
+        <w:spacing w:after="0" w:line="240" w:lineRule="auto"/>
+        <w:rPr>
+          <w:rFonts w:hint="default" w:ascii="Times New Roman" w:hAnsi="Times New Roman" w:cs="Times New Roman"/>
+          <w:sz w:val="28"/>
+          <w:szCs w:val="28"/>
+        </w:rPr>
+      </w:pPr>
+      <w:r>
+        <w:rPr>
+          <w:rFonts w:hint="default" w:ascii="Times New Roman" w:hAnsi="Times New Roman" w:eastAsia="Courier New" w:cs="Times New Roman"/>
+          <w:sz w:val="28"/>
+          <w:szCs w:val="28"/>
+        </w:rPr>
+        <w:t xml:space="preserve">    next_actions = {</w:t>
+      </w:r>
+    </w:p>
+    <w:p>
+      <w:pPr>
+        <w:spacing w:after="0" w:line="240" w:lineRule="auto"/>
+        <w:rPr>
+          <w:rFonts w:hint="default" w:ascii="Times New Roman" w:hAnsi="Times New Roman" w:cs="Times New Roman"/>
+          <w:sz w:val="28"/>
+          <w:szCs w:val="28"/>
+        </w:rPr>
+      </w:pPr>
+      <w:r>
+        <w:rPr>
+          <w:rFonts w:hint="default" w:ascii="Times New Roman" w:hAnsi="Times New Roman" w:eastAsia="Courier New" w:cs="Times New Roman"/>
+          <w:sz w:val="28"/>
+          <w:szCs w:val="28"/>
+        </w:rPr>
+        <w:t xml:space="preserve">        "Принят": ("Взять в работу", True),</w:t>
+      </w:r>
+    </w:p>
+    <w:p>
+      <w:pPr>
+        <w:spacing w:after="0" w:line="240" w:lineRule="auto"/>
+        <w:rPr>
+          <w:rFonts w:hint="default" w:ascii="Times New Roman" w:hAnsi="Times New Roman" w:cs="Times New Roman"/>
+          <w:sz w:val="28"/>
+          <w:szCs w:val="28"/>
+        </w:rPr>
+      </w:pPr>
+      <w:r>
+        <w:rPr>
+          <w:rFonts w:hint="default" w:ascii="Times New Roman" w:hAnsi="Times New Roman" w:eastAsia="Courier New" w:cs="Times New Roman"/>
+          <w:sz w:val="28"/>
+          <w:szCs w:val="28"/>
+        </w:rPr>
+        <w:t xml:space="preserve">        "Готовится": ("Отметить готовым", True),</w:t>
+      </w:r>
+    </w:p>
+    <w:p>
+      <w:pPr>
+        <w:spacing w:after="0" w:line="240" w:lineRule="auto"/>
+        <w:rPr>
+          <w:rFonts w:hint="default" w:ascii="Times New Roman" w:hAnsi="Times New Roman" w:cs="Times New Roman"/>
+          <w:sz w:val="28"/>
+          <w:szCs w:val="28"/>
+        </w:rPr>
+      </w:pPr>
+      <w:r>
+        <w:rPr>
+          <w:rFonts w:hint="default" w:ascii="Times New Roman" w:hAnsi="Times New Roman" w:eastAsia="Courier New" w:cs="Times New Roman"/>
+          <w:sz w:val="28"/>
+          <w:szCs w:val="28"/>
+        </w:rPr>
+        <w:t xml:space="preserve">        "Готов": ("Заказ готов", False),</w:t>
+      </w:r>
+    </w:p>
+    <w:p>
+      <w:pPr>
+        <w:spacing w:after="0" w:line="240" w:lineRule="auto"/>
+        <w:rPr>
+          <w:rFonts w:hint="default" w:ascii="Times New Roman" w:hAnsi="Times New Roman" w:cs="Times New Roman"/>
+          <w:sz w:val="28"/>
+          <w:szCs w:val="28"/>
+        </w:rPr>
+      </w:pPr>
+      <w:r>
+        <w:rPr>
+          <w:rFonts w:hint="default" w:ascii="Times New Roman" w:hAnsi="Times New Roman" w:eastAsia="Courier New" w:cs="Times New Roman"/>
+          <w:sz w:val="28"/>
+          <w:szCs w:val="28"/>
+        </w:rPr>
+        <w:t xml:space="preserve">        "Выдан": ("Уже выдан", False),</w:t>
+      </w:r>
+    </w:p>
+    <w:p>
+      <w:pPr>
+        <w:spacing w:after="0" w:line="240" w:lineRule="auto"/>
+        <w:rPr>
+          <w:rFonts w:hint="default" w:ascii="Times New Roman" w:hAnsi="Times New Roman" w:cs="Times New Roman"/>
+          <w:sz w:val="28"/>
+          <w:szCs w:val="28"/>
+        </w:rPr>
+      </w:pPr>
+      <w:r>
+        <w:rPr>
+          <w:rFonts w:hint="default" w:ascii="Times New Roman" w:hAnsi="Times New Roman" w:eastAsia="Courier New" w:cs="Times New Roman"/>
+          <w:sz w:val="28"/>
+          <w:szCs w:val="28"/>
+        </w:rPr>
+        <w:t xml:space="preserve">    }</w:t>
+      </w:r>
+    </w:p>
+    <w:p>
+      <w:pPr>
+        <w:spacing w:after="0" w:line="240" w:lineRule="auto"/>
+        <w:rPr>
+          <w:rFonts w:hint="default" w:ascii="Times New Roman" w:hAnsi="Times New Roman" w:cs="Times New Roman"/>
+          <w:sz w:val="28"/>
+          <w:szCs w:val="28"/>
+        </w:rPr>
+      </w:pPr>
+      <w:r>
+        <w:rPr>
+          <w:rFonts w:hint="default" w:ascii="Times New Roman" w:hAnsi="Times New Roman" w:eastAsia="Courier New" w:cs="Times New Roman"/>
+          <w:sz w:val="28"/>
+          <w:szCs w:val="28"/>
+        </w:rPr>
+        <w:t xml:space="preserve">    text, enabled = next_actions.get(status, ("Следующий этап", True))</w:t>
+      </w:r>
+    </w:p>
+    <w:p>
+      <w:pPr>
+        <w:spacing w:after="0" w:line="240" w:lineRule="auto"/>
+        <w:rPr>
+          <w:rFonts w:hint="default" w:ascii="Times New Roman" w:hAnsi="Times New Roman" w:cs="Times New Roman"/>
+          <w:sz w:val="28"/>
+          <w:szCs w:val="28"/>
+        </w:rPr>
+      </w:pPr>
+      <w:r>
+        <w:rPr>
+          <w:rFonts w:hint="default" w:ascii="Times New Roman" w:hAnsi="Times New Roman" w:eastAsia="Courier New" w:cs="Times New Roman"/>
+          <w:sz w:val="28"/>
+          <w:szCs w:val="28"/>
+        </w:rPr>
+        <w:t xml:space="preserve">    self.next_status_button.setText(text)</w:t>
+      </w:r>
+    </w:p>
+    <w:p>
+      <w:pPr>
+        <w:spacing w:after="0" w:line="240" w:lineRule="auto"/>
+        <w:rPr>
+          <w:rFonts w:hint="default" w:ascii="Times New Roman" w:hAnsi="Times New Roman" w:cs="Times New Roman"/>
+          <w:sz w:val="28"/>
+          <w:szCs w:val="28"/>
+        </w:rPr>
+      </w:pPr>
+      <w:r>
+        <w:rPr>
+          <w:rFonts w:hint="default" w:ascii="Times New Roman" w:hAnsi="Times New Roman" w:eastAsia="Courier New" w:cs="Times New Roman"/>
+          <w:sz w:val="28"/>
+          <w:szCs w:val="28"/>
+        </w:rPr>
+        <w:t xml:space="preserve">    self.next_status_button.setEnabled(enabled)</w:t>
+      </w:r>
+    </w:p>
+    <w:p>
+      <w:pPr>
+        <w:pStyle w:val="3"/>
+        <w:rPr>
+          <w:rFonts w:hint="default" w:ascii="Times New Roman" w:hAnsi="Times New Roman" w:cs="Times New Roman"/>
+          <w:sz w:val="28"/>
+          <w:szCs w:val="28"/>
+        </w:rPr>
+      </w:pPr>
+      <w:r>
+        <w:rPr>
+          <w:rFonts w:hint="default" w:ascii="Times New Roman" w:hAnsi="Times New Roman" w:cs="Times New Roman"/>
+          <w:sz w:val="28"/>
+          <w:szCs w:val="28"/>
+        </w:rPr>
+        <w:t>А.6 MySQLBackedStore.advance_kitchen_order</w:t>
+      </w:r>
+    </w:p>
+    <w:p>
+      <w:pPr>
+        <w:rPr>
+          <w:rFonts w:hint="default" w:ascii="Times New Roman" w:hAnsi="Times New Roman" w:cs="Times New Roman"/>
+          <w:sz w:val="28"/>
+          <w:szCs w:val="28"/>
+        </w:rPr>
+      </w:pPr>
+      <w:r>
+        <w:rPr>
+          <w:rFonts w:hint="default" w:ascii="Times New Roman" w:hAnsi="Times New Roman" w:cs="Times New Roman"/>
+          <w:b/>
+          <w:sz w:val="28"/>
+          <w:szCs w:val="28"/>
+        </w:rPr>
+        <w:t xml:space="preserve">Файл: </w:t>
+      </w:r>
+      <w:r>
+        <w:rPr>
+          <w:rFonts w:hint="default" w:ascii="Times New Roman" w:hAnsi="Times New Roman" w:cs="Times New Roman"/>
+          <w:sz w:val="28"/>
+          <w:szCs w:val="28"/>
+        </w:rPr>
+        <w:t>gastrosoft_app/mysql_store.py</w:t>
+      </w:r>
+    </w:p>
+    <w:p>
+      <w:pPr>
+        <w:spacing w:after="0" w:line="240" w:lineRule="auto"/>
+        <w:rPr>
+          <w:rFonts w:hint="default" w:ascii="Times New Roman" w:hAnsi="Times New Roman" w:cs="Times New Roman"/>
+          <w:sz w:val="28"/>
+          <w:szCs w:val="28"/>
+        </w:rPr>
+      </w:pPr>
+      <w:r>
+        <w:rPr>
+          <w:rFonts w:hint="default" w:ascii="Times New Roman" w:hAnsi="Times New Roman" w:eastAsia="Courier New" w:cs="Times New Roman"/>
+          <w:sz w:val="28"/>
+          <w:szCs w:val="28"/>
+        </w:rPr>
+        <w:t>def advance_kitchen_order(self, index: int) -&gt; str:</w:t>
+      </w:r>
+    </w:p>
+    <w:p>
+      <w:pPr>
+        <w:spacing w:after="0" w:line="240" w:lineRule="auto"/>
+        <w:rPr>
+          <w:rFonts w:hint="default" w:ascii="Times New Roman" w:hAnsi="Times New Roman" w:cs="Times New Roman"/>
+          <w:sz w:val="28"/>
+          <w:szCs w:val="28"/>
+        </w:rPr>
+      </w:pPr>
+      <w:r>
+        <w:rPr>
+          <w:rFonts w:hint="default" w:ascii="Times New Roman" w:hAnsi="Times New Roman" w:eastAsia="Courier New" w:cs="Times New Roman"/>
+          <w:sz w:val="28"/>
+          <w:szCs w:val="28"/>
+        </w:rPr>
+        <w:t xml:space="preserve">    if not self.mysql_enabled or index &lt; 0 or index &gt;= len(self.kitchen_queue):</w:t>
+      </w:r>
+    </w:p>
+    <w:p>
+      <w:pPr>
+        <w:spacing w:after="0" w:line="240" w:lineRule="auto"/>
+        <w:rPr>
+          <w:rFonts w:hint="default" w:ascii="Times New Roman" w:hAnsi="Times New Roman" w:cs="Times New Roman"/>
+          <w:sz w:val="28"/>
+          <w:szCs w:val="28"/>
+        </w:rPr>
+      </w:pPr>
+      <w:r>
+        <w:rPr>
+          <w:rFonts w:hint="default" w:ascii="Times New Roman" w:hAnsi="Times New Roman" w:eastAsia="Courier New" w:cs="Times New Roman"/>
+          <w:sz w:val="28"/>
+          <w:szCs w:val="28"/>
+        </w:rPr>
+        <w:t xml:space="preserve">        return "MySQL не подключен или заказ не выбран."</w:t>
+      </w:r>
+    </w:p>
+    <w:p>
+      <w:pPr>
+        <w:spacing w:after="0" w:line="240" w:lineRule="auto"/>
+        <w:rPr>
+          <w:rFonts w:hint="default" w:ascii="Times New Roman" w:hAnsi="Times New Roman" w:cs="Times New Roman"/>
+          <w:sz w:val="28"/>
+          <w:szCs w:val="28"/>
+        </w:rPr>
+      </w:pPr>
+      <w:r>
+        <w:rPr>
+          <w:rFonts w:hint="default" w:ascii="Times New Roman" w:hAnsi="Times New Roman" w:eastAsia="Courier New" w:cs="Times New Roman"/>
+          <w:sz w:val="28"/>
+          <w:szCs w:val="28"/>
+        </w:rPr>
+        <w:t xml:space="preserve"> </w:t>
+      </w:r>
+    </w:p>
+    <w:p>
+      <w:pPr>
+        <w:spacing w:after="0" w:line="240" w:lineRule="auto"/>
+        <w:rPr>
+          <w:rFonts w:hint="default" w:ascii="Times New Roman" w:hAnsi="Times New Roman" w:cs="Times New Roman"/>
+          <w:sz w:val="28"/>
+          <w:szCs w:val="28"/>
+        </w:rPr>
+      </w:pPr>
+      <w:r>
+        <w:rPr>
+          <w:rFonts w:hint="default" w:ascii="Times New Roman" w:hAnsi="Times New Roman" w:eastAsia="Courier New" w:cs="Times New Roman"/>
+          <w:sz w:val="28"/>
+          <w:szCs w:val="28"/>
+        </w:rPr>
+        <w:t xml:space="preserve">    order = self.kitchen_queue[index]</w:t>
+      </w:r>
+    </w:p>
+    <w:p>
+      <w:pPr>
+        <w:spacing w:after="0" w:line="240" w:lineRule="auto"/>
+        <w:rPr>
+          <w:rFonts w:hint="default" w:ascii="Times New Roman" w:hAnsi="Times New Roman" w:cs="Times New Roman"/>
+          <w:sz w:val="28"/>
+          <w:szCs w:val="28"/>
+        </w:rPr>
+      </w:pPr>
+      <w:r>
+        <w:rPr>
+          <w:rFonts w:hint="default" w:ascii="Times New Roman" w:hAnsi="Times New Roman" w:eastAsia="Courier New" w:cs="Times New Roman"/>
+          <w:sz w:val="28"/>
+          <w:szCs w:val="28"/>
+        </w:rPr>
+        <w:t xml:space="preserve">    current_code = ORDER_STATUS_TO_CODE.get(order["status"], "ACCEPTED")</w:t>
+      </w:r>
+    </w:p>
+    <w:p>
+      <w:pPr>
+        <w:spacing w:after="0" w:line="240" w:lineRule="auto"/>
+        <w:rPr>
+          <w:rFonts w:hint="default" w:ascii="Times New Roman" w:hAnsi="Times New Roman" w:cs="Times New Roman"/>
+          <w:sz w:val="28"/>
+          <w:szCs w:val="28"/>
+        </w:rPr>
+      </w:pPr>
+      <w:r>
+        <w:rPr>
+          <w:rFonts w:hint="default" w:ascii="Times New Roman" w:hAnsi="Times New Roman" w:eastAsia="Courier New" w:cs="Times New Roman"/>
+          <w:sz w:val="28"/>
+          <w:szCs w:val="28"/>
+        </w:rPr>
+        <w:t xml:space="preserve">    if current_code == "READY":</w:t>
+      </w:r>
+    </w:p>
+    <w:p>
+      <w:pPr>
+        <w:spacing w:after="0" w:line="240" w:lineRule="auto"/>
+        <w:rPr>
+          <w:rFonts w:hint="default" w:ascii="Times New Roman" w:hAnsi="Times New Roman" w:cs="Times New Roman"/>
+          <w:sz w:val="28"/>
+          <w:szCs w:val="28"/>
+        </w:rPr>
+      </w:pPr>
+      <w:r>
+        <w:rPr>
+          <w:rFonts w:hint="default" w:ascii="Times New Roman" w:hAnsi="Times New Roman" w:eastAsia="Courier New" w:cs="Times New Roman"/>
+          <w:sz w:val="28"/>
+          <w:szCs w:val="28"/>
+        </w:rPr>
+        <w:t xml:space="preserve">        return "Заказ уже отмечен как готовый."</w:t>
+      </w:r>
+    </w:p>
+    <w:p>
+      <w:pPr>
+        <w:spacing w:after="0" w:line="240" w:lineRule="auto"/>
+        <w:rPr>
+          <w:rFonts w:hint="default" w:ascii="Times New Roman" w:hAnsi="Times New Roman" w:cs="Times New Roman"/>
+          <w:sz w:val="28"/>
+          <w:szCs w:val="28"/>
+        </w:rPr>
+      </w:pPr>
+      <w:r>
+        <w:rPr>
+          <w:rFonts w:hint="default" w:ascii="Times New Roman" w:hAnsi="Times New Roman" w:eastAsia="Courier New" w:cs="Times New Roman"/>
+          <w:sz w:val="28"/>
+          <w:szCs w:val="28"/>
+        </w:rPr>
+        <w:t xml:space="preserve">    if current_code in {"SERVED", "CLOSED"}:</w:t>
+      </w:r>
+    </w:p>
+    <w:p>
+      <w:pPr>
+        <w:spacing w:after="0" w:line="240" w:lineRule="auto"/>
+        <w:rPr>
+          <w:rFonts w:hint="default" w:ascii="Times New Roman" w:hAnsi="Times New Roman" w:cs="Times New Roman"/>
+          <w:sz w:val="28"/>
+          <w:szCs w:val="28"/>
+        </w:rPr>
+      </w:pPr>
+      <w:r>
+        <w:rPr>
+          <w:rFonts w:hint="default" w:ascii="Times New Roman" w:hAnsi="Times New Roman" w:eastAsia="Courier New" w:cs="Times New Roman"/>
+          <w:sz w:val="28"/>
+          <w:szCs w:val="28"/>
+        </w:rPr>
+        <w:t xml:space="preserve">        return "Заказ уже выдан или закрыт."</w:t>
+      </w:r>
+    </w:p>
+    <w:p>
+      <w:pPr>
+        <w:spacing w:after="0" w:line="240" w:lineRule="auto"/>
+        <w:rPr>
+          <w:rFonts w:hint="default" w:ascii="Times New Roman" w:hAnsi="Times New Roman" w:cs="Times New Roman"/>
+          <w:sz w:val="28"/>
+          <w:szCs w:val="28"/>
+        </w:rPr>
+      </w:pPr>
+      <w:r>
+        <w:rPr>
+          <w:rFonts w:hint="default" w:ascii="Times New Roman" w:hAnsi="Times New Roman" w:eastAsia="Courier New" w:cs="Times New Roman"/>
+          <w:sz w:val="28"/>
+          <w:szCs w:val="28"/>
+        </w:rPr>
+        <w:t xml:space="preserve"> </w:t>
+      </w:r>
+    </w:p>
+    <w:p>
+      <w:pPr>
+        <w:spacing w:after="0" w:line="240" w:lineRule="auto"/>
+        <w:rPr>
+          <w:rFonts w:hint="default" w:ascii="Times New Roman" w:hAnsi="Times New Roman" w:cs="Times New Roman"/>
+          <w:sz w:val="28"/>
+          <w:szCs w:val="28"/>
+        </w:rPr>
+      </w:pPr>
+      <w:r>
+        <w:rPr>
+          <w:rFonts w:hint="default" w:ascii="Times New Roman" w:hAnsi="Times New Roman" w:eastAsia="Courier New" w:cs="Times New Roman"/>
+          <w:sz w:val="28"/>
+          <w:szCs w:val="28"/>
+        </w:rPr>
+        <w:t xml:space="preserve">    next_code = "READY" if current_code == "PREPARING" else "PREPARING"</w:t>
+      </w:r>
+    </w:p>
+    <w:p>
+      <w:pPr>
+        <w:spacing w:after="0" w:line="240" w:lineRule="auto"/>
+        <w:rPr>
+          <w:rFonts w:hint="default" w:ascii="Times New Roman" w:hAnsi="Times New Roman" w:cs="Times New Roman"/>
+          <w:sz w:val="28"/>
+          <w:szCs w:val="28"/>
+        </w:rPr>
+      </w:pPr>
+      <w:r>
+        <w:rPr>
+          <w:rFonts w:hint="default" w:ascii="Times New Roman" w:hAnsi="Times New Roman" w:eastAsia="Courier New" w:cs="Times New Roman"/>
+          <w:sz w:val="28"/>
+          <w:szCs w:val="28"/>
+        </w:rPr>
+        <w:t xml:space="preserve">    return self._set_order_status(order, next_code)</w:t>
+      </w:r>
     </w:p>
     <w:sectPr>
-      <w:footerReference r:id="rId7" w:type="default"/>
       <w:pgSz w:w="11906" w:h="16838"/>
-      <w:pgMar w:top="1440" w:right="1800" w:bottom="1440" w:left="1800" w:header="720" w:footer="720" w:gutter="0"/>
       <w:cols w:space="720" w:num="1"/>
-      <w:docGrid w:linePitch="360" w:charSpace="0"/>
+      <w:docGrid w:type="lines" w:linePitch="312" w:charSpace="0"/>
     </w:sectPr>
   </w:body>
 </w:document>
@@ -7876,141 +11998,6 @@
 </w:ftr>
 </file>
 
-<file path=word/footer3.xml><?xml version="1.0" encoding="utf-8"?>
-<w:ftr xmlns:wpc="http://schemas.microsoft.com/office/word/2010/wordprocessingCanvas" xmlns:mc="http://schemas.openxmlformats.org/markup-compatibility/2006" xmlns:o="urn:schemas-microsoft-com:office:office" xmlns:r="http://schemas.openxmlformats.org/officeDocument/2006/relationships" xmlns:m="http://schemas.openxmlformats.org/officeDocument/2006/math" xmlns:v="urn:schemas-microsoft-com:vml" xmlns:wp14="http://schemas.microsoft.com/office/word/2010/wordprocessingDrawing" xmlns:wp="http://schemas.openxmlformats.org/drawingml/2006/wordprocessingDrawing" xmlns:w10="urn:schemas-microsoft-com:office:word" xmlns:w="http://schemas.openxmlformats.org/wordprocessingml/2006/main" xmlns:w14="http://schemas.microsoft.com/office/word/2010/wordml" xmlns:w15="http://schemas.microsoft.com/office/word/2012/wordml" xmlns:wpg="http://schemas.microsoft.com/office/word/2010/wordprocessingGroup" xmlns:wpi="http://schemas.microsoft.com/office/word/2010/wordprocessingInk" xmlns:wne="http://schemas.microsoft.com/office/word/2006/wordml" xmlns:wps="http://schemas.microsoft.com/office/word/2010/wordprocessingShape" xmlns:wpsCustomData="http://www.wps.cn/officeDocument/2013/wpsCustomData" mc:Ignorable="w14 w15 wp14">
-  <w:p>
-    <w:pPr>
-      <w:pStyle w:val="6"/>
-      <w:tabs>
-        <w:tab w:val="center" w:pos="4153"/>
-        <w:tab w:val="right" w:pos="8306"/>
-        <w:tab w:val="clear" w:pos="4677"/>
-        <w:tab w:val="clear" w:pos="9355"/>
-      </w:tabs>
-    </w:pPr>
-    <w:r>
-      <w:rPr>
-        <w:sz w:val="28"/>
-      </w:rPr>
-      <mc:AlternateContent>
-        <mc:Choice Requires="wps">
-          <w:drawing>
-            <wp:anchor distT="0" distB="0" distL="114300" distR="114300" simplePos="0" relativeHeight="251659264" behindDoc="0" locked="0" layoutInCell="1" allowOverlap="1">
-              <wp:simplePos x="0" y="0"/>
-              <wp:positionH relativeFrom="margin">
-                <wp:align>center</wp:align>
-              </wp:positionH>
-              <wp:positionV relativeFrom="paragraph">
-                <wp:posOffset>0</wp:posOffset>
-              </wp:positionV>
-              <wp:extent cx="1828800" cy="1828800"/>
-              <wp:effectExtent l="0" t="0" r="0" b="0"/>
-              <wp:wrapNone/>
-              <wp:docPr id="1" name="Текстовое поле 1"/>
-              <wp:cNvGraphicFramePr/>
-              <a:graphic xmlns:a="http://schemas.openxmlformats.org/drawingml/2006/main">
-                <a:graphicData uri="http://schemas.microsoft.com/office/word/2010/wordprocessingShape">
-                  <wps:wsp>
-                    <wps:cNvSpPr txBox="1"/>
-                    <wps:spPr>
-                      <a:xfrm>
-                        <a:off x="0" y="0"/>
-                        <a:ext cx="1828800" cy="1828800"/>
-                      </a:xfrm>
-                      <a:prstGeom prst="rect">
-                        <a:avLst/>
-                      </a:prstGeom>
-                      <a:noFill/>
-                      <a:ln w="6350">
-                        <a:noFill/>
-                      </a:ln>
-                      <a:effectLst/>
-                    </wps:spPr>
-                    <wps:txbx>
-                      <w:txbxContent>
-                        <w:p>
-                          <w:pPr>
-                            <w:pStyle w:val="6"/>
-                            <w:tabs>
-                              <w:tab w:val="center" w:pos="4153"/>
-                              <w:tab w:val="right" w:pos="8306"/>
-                              <w:tab w:val="clear" w:pos="4677"/>
-                              <w:tab w:val="clear" w:pos="9355"/>
-                            </w:tabs>
-                          </w:pPr>
-                          <w:r>
-                            <w:fldChar w:fldCharType="begin"/>
-                          </w:r>
-                          <w:r>
-                            <w:instrText xml:space="preserve"> PAGE  \* MERGEFORMAT </w:instrText>
-                          </w:r>
-                          <w:r>
-                            <w:fldChar w:fldCharType="separate"/>
-                          </w:r>
-                          <w:r>
-                            <w:t>1</w:t>
-                          </w:r>
-                          <w:r>
-                            <w:fldChar w:fldCharType="end"/>
-                          </w:r>
-                        </w:p>
-                      </w:txbxContent>
-                    </wps:txbx>
-                    <wps:bodyPr rot="0" spcFirstLastPara="0" vertOverflow="overflow" horzOverflow="overflow" vert="horz" wrap="none" lIns="0" tIns="0" rIns="0" bIns="0" numCol="1" spcCol="0" rtlCol="0" fromWordArt="0" anchor="t" anchorCtr="0" forceAA="0" upright="0" compatLnSpc="1">
-                      <a:spAutoFit/>
-                    </wps:bodyPr>
-                  </wps:wsp>
-                </a:graphicData>
-              </a:graphic>
-            </wp:anchor>
-          </w:drawing>
-        </mc:Choice>
-        <mc:Fallback>
-          <w:pict>
-            <v:shape id="_x0000_s1026" o:spid="_x0000_s1026" o:spt="202" type="#_x0000_t202" style="position:absolute;left:0pt;margin-top:0pt;height:144pt;width:144pt;mso-position-horizontal:center;mso-position-horizontal-relative:margin;mso-wrap-style:none;z-index:251659264;mso-width-relative:page;mso-height-relative:page;" filled="f" stroked="f" coordsize="21600,21600" o:gfxdata="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">
-              <v:fill on="f" focussize="0,0"/>
-              <v:stroke on="f" weight="0.5pt"/>
-              <v:imagedata o:title=""/>
-              <o:lock v:ext="edit" aspectratio="f"/>
-              <v:textbox inset="0mm,0mm,0mm,0mm" style="mso-fit-shape-to-text:t;">
-                <w:txbxContent>
-                  <w:p>
-                    <w:pPr>
-                      <w:pStyle w:val="6"/>
-                      <w:tabs>
-                        <w:tab w:val="center" w:pos="4153"/>
-                        <w:tab w:val="right" w:pos="8306"/>
-                        <w:tab w:val="clear" w:pos="4677"/>
-                        <w:tab w:val="clear" w:pos="9355"/>
-                      </w:tabs>
-                    </w:pPr>
-                    <w:r>
-                      <w:fldChar w:fldCharType="begin"/>
-                    </w:r>
-                    <w:r>
-                      <w:instrText xml:space="preserve"> PAGE  \* MERGEFORMAT </w:instrText>
-                    </w:r>
-                    <w:r>
-                      <w:fldChar w:fldCharType="separate"/>
-                    </w:r>
-                    <w:r>
-                      <w:t>1</w:t>
-                    </w:r>
-                    <w:r>
-                      <w:fldChar w:fldCharType="end"/>
-                    </w:r>
-                  </w:p>
-                </w:txbxContent>
-              </v:textbox>
-            </v:shape>
-          </w:pict>
-        </mc:Fallback>
-      </mc:AlternateContent>
-    </w:r>
-  </w:p>
-</w:ftr>
-</file>
-
 <file path=word/footnotes.xml><?xml version="1.0" encoding="utf-8"?>
 <w:footnotes xmlns:wpc="http://schemas.microsoft.com/office/word/2010/wordprocessingCanvas" xmlns:mc="http://schemas.openxmlformats.org/markup-compatibility/2006" xmlns:o="urn:schemas-microsoft-com:office:office" xmlns:r="http://schemas.openxmlformats.org/officeDocument/2006/relationships" xmlns:m="http://schemas.openxmlformats.org/officeDocument/2006/math" xmlns:v="urn:schemas-microsoft-com:vml" xmlns:wp14="http://schemas.microsoft.com/office/word/2010/wordprocessingDrawing" xmlns:wp="http://schemas.openxmlformats.org/drawingml/2006/wordprocessingDrawing" xmlns:w="http://schemas.openxmlformats.org/wordprocessingml/2006/main" xmlns:w14="http://schemas.microsoft.com/office/word/2010/wordml" xmlns:w15="http://schemas.microsoft.com/office/word/2012/wordml" xmlns:w10="urn:schemas-microsoft-com:office:word" xmlns:wpg="http://schemas.microsoft.com/office/word/2010/wordprocessingGroup" xmlns:wpi="http://schemas.microsoft.com/office/word/2010/wordprocessingInk" xmlns:wne="http://schemas.microsoft.com/office/word/2006/wordml" xmlns:wps="http://schemas.microsoft.com/office/word/2010/wordprocessingShape" xmlns:wpsCustomData="http://www.wps.cn/officeDocument/2013/wpsCustomData" mc:Ignorable="w14 w15 wp14">
   <w:footnote w:type="separator" w:id="0">
@@ -8203,7 +12190,7 @@
     <w:lsdException w:unhideWhenUsed="0" w:uiPriority="0" w:semiHidden="0" w:name="footnote text"/>
     <w:lsdException w:unhideWhenUsed="0" w:uiPriority="0" w:semiHidden="0" w:name="annotation text"/>
     <w:lsdException w:unhideWhenUsed="0" w:uiPriority="0" w:semiHidden="0" w:name="header"/>
-    <w:lsdException w:uiPriority="99" w:semiHidden="0" w:name="footer"/>
+    <w:lsdException w:qFormat="1" w:uiPriority="99" w:semiHidden="0" w:name="footer"/>
     <w:lsdException w:unhideWhenUsed="0" w:uiPriority="0" w:semiHidden="0" w:name="index heading"/>
     <w:lsdException w:qFormat="1" w:uiPriority="0" w:name="caption"/>
     <w:lsdException w:unhideWhenUsed="0" w:uiPriority="0" w:semiHidden="0" w:name="table of figures"/>
@@ -8408,6 +12395,7 @@
     <w:name w:val="footer"/>
     <w:basedOn w:val="1"/>
     <w:unhideWhenUsed/>
+    <w:qFormat/>
     <w:uiPriority w:val="99"/>
     <w:pPr>
       <w:tabs>
@@ -8673,23 +12661,4 @@
   </a:themeElements>
   <a:objectDefaults/>
 </a:theme>
-</file>
-
-<file path=customXml/item1.xml><?xml version="1.0" encoding="utf-8"?>
-<s:customData xmlns="http://www.wps.cn/officeDocument/2013/wpsCustomData" xmlns:s="http://www.wps.cn/officeDocument/2013/wpsCustomData">
-  <customSectProps>
-    <customSectPr/>
-  </customSectProps>
-  <customShpExts>
-    <customShpInfo spid="_x0000_s1026" textRotate="1"/>
-  </customShpExts>
-</s:customData>
-</file>
-
-<file path=customXml/itemProps1.xml><?xml version="1.0" encoding="utf-8"?>
-<ds:datastoreItem xmlns:ds="http://schemas.openxmlformats.org/officeDocument/2006/customXml" ds:itemID="{B1977F7D-205B-4081-913C-38D41E755F92}">
-  <ds:schemaRefs>
-    <ds:schemaRef ds:uri="http://www.wps.cn/officeDocument/2013/wpsCustomData"/>
-  </ds:schemaRefs>
-</ds:datastoreItem>
 </file>
</xml_diff>